<commit_message>
docs: requisitos adicionales documentados, avance 80,5 %
Co-Authored-By: Claude Sonnet 5.5 <noreply@anthropic.com>
</commit_message>
<xml_diff>
--- a/docs/Proyecto FitLoyalty - requisitos actualizados.docx
+++ b/docs/Proyecto FitLoyalty - requisitos actualizados.docx
@@ -5337,6 +5337,470 @@
           </w:p>
         </w:tc>
       </w:tr>
+      <w:tr>
+        <w:tc>
+          <w:tcPr>
+            <w:tcW w:type="dxa" w:w="1080"/>
+          </w:tcPr>
+          <w:p>
+            <w:r>
+              <w:t>RQF-19</w:t>
+            </w:r>
+          </w:p>
+        </w:tc>
+        <w:tc>
+          <w:tcPr>
+            <w:tcW w:type="dxa" w:w="2310"/>
+          </w:tcPr>
+          <w:p>
+            <w:r>
+              <w:t>Gestión de Usuarios</w:t>
+            </w:r>
+          </w:p>
+        </w:tc>
+        <w:tc>
+          <w:tcPr>
+            <w:tcW w:type="dxa" w:w="7230"/>
+          </w:tcPr>
+          <w:p>
+            <w:r>
+              <w:t>El sistema debe permitir registrar un gimnasio junto con la cuenta de su propietario.</w:t>
+            </w:r>
+          </w:p>
+        </w:tc>
+        <w:tc>
+          <w:tcPr>
+            <w:tcW w:type="dxa" w:w="1701"/>
+          </w:tcPr>
+          <w:p>
+            <w:r>
+              <w:rPr>
+                <w:sz w:val="16"/>
+              </w:rPr>
+              <w:t>Implementado</w:t>
+            </w:r>
+          </w:p>
+        </w:tc>
+        <w:tc>
+          <w:tcPr>
+            <w:tcW w:type="dxa" w:w="4535"/>
+          </w:tcPr>
+          <w:p>
+            <w:r>
+              <w:rPr>
+                <w:sz w:val="16"/>
+              </w:rPr>
+              <w:t>routes/auth.js POST /signup y RegisterOwnerPage.jsx: registro del gimnasio y de la cuenta del propietario.</w:t>
+            </w:r>
+          </w:p>
+        </w:tc>
+      </w:tr>
+      <w:tr>
+        <w:tc>
+          <w:tcPr>
+            <w:tcW w:type="dxa" w:w="1080"/>
+          </w:tcPr>
+          <w:p>
+            <w:r>
+              <w:t>RQF-20</w:t>
+            </w:r>
+          </w:p>
+        </w:tc>
+        <w:tc>
+          <w:tcPr>
+            <w:tcW w:type="dxa" w:w="2310"/>
+          </w:tcPr>
+          <w:p>
+            <w:r>
+              <w:t>Configuración</w:t>
+            </w:r>
+          </w:p>
+        </w:tc>
+        <w:tc>
+          <w:tcPr>
+            <w:tcW w:type="dxa" w:w="7230"/>
+          </w:tcPr>
+          <w:p>
+            <w:r>
+              <w:t>El sistema debe permitir configurar por gimnasio los planes, precios y recordatorios de cobro.</w:t>
+            </w:r>
+          </w:p>
+        </w:tc>
+        <w:tc>
+          <w:tcPr>
+            <w:tcW w:type="dxa" w:w="1701"/>
+          </w:tcPr>
+          <w:p>
+            <w:r>
+              <w:rPr>
+                <w:sz w:val="16"/>
+              </w:rPr>
+              <w:t>Implementado</w:t>
+            </w:r>
+          </w:p>
+        </w:tc>
+        <w:tc>
+          <w:tcPr>
+            <w:tcW w:type="dxa" w:w="4535"/>
+          </w:tcPr>
+          <w:p>
+            <w:r>
+              <w:rPr>
+                <w:sz w:val="16"/>
+              </w:rPr>
+              <w:t>routes/config.js (GET/PUT /admin/config), ConfigPage.jsx y tabla config_gimnasio: planes, precios y recordatorios.</w:t>
+            </w:r>
+          </w:p>
+        </w:tc>
+      </w:tr>
+      <w:tr>
+        <w:tc>
+          <w:tcPr>
+            <w:tcW w:type="dxa" w:w="1080"/>
+          </w:tcPr>
+          <w:p>
+            <w:r>
+              <w:t>RQF-21</w:t>
+            </w:r>
+          </w:p>
+        </w:tc>
+        <w:tc>
+          <w:tcPr>
+            <w:tcW w:type="dxa" w:w="2310"/>
+          </w:tcPr>
+          <w:p>
+            <w:r>
+              <w:t>Gestión de Miembros</w:t>
+            </w:r>
+          </w:p>
+        </w:tc>
+        <w:tc>
+          <w:tcPr>
+            <w:tcW w:type="dxa" w:w="7230"/>
+          </w:tcPr>
+          <w:p>
+            <w:r>
+              <w:t>El sistema debe registrar por miembro el plan contratado, su vigencia, el valor total y pagado, el método y el estado del pago.</w:t>
+            </w:r>
+          </w:p>
+        </w:tc>
+        <w:tc>
+          <w:tcPr>
+            <w:tcW w:type="dxa" w:w="1701"/>
+          </w:tcPr>
+          <w:p>
+            <w:r>
+              <w:rPr>
+                <w:sz w:val="16"/>
+              </w:rPr>
+              <w:t>Implementado</w:t>
+            </w:r>
+          </w:p>
+        </w:tc>
+        <w:tc>
+          <w:tcPr>
+            <w:tcW w:type="dxa" w:w="4535"/>
+          </w:tcPr>
+          <w:p>
+            <w:r>
+              <w:rPr>
+                <w:sz w:val="16"/>
+              </w:rPr>
+              <w:t>Tabla plan_cobro (migración 004): tipo de plan, vigencia, valor total y pagado, método y estado de pago por miembro.</w:t>
+            </w:r>
+          </w:p>
+        </w:tc>
+      </w:tr>
+      <w:tr>
+        <w:tc>
+          <w:tcPr>
+            <w:tcW w:type="dxa" w:w="1080"/>
+          </w:tcPr>
+          <w:p>
+            <w:r>
+              <w:t>RQF-22</w:t>
+            </w:r>
+          </w:p>
+        </w:tc>
+        <w:tc>
+          <w:tcPr>
+            <w:tcW w:type="dxa" w:w="2310"/>
+          </w:tcPr>
+          <w:p>
+            <w:r>
+              <w:t>Cumplimiento</w:t>
+            </w:r>
+          </w:p>
+        </w:tc>
+        <w:tc>
+          <w:tcPr>
+            <w:tcW w:type="dxa" w:w="7230"/>
+          </w:tcPr>
+          <w:p>
+            <w:r>
+              <w:t>El sistema debe permitir al propietario eliminar su cuenta y los datos asociados del gimnasio.</w:t>
+            </w:r>
+          </w:p>
+        </w:tc>
+        <w:tc>
+          <w:tcPr>
+            <w:tcW w:type="dxa" w:w="1701"/>
+          </w:tcPr>
+          <w:p>
+            <w:r>
+              <w:rPr>
+                <w:sz w:val="16"/>
+              </w:rPr>
+              <w:t>Implementado</w:t>
+            </w:r>
+          </w:p>
+        </w:tc>
+        <w:tc>
+          <w:tcPr>
+            <w:tcW w:type="dxa" w:w="4535"/>
+          </w:tcPr>
+          <w:p>
+            <w:r>
+              <w:rPr>
+                <w:sz w:val="16"/>
+              </w:rPr>
+              <w:t>routes/auth.js DELETE /auth/account y EliminarCuentaPage.jsx: elimina cuenta y datos del gimnasio.</w:t>
+            </w:r>
+          </w:p>
+        </w:tc>
+      </w:tr>
+      <w:tr>
+        <w:tc>
+          <w:tcPr>
+            <w:tcW w:type="dxa" w:w="1080"/>
+          </w:tcPr>
+          <w:p>
+            <w:r>
+              <w:t>RQF-23</w:t>
+            </w:r>
+          </w:p>
+        </w:tc>
+        <w:tc>
+          <w:tcPr>
+            <w:tcW w:type="dxa" w:w="2310"/>
+          </w:tcPr>
+          <w:p>
+            <w:r>
+              <w:t>Dashboard</w:t>
+            </w:r>
+          </w:p>
+        </w:tc>
+        <w:tc>
+          <w:tcPr>
+            <w:tcW w:type="dxa" w:w="7230"/>
+          </w:tcPr>
+          <w:p>
+            <w:r>
+              <w:t>El sistema debe mostrar al administrador avisos accionables (vencimientos, riesgo de abandono) en un centro de notificaciones.</w:t>
+            </w:r>
+          </w:p>
+        </w:tc>
+        <w:tc>
+          <w:tcPr>
+            <w:tcW w:type="dxa" w:w="1701"/>
+          </w:tcPr>
+          <w:p>
+            <w:r>
+              <w:rPr>
+                <w:sz w:val="16"/>
+              </w:rPr>
+              <w:t>Implementado</w:t>
+            </w:r>
+          </w:p>
+        </w:tc>
+        <w:tc>
+          <w:tcPr>
+            <w:tcW w:type="dxa" w:w="4535"/>
+          </w:tcPr>
+          <w:p>
+            <w:r>
+              <w:rPr>
+                <w:sz w:val="16"/>
+              </w:rPr>
+              <w:t>routes/notificaciones.js GET /admin/notificaciones: avisos accionables en la campana del encabezado.</w:t>
+            </w:r>
+          </w:p>
+        </w:tc>
+      </w:tr>
+      <w:tr>
+        <w:tc>
+          <w:tcPr>
+            <w:tcW w:type="dxa" w:w="1080"/>
+          </w:tcPr>
+          <w:p>
+            <w:r>
+              <w:t>RQF-24</w:t>
+            </w:r>
+          </w:p>
+        </w:tc>
+        <w:tc>
+          <w:tcPr>
+            <w:tcW w:type="dxa" w:w="2310"/>
+          </w:tcPr>
+          <w:p>
+            <w:r>
+              <w:t>Check-in y Asistencia</w:t>
+            </w:r>
+          </w:p>
+        </w:tc>
+        <w:tc>
+          <w:tcPr>
+            <w:tcW w:type="dxa" w:w="7230"/>
+          </w:tcPr>
+          <w:p>
+            <w:r>
+              <w:t>El sistema debe listar los check-ins del gimnasio con un resumen de asistencia.</w:t>
+            </w:r>
+          </w:p>
+        </w:tc>
+        <w:tc>
+          <w:tcPr>
+            <w:tcW w:type="dxa" w:w="1701"/>
+          </w:tcPr>
+          <w:p>
+            <w:r>
+              <w:rPr>
+                <w:sz w:val="16"/>
+              </w:rPr>
+              <w:t>Implementado</w:t>
+            </w:r>
+          </w:p>
+        </w:tc>
+        <w:tc>
+          <w:tcPr>
+            <w:tcW w:type="dxa" w:w="4535"/>
+          </w:tcPr>
+          <w:p>
+            <w:r>
+              <w:rPr>
+                <w:sz w:val="16"/>
+              </w:rPr>
+              <w:t>routes/asistencia.js GET /api/asistencia: listado de check-ins con resumen.</w:t>
+            </w:r>
+          </w:p>
+        </w:tc>
+      </w:tr>
+      <w:tr>
+        <w:tc>
+          <w:tcPr>
+            <w:tcW w:type="dxa" w:w="1080"/>
+          </w:tcPr>
+          <w:p>
+            <w:r>
+              <w:t>RQF-25</w:t>
+            </w:r>
+          </w:p>
+        </w:tc>
+        <w:tc>
+          <w:tcPr>
+            <w:tcW w:type="dxa" w:w="2310"/>
+          </w:tcPr>
+          <w:p>
+            <w:r>
+              <w:t>Gestión de Miembros</w:t>
+            </w:r>
+          </w:p>
+        </w:tc>
+        <w:tc>
+          <w:tcPr>
+            <w:tcW w:type="dxa" w:w="7230"/>
+          </w:tcPr>
+          <w:p>
+            <w:r>
+              <w:t>El sistema debe ofrecer una vista de los miembros activos del gimnasio.</w:t>
+            </w:r>
+          </w:p>
+        </w:tc>
+        <w:tc>
+          <w:tcPr>
+            <w:tcW w:type="dxa" w:w="1701"/>
+          </w:tcPr>
+          <w:p>
+            <w:r>
+              <w:rPr>
+                <w:sz w:val="16"/>
+              </w:rPr>
+              <w:t>Implementado</w:t>
+            </w:r>
+          </w:p>
+        </w:tc>
+        <w:tc>
+          <w:tcPr>
+            <w:tcW w:type="dxa" w:w="4535"/>
+          </w:tcPr>
+          <w:p>
+            <w:r>
+              <w:rPr>
+                <w:sz w:val="16"/>
+              </w:rPr>
+              <w:t>routes/vista.js GET /api/vista/miembros-activos: vista de miembros activos.</w:t>
+            </w:r>
+          </w:p>
+        </w:tc>
+      </w:tr>
+      <w:tr>
+        <w:tc>
+          <w:tcPr>
+            <w:tcW w:type="dxa" w:w="1080"/>
+          </w:tcPr>
+          <w:p>
+            <w:r>
+              <w:t>RQF-26</w:t>
+            </w:r>
+          </w:p>
+        </w:tc>
+        <w:tc>
+          <w:tcPr>
+            <w:tcW w:type="dxa" w:w="2310"/>
+          </w:tcPr>
+          <w:p>
+            <w:r>
+              <w:t>App del miembro</w:t>
+            </w:r>
+          </w:p>
+        </w:tc>
+        <w:tc>
+          <w:tcPr>
+            <w:tcW w:type="dxa" w:w="7230"/>
+          </w:tcPr>
+          <w:p>
+            <w:r>
+              <w:t>El sistema debe permitir al miembro editar sus datos de perfil desde la app móvil.</w:t>
+            </w:r>
+          </w:p>
+        </w:tc>
+        <w:tc>
+          <w:tcPr>
+            <w:tcW w:type="dxa" w:w="1701"/>
+          </w:tcPr>
+          <w:p>
+            <w:r>
+              <w:rPr>
+                <w:sz w:val="16"/>
+              </w:rPr>
+              <w:t>Implementado</w:t>
+            </w:r>
+          </w:p>
+        </w:tc>
+        <w:tc>
+          <w:tcPr>
+            <w:tcW w:type="dxa" w:w="4535"/>
+          </w:tcPr>
+          <w:p>
+            <w:r>
+              <w:rPr>
+                <w:sz w:val="16"/>
+              </w:rPr>
+              <w:t>routes/cliente.js PUT /api/cliente/me: el miembro edita su perfil desde la app.</w:t>
+            </w:r>
+          </w:p>
+        </w:tc>
+      </w:tr>
     </w:tbl>
     <w:p>
       <w:pPr>
@@ -6919,6 +7383,238 @@
                 <w:sz w:val="16"/>
               </w:rPr>
               <w:t>.github/workflows/ci.yml: CI con build y chequeo de sintaxis en cada PR.</w:t>
+            </w:r>
+          </w:p>
+        </w:tc>
+      </w:tr>
+      <w:tr>
+        <w:tc>
+          <w:tcPr>
+            <w:tcW w:type="dxa" w:w="1274"/>
+          </w:tcPr>
+          <w:p>
+            <w:r>
+              <w:t>RQNF-12</w:t>
+            </w:r>
+          </w:p>
+        </w:tc>
+        <w:tc>
+          <w:tcPr>
+            <w:tcW w:type="dxa" w:w="2144"/>
+          </w:tcPr>
+          <w:p>
+            <w:r>
+              <w:t>Cumplimiento</w:t>
+            </w:r>
+          </w:p>
+        </w:tc>
+        <w:tc>
+          <w:tcPr>
+            <w:tcW w:type="dxa" w:w="7212"/>
+          </w:tcPr>
+          <w:p>
+            <w:r>
+              <w:t>El sistema debe publicar los términos de uso, la política de privacidad y la política de tratamiento de datos personales.</w:t>
+            </w:r>
+          </w:p>
+        </w:tc>
+        <w:tc>
+          <w:tcPr>
+            <w:tcW w:type="dxa" w:w="1701"/>
+          </w:tcPr>
+          <w:p>
+            <w:r>
+              <w:rPr>
+                <w:sz w:val="16"/>
+              </w:rPr>
+              <w:t>Implementado</w:t>
+            </w:r>
+          </w:p>
+        </w:tc>
+        <w:tc>
+          <w:tcPr>
+            <w:tcW w:type="dxa" w:w="4535"/>
+          </w:tcPr>
+          <w:p>
+            <w:r>
+              <w:rPr>
+                <w:sz w:val="16"/>
+              </w:rPr>
+              <w:t>Rutas /legal/terminos, /legal/privacidad y /legal/datos (TerminosPage, PrivacidadPage, PoliticaDatosPage).</w:t>
+            </w:r>
+          </w:p>
+        </w:tc>
+      </w:tr>
+      <w:tr>
+        <w:tc>
+          <w:tcPr>
+            <w:tcW w:type="dxa" w:w="1274"/>
+          </w:tcPr>
+          <w:p>
+            <w:r>
+              <w:t>RQNF-13</w:t>
+            </w:r>
+          </w:p>
+        </w:tc>
+        <w:tc>
+          <w:tcPr>
+            <w:tcW w:type="dxa" w:w="2144"/>
+          </w:tcPr>
+          <w:p>
+            <w:r>
+              <w:t>Observabilidad</w:t>
+            </w:r>
+          </w:p>
+        </w:tc>
+        <w:tc>
+          <w:tcPr>
+            <w:tcW w:type="dxa" w:w="7212"/>
+          </w:tcPr>
+          <w:p>
+            <w:r>
+              <w:t>El sistema debe exponer un endpoint de verificación de salud para el monitoreo del servicio.</w:t>
+            </w:r>
+          </w:p>
+        </w:tc>
+        <w:tc>
+          <w:tcPr>
+            <w:tcW w:type="dxa" w:w="1701"/>
+          </w:tcPr>
+          <w:p>
+            <w:r>
+              <w:rPr>
+                <w:sz w:val="16"/>
+              </w:rPr>
+              <w:t>Implementado</w:t>
+            </w:r>
+          </w:p>
+        </w:tc>
+        <w:tc>
+          <w:tcPr>
+            <w:tcW w:type="dxa" w:w="4535"/>
+          </w:tcPr>
+          <w:p>
+            <w:r>
+              <w:rPr>
+                <w:sz w:val="16"/>
+              </w:rPr>
+              <w:t>index.js: endpoints /api/healthz y /api/health.</w:t>
+            </w:r>
+          </w:p>
+        </w:tc>
+      </w:tr>
+      <w:tr>
+        <w:tc>
+          <w:tcPr>
+            <w:tcW w:type="dxa" w:w="1274"/>
+          </w:tcPr>
+          <w:p>
+            <w:r>
+              <w:t>RQNF-14</w:t>
+            </w:r>
+          </w:p>
+        </w:tc>
+        <w:tc>
+          <w:tcPr>
+            <w:tcW w:type="dxa" w:w="2144"/>
+          </w:tcPr>
+          <w:p>
+            <w:r>
+              <w:t>Mantenibilidad</w:t>
+            </w:r>
+          </w:p>
+        </w:tc>
+        <w:tc>
+          <w:tcPr>
+            <w:tcW w:type="dxa" w:w="7212"/>
+          </w:tcPr>
+          <w:p>
+            <w:r>
+              <w:t>El sistema debe manejar los errores de forma centralizada, devolviendo respuestas consistentes.</w:t>
+            </w:r>
+          </w:p>
+        </w:tc>
+        <w:tc>
+          <w:tcPr>
+            <w:tcW w:type="dxa" w:w="1701"/>
+          </w:tcPr>
+          <w:p>
+            <w:r>
+              <w:rPr>
+                <w:sz w:val="16"/>
+              </w:rPr>
+              <w:t>Implementado</w:t>
+            </w:r>
+          </w:p>
+        </w:tc>
+        <w:tc>
+          <w:tcPr>
+            <w:tcW w:type="dxa" w:w="4535"/>
+          </w:tcPr>
+          <w:p>
+            <w:r>
+              <w:rPr>
+                <w:sz w:val="16"/>
+              </w:rPr>
+              <w:t>lib/errors.js, lib/asyncHandler.js y errorHandler central: respuestas de error consistentes.</w:t>
+            </w:r>
+          </w:p>
+        </w:tc>
+      </w:tr>
+      <w:tr>
+        <w:tc>
+          <w:tcPr>
+            <w:tcW w:type="dxa" w:w="1274"/>
+          </w:tcPr>
+          <w:p>
+            <w:r>
+              <w:t>RQNF-15</w:t>
+            </w:r>
+          </w:p>
+        </w:tc>
+        <w:tc>
+          <w:tcPr>
+            <w:tcW w:type="dxa" w:w="2144"/>
+          </w:tcPr>
+          <w:p>
+            <w:r>
+              <w:t>Seguridad</w:t>
+            </w:r>
+          </w:p>
+        </w:tc>
+        <w:tc>
+          <w:tcPr>
+            <w:tcW w:type="dxa" w:w="7212"/>
+          </w:tcPr>
+          <w:p>
+            <w:r>
+              <w:t>El sistema debe restringir las solicitudes entre orígenes (CORS) a los dominios configurados.</w:t>
+            </w:r>
+          </w:p>
+        </w:tc>
+        <w:tc>
+          <w:tcPr>
+            <w:tcW w:type="dxa" w:w="1701"/>
+          </w:tcPr>
+          <w:p>
+            <w:r>
+              <w:rPr>
+                <w:sz w:val="16"/>
+              </w:rPr>
+              <w:t>Implementado</w:t>
+            </w:r>
+          </w:p>
+        </w:tc>
+        <w:tc>
+          <w:tcPr>
+            <w:tcW w:type="dxa" w:w="4535"/>
+          </w:tcPr>
+          <w:p>
+            <w:r>
+              <w:rPr>
+                <w:sz w:val="16"/>
+              </w:rPr>
+              <w:t>index.js: CORS restringido por origen configurado.</w:t>
             </w:r>
           </w:p>
         </w:tc>

</xml_diff>

<commit_message>
docs: mejora el Excel y el Word de requisitos; retira el borrador interno
Co-Authored-By: Claude Sonnet 5.5 <noreply@anthropic.com>
</commit_message>
<xml_diff>
--- a/docs/Proyecto FitLoyalty - requisitos actualizados.docx
+++ b/docs/Proyecto FitLoyalty - requisitos actualizados.docx
@@ -3043,7 +3043,6 @@
     <w:tbl>
       <w:tblPr>
         <w:tblStyle w:val="Table1"/>
-        <w:tblW w:w="10620.0" w:type="dxa"/>
         <w:jc w:val="left"/>
         <w:tblBorders>
           <w:top w:color="000000" w:space="0" w:sz="0" w:val="nil"/>
@@ -3055,13 +3054,14 @@
         </w:tblBorders>
         <w:tblLayout w:type="fixed"/>
         <w:tblLook w:val="0600"/>
+        <w:tblW w:w="10659" w:type="dxa"/>
       </w:tblPr>
       <w:tblGrid>
-        <w:gridCol w:w="1080"/>
-        <w:gridCol w:w="2310"/>
-        <w:gridCol w:w="7230"/>
-        <w:gridCol w:w="1701"/>
-        <w:gridCol w:w="4535"/>
+        <w:gridCol w:w="963"/>
+        <w:gridCol w:w="1474"/>
+        <w:gridCol w:w="3628"/>
+        <w:gridCol w:w="1247"/>
+        <w:gridCol w:w="3345"/>
         <w:tblGridChange w:id="0">
           <w:tblGrid>
             <w:gridCol w:w="1080"/>
@@ -3078,6 +3078,7 @@
         </w:trPr>
         <w:tc>
           <w:tcPr>
+            <w:tcW w:type="dxa" w:w="964"/>
             <w:tcBorders>
               <w:top w:color="aaaaaa" w:space="0" w:sz="5" w:val="single"/>
               <w:left w:color="aaaaaa" w:space="0" w:sz="5" w:val="single"/>
@@ -3122,6 +3123,7 @@
         </w:tc>
         <w:tc>
           <w:tcPr>
+            <w:tcW w:type="dxa" w:w="1474"/>
             <w:tcBorders>
               <w:top w:color="aaaaaa" w:space="0" w:sz="5" w:val="single"/>
               <w:left w:color="000000" w:space="0" w:sz="0" w:val="nil"/>
@@ -3166,6 +3168,7 @@
         </w:tc>
         <w:tc>
           <w:tcPr>
+            <w:tcW w:type="dxa" w:w="3628"/>
             <w:tcBorders>
               <w:top w:color="aaaaaa" w:space="0" w:sz="5" w:val="single"/>
               <w:left w:color="000000" w:space="0" w:sz="0" w:val="nil"/>
@@ -3210,12 +3213,19 @@
         </w:tc>
         <w:tc>
           <w:tcPr>
-            <w:tcW w:type="dxa" w:w="1701"/>
-          </w:tcPr>
-          <w:p>
-            <w:r>
-              <w:rPr>
-                <w:sz w:val="16"/>
+            <w:tcW w:type="dxa" w:w="1247"/>
+            <w:shd w:val="clear" w:color="auto" w:fill="39a900"/>
+          </w:tcPr>
+          <w:p>
+            <w:pPr>
+              <w:jc w:val="center"/>
+            </w:pPr>
+            <w:r/>
+            <w:r>
+              <w:rPr>
+                <w:b/>
+                <w:color w:val="FFFFFF"/>
+                <w:sz w:val="18"/>
               </w:rPr>
               <w:t>Estado</w:t>
             </w:r>
@@ -3223,12 +3233,19 @@
         </w:tc>
         <w:tc>
           <w:tcPr>
-            <w:tcW w:type="dxa" w:w="4535"/>
-          </w:tcPr>
-          <w:p>
-            <w:r>
-              <w:rPr>
-                <w:sz w:val="16"/>
+            <w:tcW w:type="dxa" w:w="3345"/>
+            <w:shd w:val="clear" w:color="auto" w:fill="39a900"/>
+          </w:tcPr>
+          <w:p>
+            <w:pPr>
+              <w:jc w:val="center"/>
+            </w:pPr>
+            <w:r/>
+            <w:r>
+              <w:rPr>
+                <w:b/>
+                <w:color w:val="FFFFFF"/>
+                <w:sz w:val="18"/>
               </w:rPr>
               <w:t>Evidencia</w:t>
             </w:r>
@@ -3243,6 +3260,7 @@
         </w:trPr>
         <w:tc>
           <w:tcPr>
+            <w:tcW w:type="dxa" w:w="964"/>
             <w:tcBorders>
               <w:top w:color="000000" w:space="0" w:sz="0" w:val="nil"/>
               <w:left w:color="aaaaaa" w:space="0" w:sz="5" w:val="single"/>
@@ -3280,6 +3298,7 @@
         </w:tc>
         <w:tc>
           <w:tcPr>
+            <w:tcW w:type="dxa" w:w="1474"/>
             <w:tcBorders>
               <w:top w:color="000000" w:space="0" w:sz="0" w:val="nil"/>
               <w:left w:color="000000" w:space="0" w:sz="0" w:val="nil"/>
@@ -3317,6 +3336,7 @@
         </w:tc>
         <w:tc>
           <w:tcPr>
+            <w:tcW w:type="dxa" w:w="3628"/>
             <w:tcBorders>
               <w:top w:color="000000" w:space="0" w:sz="0" w:val="nil"/>
               <w:left w:color="000000" w:space="0" w:sz="0" w:val="nil"/>
@@ -3354,11 +3374,17 @@
         </w:tc>
         <w:tc>
           <w:tcPr>
-            <w:tcW w:type="dxa" w:w="1701"/>
-          </w:tcPr>
-          <w:p>
-            <w:r>
-              <w:rPr>
+            <w:tcW w:type="dxa" w:w="1247"/>
+            <w:shd w:val="clear" w:color="auto" w:fill="FFEB9C"/>
+          </w:tcPr>
+          <w:p>
+            <w:pPr>
+              <w:jc w:val="center"/>
+            </w:pPr>
+            <w:r/>
+            <w:r>
+              <w:rPr>
+                <w:b/>
                 <w:sz w:val="16"/>
               </w:rPr>
               <w:t>Parcial</w:t>
@@ -3367,14 +3393,16 @@
         </w:tc>
         <w:tc>
           <w:tcPr>
-            <w:tcW w:type="dxa" w:w="4535"/>
-          </w:tcPr>
-          <w:p>
-            <w:r>
-              <w:rPr>
+            <w:tcW w:type="dxa" w:w="3345"/>
+          </w:tcPr>
+          <w:p>
+            <w:r/>
+            <w:r>
+              <w:rPr>
+                <w:b w:val="0"/>
                 <w:sz w:val="16"/>
               </w:rPr>
-              <w:t>routes/staff.js: invitar, listar, revocar, aceptar invitación. Falta confirmar editar/eliminar staff y roles diferenciados.</w:t>
+              <w:t>routes/staff.js: invitación por correo, listado, revocación y aceptación de invitaciones. Pendiente: Completar edición y eliminación de cuentas del personal y roles con permisos diferenciados.</w:t>
             </w:r>
           </w:p>
         </w:tc>
@@ -3387,6 +3415,7 @@
         </w:trPr>
         <w:tc>
           <w:tcPr>
+            <w:tcW w:type="dxa" w:w="964"/>
             <w:tcBorders>
               <w:top w:color="000000" w:space="0" w:sz="0" w:val="nil"/>
               <w:left w:color="aaaaaa" w:space="0" w:sz="5" w:val="single"/>
@@ -3425,6 +3454,7 @@
         </w:tc>
         <w:tc>
           <w:tcPr>
+            <w:tcW w:type="dxa" w:w="1474"/>
             <w:tcBorders>
               <w:top w:color="000000" w:space="0" w:sz="0" w:val="nil"/>
               <w:left w:color="000000" w:space="0" w:sz="0" w:val="nil"/>
@@ -3463,6 +3493,7 @@
         </w:tc>
         <w:tc>
           <w:tcPr>
+            <w:tcW w:type="dxa" w:w="3628"/>
             <w:tcBorders>
               <w:top w:color="000000" w:space="0" w:sz="0" w:val="nil"/>
               <w:left w:color="000000" w:space="0" w:sz="0" w:val="nil"/>
@@ -3501,11 +3532,17 @@
         </w:tc>
         <w:tc>
           <w:tcPr>
-            <w:tcW w:type="dxa" w:w="1701"/>
-          </w:tcPr>
-          <w:p>
-            <w:r>
-              <w:rPr>
+            <w:tcW w:type="dxa" w:w="1247"/>
+            <w:shd w:val="clear" w:color="auto" w:fill="FFEB9C"/>
+          </w:tcPr>
+          <w:p>
+            <w:pPr>
+              <w:jc w:val="center"/>
+            </w:pPr>
+            <w:r/>
+            <w:r>
+              <w:rPr>
+                <w:b/>
                 <w:sz w:val="16"/>
               </w:rPr>
               <w:t>Parcial</w:t>
@@ -3514,14 +3551,16 @@
         </w:tc>
         <w:tc>
           <w:tcPr>
-            <w:tcW w:type="dxa" w:w="4535"/>
-          </w:tcPr>
-          <w:p>
-            <w:r>
-              <w:rPr>
+            <w:tcW w:type="dxa" w:w="3345"/>
+          </w:tcPr>
+          <w:p>
+            <w:r/>
+            <w:r>
+              <w:rPr>
+                <w:b w:val="0"/>
                 <w:sz w:val="16"/>
               </w:rPr>
-              <w:t>routes/auth.js: login, logout, rate limit. Falta cierre automático por inactividad.</w:t>
+              <w:t>routes/auth.js: inicio y cierre de sesión, límite de intentos (rate limit). Pendiente: Agregar cierre automático de sesión por inactividad.</w:t>
             </w:r>
           </w:p>
         </w:tc>
@@ -3534,6 +3573,7 @@
         </w:trPr>
         <w:tc>
           <w:tcPr>
+            <w:tcW w:type="dxa" w:w="964"/>
             <w:tcBorders>
               <w:top w:color="000000" w:space="0" w:sz="0" w:val="nil"/>
               <w:left w:color="aaaaaa" w:space="0" w:sz="5" w:val="single"/>
@@ -3571,6 +3611,7 @@
         </w:tc>
         <w:tc>
           <w:tcPr>
+            <w:tcW w:type="dxa" w:w="1474"/>
             <w:tcBorders>
               <w:top w:color="000000" w:space="0" w:sz="0" w:val="nil"/>
               <w:left w:color="000000" w:space="0" w:sz="0" w:val="nil"/>
@@ -3608,6 +3649,7 @@
         </w:tc>
         <w:tc>
           <w:tcPr>
+            <w:tcW w:type="dxa" w:w="3628"/>
             <w:tcBorders>
               <w:top w:color="000000" w:space="0" w:sz="0" w:val="nil"/>
               <w:left w:color="000000" w:space="0" w:sz="0" w:val="nil"/>
@@ -3645,11 +3687,17 @@
         </w:tc>
         <w:tc>
           <w:tcPr>
-            <w:tcW w:type="dxa" w:w="1701"/>
-          </w:tcPr>
-          <w:p>
-            <w:r>
-              <w:rPr>
+            <w:tcW w:type="dxa" w:w="1247"/>
+            <w:shd w:val="clear" w:color="auto" w:fill="C6EFCE"/>
+          </w:tcPr>
+          <w:p>
+            <w:pPr>
+              <w:jc w:val="center"/>
+            </w:pPr>
+            <w:r/>
+            <w:r>
+              <w:rPr>
+                <w:b/>
                 <w:sz w:val="16"/>
               </w:rPr>
               <w:t>Implementado</w:t>
@@ -3658,14 +3706,16 @@
         </w:tc>
         <w:tc>
           <w:tcPr>
-            <w:tcW w:type="dxa" w:w="4535"/>
-          </w:tcPr>
-          <w:p>
-            <w:r>
-              <w:rPr>
+            <w:tcW w:type="dxa" w:w="3345"/>
+          </w:tcPr>
+          <w:p>
+            <w:r/>
+            <w:r>
+              <w:rPr>
+                <w:b w:val="0"/>
                 <w:sz w:val="16"/>
               </w:rPr>
-              <w:t>routes/miembros.js: alta, edición, baja lógica, búsqueda por QR/documento. Pendiente verificar duplicados.</w:t>
+              <w:t>routes/miembros.js: alta, edición, baja lógica y búsqueda por QR o documento. Pendiente: Verificar la validación de duplicados por documento y correo.</w:t>
             </w:r>
           </w:p>
         </w:tc>
@@ -3678,6 +3728,7 @@
         </w:trPr>
         <w:tc>
           <w:tcPr>
+            <w:tcW w:type="dxa" w:w="964"/>
             <w:tcBorders>
               <w:top w:color="000000" w:space="0" w:sz="0" w:val="nil"/>
               <w:left w:color="aaaaaa" w:space="0" w:sz="5" w:val="single"/>
@@ -3716,6 +3767,7 @@
         </w:tc>
         <w:tc>
           <w:tcPr>
+            <w:tcW w:type="dxa" w:w="1474"/>
             <w:tcBorders>
               <w:top w:color="000000" w:space="0" w:sz="0" w:val="nil"/>
               <w:left w:color="000000" w:space="0" w:sz="0" w:val="nil"/>
@@ -3754,6 +3806,7 @@
         </w:tc>
         <w:tc>
           <w:tcPr>
+            <w:tcW w:type="dxa" w:w="3628"/>
             <w:tcBorders>
               <w:top w:color="000000" w:space="0" w:sz="0" w:val="nil"/>
               <w:left w:color="000000" w:space="0" w:sz="0" w:val="nil"/>
@@ -3792,11 +3845,17 @@
         </w:tc>
         <w:tc>
           <w:tcPr>
-            <w:tcW w:type="dxa" w:w="1701"/>
-          </w:tcPr>
-          <w:p>
-            <w:r>
-              <w:rPr>
+            <w:tcW w:type="dxa" w:w="1247"/>
+            <w:shd w:val="clear" w:color="auto" w:fill="FFEB9C"/>
+          </w:tcPr>
+          <w:p>
+            <w:pPr>
+              <w:jc w:val="center"/>
+            </w:pPr>
+            <w:r/>
+            <w:r>
+              <w:rPr>
+                <w:b/>
                 <w:sz w:val="16"/>
               </w:rPr>
               <w:t>Parcial</w:t>
@@ -3805,14 +3864,16 @@
         </w:tc>
         <w:tc>
           <w:tcPr>
-            <w:tcW w:type="dxa" w:w="4535"/>
-          </w:tcPr>
-          <w:p>
-            <w:r>
-              <w:rPr>
+            <w:tcW w:type="dxa" w:w="3345"/>
+          </w:tcPr>
+          <w:p>
+            <w:r/>
+            <w:r>
+              <w:rPr>
+                <w:b w:val="0"/>
                 <w:sz w:val="16"/>
               </w:rPr>
-              <w:t>Tabla congelacion_membresia y jobs/expiracion.js. Falta endpoint/pantalla para congelar.</w:t>
+              <w:t>Tabla congelacion_membresia y jobs/expiracion.js (vencimiento automático). Pendiente: Falta el endpoint y la pantalla para congelar una membresía.</w:t>
             </w:r>
           </w:p>
         </w:tc>
@@ -3825,6 +3886,7 @@
         </w:trPr>
         <w:tc>
           <w:tcPr>
+            <w:tcW w:type="dxa" w:w="964"/>
             <w:tcBorders>
               <w:top w:color="000000" w:space="0" w:sz="0" w:val="nil"/>
               <w:left w:color="aaaaaa" w:space="0" w:sz="5" w:val="single"/>
@@ -3862,6 +3924,7 @@
         </w:tc>
         <w:tc>
           <w:tcPr>
+            <w:tcW w:type="dxa" w:w="1474"/>
             <w:tcBorders>
               <w:top w:color="000000" w:space="0" w:sz="0" w:val="nil"/>
               <w:left w:color="000000" w:space="0" w:sz="0" w:val="nil"/>
@@ -3899,6 +3962,7 @@
         </w:tc>
         <w:tc>
           <w:tcPr>
+            <w:tcW w:type="dxa" w:w="3628"/>
             <w:tcBorders>
               <w:top w:color="000000" w:space="0" w:sz="0" w:val="nil"/>
               <w:left w:color="000000" w:space="0" w:sz="0" w:val="nil"/>
@@ -3936,11 +4000,17 @@
         </w:tc>
         <w:tc>
           <w:tcPr>
-            <w:tcW w:type="dxa" w:w="1701"/>
-          </w:tcPr>
-          <w:p>
-            <w:r>
-              <w:rPr>
+            <w:tcW w:type="dxa" w:w="1247"/>
+            <w:shd w:val="clear" w:color="auto" w:fill="C6EFCE"/>
+          </w:tcPr>
+          <w:p>
+            <w:pPr>
+              <w:jc w:val="center"/>
+            </w:pPr>
+            <w:r/>
+            <w:r>
+              <w:rPr>
+                <w:b/>
                 <w:sz w:val="16"/>
               </w:rPr>
               <w:t>Implementado</w:t>
@@ -3949,14 +4019,16 @@
         </w:tc>
         <w:tc>
           <w:tcPr>
-            <w:tcW w:type="dxa" w:w="4535"/>
-          </w:tcPr>
-          <w:p>
-            <w:r>
-              <w:rPr>
+            <w:tcW w:type="dxa" w:w="3345"/>
+          </w:tcPr>
+          <w:p>
+            <w:r/>
+            <w:r>
+              <w:rPr>
+                <w:b w:val="0"/>
                 <w:sz w:val="16"/>
               </w:rPr>
-              <w:t>routes/checkin.js (POST), CheckinPage.jsx, routes/asistencia.js.</w:t>
+              <w:t>routes/checkin.js, CheckinPage.jsx y routes/asistencia.js.</w:t>
             </w:r>
           </w:p>
         </w:tc>
@@ -3969,6 +4041,7 @@
         </w:trPr>
         <w:tc>
           <w:tcPr>
+            <w:tcW w:type="dxa" w:w="964"/>
             <w:tcBorders>
               <w:top w:color="000000" w:space="0" w:sz="0" w:val="nil"/>
               <w:left w:color="aaaaaa" w:space="0" w:sz="5" w:val="single"/>
@@ -4007,6 +4080,7 @@
         </w:tc>
         <w:tc>
           <w:tcPr>
+            <w:tcW w:type="dxa" w:w="1474"/>
             <w:tcBorders>
               <w:top w:color="000000" w:space="0" w:sz="0" w:val="nil"/>
               <w:left w:color="000000" w:space="0" w:sz="0" w:val="nil"/>
@@ -4045,6 +4119,7 @@
         </w:tc>
         <w:tc>
           <w:tcPr>
+            <w:tcW w:type="dxa" w:w="3628"/>
             <w:tcBorders>
               <w:top w:color="000000" w:space="0" w:sz="0" w:val="nil"/>
               <w:left w:color="000000" w:space="0" w:sz="0" w:val="nil"/>
@@ -4083,11 +4158,17 @@
         </w:tc>
         <w:tc>
           <w:tcPr>
-            <w:tcW w:type="dxa" w:w="1701"/>
-          </w:tcPr>
-          <w:p>
-            <w:r>
-              <w:rPr>
+            <w:tcW w:type="dxa" w:w="1247"/>
+            <w:shd w:val="clear" w:color="auto" w:fill="C6EFCE"/>
+          </w:tcPr>
+          <w:p>
+            <w:pPr>
+              <w:jc w:val="center"/>
+            </w:pPr>
+            <w:r/>
+            <w:r>
+              <w:rPr>
+                <w:b/>
                 <w:sz w:val="16"/>
               </w:rPr>
               <w:t>Implementado</w:t>
@@ -4096,14 +4177,16 @@
         </w:tc>
         <w:tc>
           <w:tcPr>
-            <w:tcW w:type="dxa" w:w="4535"/>
-          </w:tcPr>
-          <w:p>
-            <w:r>
-              <w:rPr>
+            <w:tcW w:type="dxa" w:w="3345"/>
+          </w:tcPr>
+          <w:p>
+            <w:r/>
+            <w:r>
+              <w:rPr>
+                <w:b w:val="0"/>
                 <w:sz w:val="16"/>
               </w:rPr>
-              <w:t>checkin.js devuelve VENCIDO y bloquea; avisos en routes/notificaciones.js.</w:t>
+              <w:t>checkin.js bloquea el acceso con membresía vencida; avisos en routes/notificaciones.js.</w:t>
             </w:r>
           </w:p>
         </w:tc>
@@ -4116,6 +4199,7 @@
         </w:trPr>
         <w:tc>
           <w:tcPr>
+            <w:tcW w:type="dxa" w:w="964"/>
             <w:tcBorders>
               <w:top w:color="000000" w:space="0" w:sz="0" w:val="nil"/>
               <w:left w:color="aaaaaa" w:space="0" w:sz="5" w:val="single"/>
@@ -4153,6 +4237,7 @@
         </w:tc>
         <w:tc>
           <w:tcPr>
+            <w:tcW w:type="dxa" w:w="1474"/>
             <w:tcBorders>
               <w:top w:color="000000" w:space="0" w:sz="0" w:val="nil"/>
               <w:left w:color="000000" w:space="0" w:sz="0" w:val="nil"/>
@@ -4190,6 +4275,7 @@
         </w:tc>
         <w:tc>
           <w:tcPr>
+            <w:tcW w:type="dxa" w:w="3628"/>
             <w:tcBorders>
               <w:top w:color="000000" w:space="0" w:sz="0" w:val="nil"/>
               <w:left w:color="000000" w:space="0" w:sz="0" w:val="nil"/>
@@ -4227,11 +4313,17 @@
         </w:tc>
         <w:tc>
           <w:tcPr>
-            <w:tcW w:type="dxa" w:w="1701"/>
-          </w:tcPr>
-          <w:p>
-            <w:r>
-              <w:rPr>
+            <w:tcW w:type="dxa" w:w="1247"/>
+            <w:shd w:val="clear" w:color="auto" w:fill="C6EFCE"/>
+          </w:tcPr>
+          <w:p>
+            <w:pPr>
+              <w:jc w:val="center"/>
+            </w:pPr>
+            <w:r/>
+            <w:r>
+              <w:rPr>
+                <w:b/>
                 <w:sz w:val="16"/>
               </w:rPr>
               <w:t>Implementado</w:t>
@@ -4240,14 +4332,16 @@
         </w:tc>
         <w:tc>
           <w:tcPr>
-            <w:tcW w:type="dxa" w:w="4535"/>
-          </w:tcPr>
-          <w:p>
-            <w:r>
-              <w:rPr>
+            <w:tcW w:type="dxa" w:w="3345"/>
+          </w:tcPr>
+          <w:p>
+            <w:r/>
+            <w:r>
+              <w:rPr>
+                <w:b w:val="0"/>
                 <w:sz w:val="16"/>
               </w:rPr>
-              <w:t>routes/dashboard.js (KPIs, en riesgo, export CSV), DashboardPage.jsx.</w:t>
+              <w:t>routes/dashboard.js (indicadores, miembros en riesgo) y DashboardPage.jsx.</w:t>
             </w:r>
           </w:p>
         </w:tc>
@@ -4260,6 +4354,7 @@
         </w:trPr>
         <w:tc>
           <w:tcPr>
+            <w:tcW w:type="dxa" w:w="964"/>
             <w:tcBorders>
               <w:top w:color="000000" w:space="0" w:sz="0" w:val="nil"/>
               <w:left w:color="aaaaaa" w:space="0" w:sz="5" w:val="single"/>
@@ -4298,6 +4393,7 @@
         </w:tc>
         <w:tc>
           <w:tcPr>
+            <w:tcW w:type="dxa" w:w="1474"/>
             <w:tcBorders>
               <w:top w:color="000000" w:space="0" w:sz="0" w:val="nil"/>
               <w:left w:color="000000" w:space="0" w:sz="0" w:val="nil"/>
@@ -4336,6 +4432,7 @@
         </w:tc>
         <w:tc>
           <w:tcPr>
+            <w:tcW w:type="dxa" w:w="3628"/>
             <w:tcBorders>
               <w:top w:color="000000" w:space="0" w:sz="0" w:val="nil"/>
               <w:left w:color="000000" w:space="0" w:sz="0" w:val="nil"/>
@@ -4382,11 +4479,17 @@
         </w:tc>
         <w:tc>
           <w:tcPr>
-            <w:tcW w:type="dxa" w:w="1701"/>
-          </w:tcPr>
-          <w:p>
-            <w:r>
-              <w:rPr>
+            <w:tcW w:type="dxa" w:w="1247"/>
+            <w:shd w:val="clear" w:color="auto" w:fill="FFEB9C"/>
+          </w:tcPr>
+          <w:p>
+            <w:pPr>
+              <w:jc w:val="center"/>
+            </w:pPr>
+            <w:r/>
+            <w:r>
+              <w:rPr>
+                <w:b/>
                 <w:sz w:val="16"/>
               </w:rPr>
               <w:t>Parcial</w:t>
@@ -4395,14 +4498,16 @@
         </w:tc>
         <w:tc>
           <w:tcPr>
-            <w:tcW w:type="dxa" w:w="4535"/>
-          </w:tcPr>
-          <w:p>
-            <w:r>
-              <w:rPr>
+            <w:tcW w:type="dxa" w:w="3345"/>
+          </w:tcPr>
+          <w:p>
+            <w:r/>
+            <w:r>
+              <w:rPr>
+                <w:b w:val="0"/>
                 <w:sz w:val="16"/>
               </w:rPr>
-              <w:t>Umbrales por gimnasio (migración 006) y lista en riesgo. Falta confirmar cron diario de abandono.</w:t>
+              <w:t>Umbrales configurables por gimnasio (migración 006) y listado de miembros en riesgo. Pendiente: Confirmar la ejecución diaria automática del motor de abandono.</w:t>
             </w:r>
           </w:p>
         </w:tc>
@@ -4415,6 +4520,7 @@
         </w:trPr>
         <w:tc>
           <w:tcPr>
+            <w:tcW w:type="dxa" w:w="964"/>
             <w:tcBorders>
               <w:top w:color="000000" w:space="0" w:sz="0" w:val="nil"/>
               <w:left w:color="aaaaaa" w:space="0" w:sz="5" w:val="single"/>
@@ -4452,6 +4558,7 @@
         </w:tc>
         <w:tc>
           <w:tcPr>
+            <w:tcW w:type="dxa" w:w="1474"/>
             <w:tcBorders>
               <w:top w:color="000000" w:space="0" w:sz="0" w:val="nil"/>
               <w:left w:color="000000" w:space="0" w:sz="0" w:val="nil"/>
@@ -4489,6 +4596,7 @@
         </w:tc>
         <w:tc>
           <w:tcPr>
+            <w:tcW w:type="dxa" w:w="3628"/>
             <w:tcBorders>
               <w:top w:color="000000" w:space="0" w:sz="0" w:val="nil"/>
               <w:left w:color="000000" w:space="0" w:sz="0" w:val="nil"/>
@@ -4526,11 +4634,17 @@
         </w:tc>
         <w:tc>
           <w:tcPr>
-            <w:tcW w:type="dxa" w:w="1701"/>
-          </w:tcPr>
-          <w:p>
-            <w:r>
-              <w:rPr>
+            <w:tcW w:type="dxa" w:w="1247"/>
+            <w:shd w:val="clear" w:color="auto" w:fill="C6EFCE"/>
+          </w:tcPr>
+          <w:p>
+            <w:pPr>
+              <w:jc w:val="center"/>
+            </w:pPr>
+            <w:r/>
+            <w:r>
+              <w:rPr>
+                <w:b/>
                 <w:sz w:val="16"/>
               </w:rPr>
               <w:t>Implementado</w:t>
@@ -4539,14 +4653,16 @@
         </w:tc>
         <w:tc>
           <w:tcPr>
-            <w:tcW w:type="dxa" w:w="4535"/>
-          </w:tcPr>
-          <w:p>
-            <w:r>
-              <w:rPr>
+            <w:tcW w:type="dxa" w:w="3345"/>
+          </w:tcPr>
+          <w:p>
+            <w:r/>
+            <w:r>
+              <w:rPr>
+                <w:b w:val="0"/>
                 <w:sz w:val="16"/>
               </w:rPr>
-              <w:t>notificaciones.js (/enviado registra envío), lib/whatsapp.js, lib/email.js.</w:t>
+              <w:t>notificaciones.js (registro de envíos), lib/whatsapp.js y lib/email.js.</w:t>
             </w:r>
           </w:p>
         </w:tc>
@@ -4559,6 +4675,7 @@
         </w:trPr>
         <w:tc>
           <w:tcPr>
+            <w:tcW w:type="dxa" w:w="964"/>
             <w:tcBorders>
               <w:top w:color="000000" w:space="0" w:sz="0" w:val="nil"/>
               <w:left w:color="aaaaaa" w:space="0" w:sz="5" w:val="single"/>
@@ -4597,6 +4714,7 @@
         </w:tc>
         <w:tc>
           <w:tcPr>
+            <w:tcW w:type="dxa" w:w="1474"/>
             <w:tcBorders>
               <w:top w:color="000000" w:space="0" w:sz="0" w:val="nil"/>
               <w:left w:color="000000" w:space="0" w:sz="0" w:val="nil"/>
@@ -4635,6 +4753,7 @@
         </w:tc>
         <w:tc>
           <w:tcPr>
+            <w:tcW w:type="dxa" w:w="3628"/>
             <w:tcBorders>
               <w:top w:color="000000" w:space="0" w:sz="0" w:val="nil"/>
               <w:left w:color="000000" w:space="0" w:sz="0" w:val="nil"/>
@@ -4673,27 +4792,35 @@
         </w:tc>
         <w:tc>
           <w:tcPr>
-            <w:tcW w:type="dxa" w:w="1701"/>
-          </w:tcPr>
-          <w:p>
-            <w:r>
-              <w:rPr>
+            <w:tcW w:type="dxa" w:w="1247"/>
+            <w:shd w:val="clear" w:color="auto" w:fill="F8CBAD"/>
+          </w:tcPr>
+          <w:p>
+            <w:pPr>
+              <w:jc w:val="center"/>
+            </w:pPr>
+            <w:r/>
+            <w:r>
+              <w:rPr>
+                <w:b/>
                 <w:sz w:val="16"/>
               </w:rPr>
-              <w:t>No implementado</w:t>
-            </w:r>
-          </w:p>
-        </w:tc>
-        <w:tc>
-          <w:tcPr>
-            <w:tcW w:type="dxa" w:w="4535"/>
-          </w:tcPr>
-          <w:p>
-            <w:r>
-              <w:rPr>
+              <w:t>Pendiente</w:t>
+            </w:r>
+          </w:p>
+        </w:tc>
+        <w:tc>
+          <w:tcPr>
+            <w:tcW w:type="dxa" w:w="3345"/>
+          </w:tcPr>
+          <w:p>
+            <w:r/>
+            <w:r>
+              <w:rPr>
+                <w:b w:val="0"/>
                 <w:sz w:val="16"/>
               </w:rPr>
-              <w:t>No existe modelo ni rutas de campañas.</w:t>
+              <w:t>Pendiente: Diseñar e implementar campañas segmentadas y plantillas reutilizables.</w:t>
             </w:r>
           </w:p>
         </w:tc>
@@ -4706,6 +4833,7 @@
         </w:trPr>
         <w:tc>
           <w:tcPr>
+            <w:tcW w:type="dxa" w:w="964"/>
             <w:tcBorders>
               <w:top w:color="000000" w:space="0" w:sz="0" w:val="nil"/>
               <w:left w:color="aaaaaa" w:space="0" w:sz="5" w:val="single"/>
@@ -4743,6 +4871,7 @@
         </w:tc>
         <w:tc>
           <w:tcPr>
+            <w:tcW w:type="dxa" w:w="1474"/>
             <w:tcBorders>
               <w:top w:color="000000" w:space="0" w:sz="0" w:val="nil"/>
               <w:left w:color="000000" w:space="0" w:sz="0" w:val="nil"/>
@@ -4780,6 +4909,7 @@
         </w:tc>
         <w:tc>
           <w:tcPr>
+            <w:tcW w:type="dxa" w:w="3628"/>
             <w:tcBorders>
               <w:top w:color="000000" w:space="0" w:sz="0" w:val="nil"/>
               <w:left w:color="000000" w:space="0" w:sz="0" w:val="nil"/>
@@ -4817,11 +4947,17 @@
         </w:tc>
         <w:tc>
           <w:tcPr>
-            <w:tcW w:type="dxa" w:w="1701"/>
-          </w:tcPr>
-          <w:p>
-            <w:r>
-              <w:rPr>
+            <w:tcW w:type="dxa" w:w="1247"/>
+            <w:shd w:val="clear" w:color="auto" w:fill="FFEB9C"/>
+          </w:tcPr>
+          <w:p>
+            <w:pPr>
+              <w:jc w:val="center"/>
+            </w:pPr>
+            <w:r/>
+            <w:r>
+              <w:rPr>
+                <w:b/>
                 <w:sz w:val="16"/>
               </w:rPr>
               <w:t>Parcial</w:t>
@@ -4830,14 +4966,16 @@
         </w:tc>
         <w:tc>
           <w:tcPr>
-            <w:tcW w:type="dxa" w:w="4535"/>
-          </w:tcPr>
-          <w:p>
-            <w:r>
-              <w:rPr>
+            <w:tcW w:type="dxa" w:w="3345"/>
+          </w:tcPr>
+          <w:p>
+            <w:r/>
+            <w:r>
+              <w:rPr>
+                <w:b w:val="0"/>
                 <w:sz w:val="16"/>
               </w:rPr>
-              <w:t>routes/cliente.js GET /gamificacion calcula rachas. Falta mensaje de hito en check-in y configuración por admin.</w:t>
+              <w:t>routes/cliente.js GET /gamificacion: cálculo de rachas en la app del miembro. Pendiente: Mensaje de hito en la pantalla de check-in y configuración de hitos por el administrador.</w:t>
             </w:r>
           </w:p>
         </w:tc>
@@ -4850,6 +4988,7 @@
         </w:trPr>
         <w:tc>
           <w:tcPr>
+            <w:tcW w:type="dxa" w:w="964"/>
             <w:tcBorders>
               <w:top w:color="000000" w:space="0" w:sz="0" w:val="nil"/>
               <w:left w:color="aaaaaa" w:space="0" w:sz="5" w:val="single"/>
@@ -4888,6 +5027,7 @@
         </w:tc>
         <w:tc>
           <w:tcPr>
+            <w:tcW w:type="dxa" w:w="1474"/>
             <w:tcBorders>
               <w:top w:color="000000" w:space="0" w:sz="0" w:val="nil"/>
               <w:left w:color="000000" w:space="0" w:sz="0" w:val="nil"/>
@@ -4926,6 +5066,7 @@
         </w:tc>
         <w:tc>
           <w:tcPr>
+            <w:tcW w:type="dxa" w:w="3628"/>
             <w:tcBorders>
               <w:top w:color="000000" w:space="0" w:sz="0" w:val="nil"/>
               <w:left w:color="000000" w:space="0" w:sz="0" w:val="nil"/>
@@ -4964,11 +5105,17 @@
         </w:tc>
         <w:tc>
           <w:tcPr>
-            <w:tcW w:type="dxa" w:w="1701"/>
-          </w:tcPr>
-          <w:p>
-            <w:r>
-              <w:rPr>
+            <w:tcW w:type="dxa" w:w="1247"/>
+            <w:shd w:val="clear" w:color="auto" w:fill="FFEB9C"/>
+          </w:tcPr>
+          <w:p>
+            <w:pPr>
+              <w:jc w:val="center"/>
+            </w:pPr>
+            <w:r/>
+            <w:r>
+              <w:rPr>
+                <w:b/>
                 <w:sz w:val="16"/>
               </w:rPr>
               <w:t>Parcial</w:t>
@@ -4977,14 +5124,16 @@
         </w:tc>
         <w:tc>
           <w:tcPr>
-            <w:tcW w:type="dxa" w:w="4535"/>
-          </w:tcPr>
-          <w:p>
-            <w:r>
-              <w:rPr>
+            <w:tcW w:type="dxa" w:w="3345"/>
+          </w:tcPr>
+          <w:p>
+            <w:r/>
+            <w:r>
+              <w:rPr>
+                <w:b w:val="0"/>
                 <w:sz w:val="16"/>
               </w:rPr>
-              <w:t>Tablas reto/reto_miembro y GET /api/cliente/retos. Falta CRUD de retos para admin y aviso al completar.</w:t>
+              <w:t>Tablas reto y reto_miembro; GET /api/cliente/retos con progreso del miembro. Pendiente: Pantalla y endpoints del administrador para crear retos y notificar al completarlos.</w:t>
             </w:r>
           </w:p>
         </w:tc>
@@ -4992,41 +5141,62 @@
       <w:tr>
         <w:tc>
           <w:tcPr>
-            <w:tcW w:type="dxa" w:w="1080"/>
-          </w:tcPr>
-          <w:p>
-            <w:r>
+            <w:tcW w:type="dxa" w:w="964"/>
+          </w:tcPr>
+          <w:p>
+            <w:r/>
+            <w:r>
+              <w:rPr>
+                <w:b w:val="0"/>
+                <w:sz w:val="18"/>
+              </w:rPr>
               <w:t>RQF-13</w:t>
             </w:r>
           </w:p>
         </w:tc>
         <w:tc>
           <w:tcPr>
-            <w:tcW w:type="dxa" w:w="2310"/>
-          </w:tcPr>
-          <w:p>
-            <w:r>
+            <w:tcW w:type="dxa" w:w="1474"/>
+          </w:tcPr>
+          <w:p>
+            <w:r/>
+            <w:r>
+              <w:rPr>
+                <w:b w:val="0"/>
+                <w:sz w:val="18"/>
+              </w:rPr>
               <w:t>Contratos</w:t>
             </w:r>
           </w:p>
         </w:tc>
         <w:tc>
           <w:tcPr>
-            <w:tcW w:type="dxa" w:w="7230"/>
-          </w:tcPr>
-          <w:p>
-            <w:r>
-              <w:t>El sistema debe permitir al administrador enviar el contrato de membresía al miembro por WhatsApp, informando con honestidad si el envío falló.</w:t>
-            </w:r>
-          </w:p>
-        </w:tc>
-        <w:tc>
-          <w:tcPr>
-            <w:tcW w:type="dxa" w:w="1701"/>
-          </w:tcPr>
-          <w:p>
-            <w:r>
-              <w:rPr>
+            <w:tcW w:type="dxa" w:w="3628"/>
+          </w:tcPr>
+          <w:p>
+            <w:r/>
+            <w:r>
+              <w:rPr>
+                <w:b w:val="0"/>
+                <w:sz w:val="18"/>
+              </w:rPr>
+              <w:t>El sistema debe permitir al administrador enviar el contrato de membresía al miembro por WhatsApp, informando con veracidad si el envío no se pudo completar.</w:t>
+            </w:r>
+          </w:p>
+        </w:tc>
+        <w:tc>
+          <w:tcPr>
+            <w:tcW w:type="dxa" w:w="1247"/>
+            <w:shd w:val="clear" w:color="auto" w:fill="C6EFCE"/>
+          </w:tcPr>
+          <w:p>
+            <w:pPr>
+              <w:jc w:val="center"/>
+            </w:pPr>
+            <w:r/>
+            <w:r>
+              <w:rPr>
+                <w:b/>
                 <w:sz w:val="16"/>
               </w:rPr>
               <w:t>Implementado</w:t>
@@ -5035,14 +5205,16 @@
         </w:tc>
         <w:tc>
           <w:tcPr>
-            <w:tcW w:type="dxa" w:w="4535"/>
-          </w:tcPr>
-          <w:p>
-            <w:r>
-              <w:rPr>
+            <w:tcW w:type="dxa" w:w="3345"/>
+          </w:tcPr>
+          <w:p>
+            <w:r/>
+            <w:r>
+              <w:rPr>
+                <w:b w:val="0"/>
                 <w:sz w:val="16"/>
               </w:rPr>
-              <w:t>routes/admin-contrato.js: envío del contrato de membresía por WhatsApp; migración 008.</w:t>
+              <w:t>routes/admin-contrato.js: envío del contrato de membresía por WhatsApp (migración 008).</w:t>
             </w:r>
           </w:p>
         </w:tc>
@@ -5050,41 +5222,62 @@
       <w:tr>
         <w:tc>
           <w:tcPr>
-            <w:tcW w:type="dxa" w:w="1080"/>
-          </w:tcPr>
-          <w:p>
-            <w:r>
+            <w:tcW w:type="dxa" w:w="964"/>
+          </w:tcPr>
+          <w:p>
+            <w:r/>
+            <w:r>
+              <w:rPr>
+                <w:b w:val="0"/>
+                <w:sz w:val="18"/>
+              </w:rPr>
               <w:t>RQF-14</w:t>
             </w:r>
           </w:p>
         </w:tc>
         <w:tc>
           <w:tcPr>
-            <w:tcW w:type="dxa" w:w="2310"/>
-          </w:tcPr>
-          <w:p>
-            <w:r>
+            <w:tcW w:type="dxa" w:w="1474"/>
+          </w:tcPr>
+          <w:p>
+            <w:r/>
+            <w:r>
+              <w:rPr>
+                <w:b w:val="0"/>
+                <w:sz w:val="18"/>
+              </w:rPr>
               <w:t>Alertas de Abandono</w:t>
             </w:r>
           </w:p>
         </w:tc>
         <w:tc>
           <w:tcPr>
-            <w:tcW w:type="dxa" w:w="7230"/>
-          </w:tcPr>
-          <w:p>
-            <w:r>
+            <w:tcW w:type="dxa" w:w="3628"/>
+          </w:tcPr>
+          <w:p>
+            <w:r/>
+            <w:r>
+              <w:rPr>
+                <w:b w:val="0"/>
+                <w:sz w:val="18"/>
+              </w:rPr>
               <w:t>El sistema debe ejecutar diariamente el envío de avisos de vencimiento de membresía por WhatsApp, con una ventana de días configurable por gimnasio.</w:t>
             </w:r>
           </w:p>
         </w:tc>
         <w:tc>
           <w:tcPr>
-            <w:tcW w:type="dxa" w:w="1701"/>
-          </w:tcPr>
-          <w:p>
-            <w:r>
-              <w:rPr>
+            <w:tcW w:type="dxa" w:w="1247"/>
+            <w:shd w:val="clear" w:color="auto" w:fill="C6EFCE"/>
+          </w:tcPr>
+          <w:p>
+            <w:pPr>
+              <w:jc w:val="center"/>
+            </w:pPr>
+            <w:r/>
+            <w:r>
+              <w:rPr>
+                <w:b/>
                 <w:sz w:val="16"/>
               </w:rPr>
               <w:t>Implementado</w:t>
@@ -5093,14 +5286,16 @@
         </w:tc>
         <w:tc>
           <w:tcPr>
-            <w:tcW w:type="dxa" w:w="4535"/>
-          </w:tcPr>
-          <w:p>
-            <w:r>
-              <w:rPr>
+            <w:tcW w:type="dxa" w:w="3345"/>
+          </w:tcPr>
+          <w:p>
+            <w:r/>
+            <w:r>
+              <w:rPr>
+                <w:b w:val="0"/>
                 <w:sz w:val="16"/>
               </w:rPr>
-              <w:t>jobs/scheduler.js + migración 007: cron diario de avisos de vencimiento por WhatsApp con ventana configurable por gimnasio.</w:t>
+              <w:t>jobs/scheduler.js y migración 007: aviso diario de vencimiento por WhatsApp con ventana configurable.</w:t>
             </w:r>
           </w:p>
         </w:tc>
@@ -5108,41 +5303,62 @@
       <w:tr>
         <w:tc>
           <w:tcPr>
-            <w:tcW w:type="dxa" w:w="1080"/>
-          </w:tcPr>
-          <w:p>
-            <w:r>
+            <w:tcW w:type="dxa" w:w="964"/>
+          </w:tcPr>
+          <w:p>
+            <w:r/>
+            <w:r>
+              <w:rPr>
+                <w:b w:val="0"/>
+                <w:sz w:val="18"/>
+              </w:rPr>
               <w:t>RQF-15</w:t>
             </w:r>
           </w:p>
         </w:tc>
         <w:tc>
           <w:tcPr>
-            <w:tcW w:type="dxa" w:w="2310"/>
-          </w:tcPr>
-          <w:p>
-            <w:r>
+            <w:tcW w:type="dxa" w:w="1474"/>
+          </w:tcPr>
+          <w:p>
+            <w:r/>
+            <w:r>
+              <w:rPr>
+                <w:b w:val="0"/>
+                <w:sz w:val="18"/>
+              </w:rPr>
               <w:t>App del miembro</w:t>
             </w:r>
           </w:p>
         </w:tc>
         <w:tc>
           <w:tcPr>
-            <w:tcW w:type="dxa" w:w="7230"/>
-          </w:tcPr>
-          <w:p>
-            <w:r>
-              <w:t>El sistema debe ofrecer una app móvil para el miembro con inicio de sesión, código QR personal, estado de membresía, historial de asistencia, rachas y retos.</w:t>
-            </w:r>
-          </w:p>
-        </w:tc>
-        <w:tc>
-          <w:tcPr>
-            <w:tcW w:type="dxa" w:w="1701"/>
-          </w:tcPr>
-          <w:p>
-            <w:r>
-              <w:rPr>
+            <w:tcW w:type="dxa" w:w="3628"/>
+          </w:tcPr>
+          <w:p>
+            <w:r/>
+            <w:r>
+              <w:rPr>
+                <w:b w:val="0"/>
+                <w:sz w:val="18"/>
+              </w:rPr>
+              <w:t>El sistema debe ofrecer una aplicación móvil para el miembro con inicio de sesión, código QR personal, estado de membresía, historial de asistencia, rachas y retos.</w:t>
+            </w:r>
+          </w:p>
+        </w:tc>
+        <w:tc>
+          <w:tcPr>
+            <w:tcW w:type="dxa" w:w="1247"/>
+            <w:shd w:val="clear" w:color="auto" w:fill="C6EFCE"/>
+          </w:tcPr>
+          <w:p>
+            <w:pPr>
+              <w:jc w:val="center"/>
+            </w:pPr>
+            <w:r/>
+            <w:r>
+              <w:rPr>
+                <w:b/>
                 <w:sz w:val="16"/>
               </w:rPr>
               <w:t>Implementado</w:t>
@@ -5151,14 +5367,16 @@
         </w:tc>
         <w:tc>
           <w:tcPr>
-            <w:tcW w:type="dxa" w:w="4535"/>
-          </w:tcPr>
-          <w:p>
-            <w:r>
-              <w:rPr>
+            <w:tcW w:type="dxa" w:w="3345"/>
+          </w:tcPr>
+          <w:p>
+            <w:r/>
+            <w:r>
+              <w:rPr>
+                <w:b w:val="0"/>
                 <w:sz w:val="16"/>
               </w:rPr>
-              <w:t>routes/cliente.js y fitloyalty_cliente/ (Flutter): login, QR, membresía, asistencia, gamificación y retos.</w:t>
+              <w:t>routes/cliente.js y fitloyalty_cliente/ (Flutter): acceso, QR, membresía, asistencia, rachas y retos.</w:t>
             </w:r>
           </w:p>
         </w:tc>
@@ -5166,41 +5384,62 @@
       <w:tr>
         <w:tc>
           <w:tcPr>
-            <w:tcW w:type="dxa" w:w="1080"/>
-          </w:tcPr>
-          <w:p>
-            <w:r>
+            <w:tcW w:type="dxa" w:w="964"/>
+          </w:tcPr>
+          <w:p>
+            <w:r/>
+            <w:r>
+              <w:rPr>
+                <w:b w:val="0"/>
+                <w:sz w:val="18"/>
+              </w:rPr>
               <w:t>RQF-16</w:t>
             </w:r>
           </w:p>
         </w:tc>
         <w:tc>
           <w:tcPr>
-            <w:tcW w:type="dxa" w:w="2310"/>
-          </w:tcPr>
-          <w:p>
-            <w:r>
+            <w:tcW w:type="dxa" w:w="1474"/>
+          </w:tcPr>
+          <w:p>
+            <w:r/>
+            <w:r>
+              <w:rPr>
+                <w:b w:val="0"/>
+                <w:sz w:val="18"/>
+              </w:rPr>
               <w:t>Facturación</w:t>
             </w:r>
           </w:p>
         </w:tc>
         <w:tc>
           <w:tcPr>
-            <w:tcW w:type="dxa" w:w="7230"/>
-          </w:tcPr>
-          <w:p>
-            <w:r>
+            <w:tcW w:type="dxa" w:w="3628"/>
+          </w:tcPr>
+          <w:p>
+            <w:r/>
+            <w:r>
+              <w:rPr>
+                <w:b w:val="0"/>
+                <w:sz w:val="18"/>
+              </w:rPr>
               <w:t>El sistema debe ofrecer una prueba gratuita de 14 días y mostrar su estado al administrador.</w:t>
             </w:r>
           </w:p>
         </w:tc>
         <w:tc>
           <w:tcPr>
-            <w:tcW w:type="dxa" w:w="1701"/>
-          </w:tcPr>
-          <w:p>
-            <w:r>
-              <w:rPr>
+            <w:tcW w:type="dxa" w:w="1247"/>
+            <w:shd w:val="clear" w:color="auto" w:fill="C6EFCE"/>
+          </w:tcPr>
+          <w:p>
+            <w:pPr>
+              <w:jc w:val="center"/>
+            </w:pPr>
+            <w:r/>
+            <w:r>
+              <w:rPr>
+                <w:b/>
                 <w:sz w:val="16"/>
               </w:rPr>
               <w:t>Implementado</w:t>
@@ -5209,14 +5448,16 @@
         </w:tc>
         <w:tc>
           <w:tcPr>
-            <w:tcW w:type="dxa" w:w="4535"/>
-          </w:tcPr>
-          <w:p>
-            <w:r>
-              <w:rPr>
+            <w:tcW w:type="dxa" w:w="3345"/>
+          </w:tcPr>
+          <w:p>
+            <w:r/>
+            <w:r>
+              <w:rPr>
+                <w:b w:val="0"/>
                 <w:sz w:val="16"/>
               </w:rPr>
-              <w:t>routes/billing.js y lib/trial.js: prueba gratuita de 14 días y estado del trial.</w:t>
+              <w:t>routes/billing.js y lib/trial.js: prueba gratuita de 14 días y consulta de su estado.</w:t>
             </w:r>
           </w:p>
         </w:tc>
@@ -5224,41 +5465,62 @@
       <w:tr>
         <w:tc>
           <w:tcPr>
-            <w:tcW w:type="dxa" w:w="1080"/>
-          </w:tcPr>
-          <w:p>
-            <w:r>
+            <w:tcW w:type="dxa" w:w="964"/>
+          </w:tcPr>
+          <w:p>
+            <w:r/>
+            <w:r>
+              <w:rPr>
+                <w:b w:val="0"/>
+                <w:sz w:val="18"/>
+              </w:rPr>
               <w:t>RQF-17</w:t>
             </w:r>
           </w:p>
         </w:tc>
         <w:tc>
           <w:tcPr>
-            <w:tcW w:type="dxa" w:w="2310"/>
-          </w:tcPr>
-          <w:p>
-            <w:r>
+            <w:tcW w:type="dxa" w:w="1474"/>
+          </w:tcPr>
+          <w:p>
+            <w:r/>
+            <w:r>
+              <w:rPr>
+                <w:b w:val="0"/>
+                <w:sz w:val="18"/>
+              </w:rPr>
               <w:t>Gestión de Usuarios</w:t>
             </w:r>
           </w:p>
         </w:tc>
         <w:tc>
           <w:tcPr>
-            <w:tcW w:type="dxa" w:w="7230"/>
-          </w:tcPr>
-          <w:p>
-            <w:r>
-              <w:t>El sistema debe permitir recuperar la contraseña del personal mediante un código enviado al correo.</w:t>
-            </w:r>
-          </w:p>
-        </w:tc>
-        <w:tc>
-          <w:tcPr>
-            <w:tcW w:type="dxa" w:w="1701"/>
-          </w:tcPr>
-          <w:p>
-            <w:r>
-              <w:rPr>
+            <w:tcW w:type="dxa" w:w="3628"/>
+          </w:tcPr>
+          <w:p>
+            <w:r/>
+            <w:r>
+              <w:rPr>
+                <w:b w:val="0"/>
+                <w:sz w:val="18"/>
+              </w:rPr>
+              <w:t>El sistema debe permitir recuperar la contraseña del personal mediante un código enviado al correo electrónico.</w:t>
+            </w:r>
+          </w:p>
+        </w:tc>
+        <w:tc>
+          <w:tcPr>
+            <w:tcW w:type="dxa" w:w="1247"/>
+            <w:shd w:val="clear" w:color="auto" w:fill="C6EFCE"/>
+          </w:tcPr>
+          <w:p>
+            <w:pPr>
+              <w:jc w:val="center"/>
+            </w:pPr>
+            <w:r/>
+            <w:r>
+              <w:rPr>
+                <w:b/>
                 <w:sz w:val="16"/>
               </w:rPr>
               <w:t>Implementado</w:t>
@@ -5267,14 +5529,16 @@
         </w:tc>
         <w:tc>
           <w:tcPr>
-            <w:tcW w:type="dxa" w:w="4535"/>
-          </w:tcPr>
-          <w:p>
-            <w:r>
-              <w:rPr>
+            <w:tcW w:type="dxa" w:w="3345"/>
+          </w:tcPr>
+          <w:p>
+            <w:r/>
+            <w:r>
+              <w:rPr>
+                <w:b w:val="0"/>
                 <w:sz w:val="16"/>
               </w:rPr>
-              <w:t>routes/auth.js: forgot-password, verify-reset-code, reset-password por correo; lib/email.js.</w:t>
+              <w:t>routes/auth.js: forgot-password, verify-reset-code y reset-password; lib/email.js.</w:t>
             </w:r>
           </w:p>
         </w:tc>
@@ -5282,41 +5546,62 @@
       <w:tr>
         <w:tc>
           <w:tcPr>
-            <w:tcW w:type="dxa" w:w="1080"/>
-          </w:tcPr>
-          <w:p>
-            <w:r>
+            <w:tcW w:type="dxa" w:w="964"/>
+          </w:tcPr>
+          <w:p>
+            <w:r/>
+            <w:r>
+              <w:rPr>
+                <w:b w:val="0"/>
+                <w:sz w:val="18"/>
+              </w:rPr>
               <w:t>RQF-18</w:t>
             </w:r>
           </w:p>
         </w:tc>
         <w:tc>
           <w:tcPr>
-            <w:tcW w:type="dxa" w:w="2310"/>
-          </w:tcPr>
-          <w:p>
-            <w:r>
+            <w:tcW w:type="dxa" w:w="1474"/>
+          </w:tcPr>
+          <w:p>
+            <w:r/>
+            <w:r>
+              <w:rPr>
+                <w:b w:val="0"/>
+                <w:sz w:val="18"/>
+              </w:rPr>
               <w:t>Dashboard</w:t>
             </w:r>
           </w:p>
         </w:tc>
         <w:tc>
           <w:tcPr>
-            <w:tcW w:type="dxa" w:w="7230"/>
-          </w:tcPr>
-          <w:p>
-            <w:r>
+            <w:tcW w:type="dxa" w:w="3628"/>
+          </w:tcPr>
+          <w:p>
+            <w:r/>
+            <w:r>
+              <w:rPr>
+                <w:b w:val="0"/>
+                <w:sz w:val="18"/>
+              </w:rPr>
               <w:t>El sistema debe permitir exportar a CSV el listado de miembros activos con su membresía.</w:t>
             </w:r>
           </w:p>
         </w:tc>
         <w:tc>
           <w:tcPr>
-            <w:tcW w:type="dxa" w:w="1701"/>
-          </w:tcPr>
-          <w:p>
-            <w:r>
-              <w:rPr>
+            <w:tcW w:type="dxa" w:w="1247"/>
+            <w:shd w:val="clear" w:color="auto" w:fill="C6EFCE"/>
+          </w:tcPr>
+          <w:p>
+            <w:pPr>
+              <w:jc w:val="center"/>
+            </w:pPr>
+            <w:r/>
+            <w:r>
+              <w:rPr>
+                <w:b/>
                 <w:sz w:val="16"/>
               </w:rPr>
               <w:t>Implementado</w:t>
@@ -5325,14 +5610,16 @@
         </w:tc>
         <w:tc>
           <w:tcPr>
-            <w:tcW w:type="dxa" w:w="4535"/>
-          </w:tcPr>
-          <w:p>
-            <w:r>
-              <w:rPr>
+            <w:tcW w:type="dxa" w:w="3345"/>
+          </w:tcPr>
+          <w:p>
+            <w:r/>
+            <w:r>
+              <w:rPr>
+                <w:b w:val="0"/>
                 <w:sz w:val="16"/>
               </w:rPr>
-              <w:t>routes/dashboard.js GET /dashboard/export: descarga CSV de miembros activos y membresía.</w:t>
+              <w:t>routes/dashboard.js GET /admin/dashboard/export: descarga CSV de miembros y membresía.</w:t>
             </w:r>
           </w:p>
         </w:tc>
@@ -5340,41 +5627,62 @@
       <w:tr>
         <w:tc>
           <w:tcPr>
-            <w:tcW w:type="dxa" w:w="1080"/>
-          </w:tcPr>
-          <w:p>
-            <w:r>
+            <w:tcW w:type="dxa" w:w="964"/>
+          </w:tcPr>
+          <w:p>
+            <w:r/>
+            <w:r>
+              <w:rPr>
+                <w:b w:val="0"/>
+                <w:sz w:val="18"/>
+              </w:rPr>
               <w:t>RQF-19</w:t>
             </w:r>
           </w:p>
         </w:tc>
         <w:tc>
           <w:tcPr>
-            <w:tcW w:type="dxa" w:w="2310"/>
-          </w:tcPr>
-          <w:p>
-            <w:r>
+            <w:tcW w:type="dxa" w:w="1474"/>
+          </w:tcPr>
+          <w:p>
+            <w:r/>
+            <w:r>
+              <w:rPr>
+                <w:b w:val="0"/>
+                <w:sz w:val="18"/>
+              </w:rPr>
               <w:t>Gestión de Usuarios</w:t>
             </w:r>
           </w:p>
         </w:tc>
         <w:tc>
           <w:tcPr>
-            <w:tcW w:type="dxa" w:w="7230"/>
-          </w:tcPr>
-          <w:p>
-            <w:r>
+            <w:tcW w:type="dxa" w:w="3628"/>
+          </w:tcPr>
+          <w:p>
+            <w:r/>
+            <w:r>
+              <w:rPr>
+                <w:b w:val="0"/>
+                <w:sz w:val="18"/>
+              </w:rPr>
               <w:t>El sistema debe permitir registrar un gimnasio junto con la cuenta de su propietario.</w:t>
             </w:r>
           </w:p>
         </w:tc>
         <w:tc>
           <w:tcPr>
-            <w:tcW w:type="dxa" w:w="1701"/>
-          </w:tcPr>
-          <w:p>
-            <w:r>
-              <w:rPr>
+            <w:tcW w:type="dxa" w:w="1247"/>
+            <w:shd w:val="clear" w:color="auto" w:fill="C6EFCE"/>
+          </w:tcPr>
+          <w:p>
+            <w:pPr>
+              <w:jc w:val="center"/>
+            </w:pPr>
+            <w:r/>
+            <w:r>
+              <w:rPr>
+                <w:b/>
                 <w:sz w:val="16"/>
               </w:rPr>
               <w:t>Implementado</w:t>
@@ -5383,14 +5691,16 @@
         </w:tc>
         <w:tc>
           <w:tcPr>
-            <w:tcW w:type="dxa" w:w="4535"/>
-          </w:tcPr>
-          <w:p>
-            <w:r>
-              <w:rPr>
+            <w:tcW w:type="dxa" w:w="3345"/>
+          </w:tcPr>
+          <w:p>
+            <w:r/>
+            <w:r>
+              <w:rPr>
+                <w:b w:val="0"/>
                 <w:sz w:val="16"/>
               </w:rPr>
-              <w:t>routes/auth.js POST /signup y RegisterOwnerPage.jsx: registro del gimnasio y de la cuenta del propietario.</w:t>
+              <w:t>routes/auth.js POST /signup y RegisterOwnerPage.jsx.</w:t>
             </w:r>
           </w:p>
         </w:tc>
@@ -5398,41 +5708,62 @@
       <w:tr>
         <w:tc>
           <w:tcPr>
-            <w:tcW w:type="dxa" w:w="1080"/>
-          </w:tcPr>
-          <w:p>
-            <w:r>
+            <w:tcW w:type="dxa" w:w="964"/>
+          </w:tcPr>
+          <w:p>
+            <w:r/>
+            <w:r>
+              <w:rPr>
+                <w:b w:val="0"/>
+                <w:sz w:val="18"/>
+              </w:rPr>
               <w:t>RQF-20</w:t>
             </w:r>
           </w:p>
         </w:tc>
         <w:tc>
           <w:tcPr>
-            <w:tcW w:type="dxa" w:w="2310"/>
-          </w:tcPr>
-          <w:p>
-            <w:r>
+            <w:tcW w:type="dxa" w:w="1474"/>
+          </w:tcPr>
+          <w:p>
+            <w:r/>
+            <w:r>
+              <w:rPr>
+                <w:b w:val="0"/>
+                <w:sz w:val="18"/>
+              </w:rPr>
               <w:t>Configuración</w:t>
             </w:r>
           </w:p>
         </w:tc>
         <w:tc>
           <w:tcPr>
-            <w:tcW w:type="dxa" w:w="7230"/>
-          </w:tcPr>
-          <w:p>
-            <w:r>
+            <w:tcW w:type="dxa" w:w="3628"/>
+          </w:tcPr>
+          <w:p>
+            <w:r/>
+            <w:r>
+              <w:rPr>
+                <w:b w:val="0"/>
+                <w:sz w:val="18"/>
+              </w:rPr>
               <w:t>El sistema debe permitir configurar por gimnasio los planes, precios y recordatorios de cobro.</w:t>
             </w:r>
           </w:p>
         </w:tc>
         <w:tc>
           <w:tcPr>
-            <w:tcW w:type="dxa" w:w="1701"/>
-          </w:tcPr>
-          <w:p>
-            <w:r>
-              <w:rPr>
+            <w:tcW w:type="dxa" w:w="1247"/>
+            <w:shd w:val="clear" w:color="auto" w:fill="C6EFCE"/>
+          </w:tcPr>
+          <w:p>
+            <w:pPr>
+              <w:jc w:val="center"/>
+            </w:pPr>
+            <w:r/>
+            <w:r>
+              <w:rPr>
+                <w:b/>
                 <w:sz w:val="16"/>
               </w:rPr>
               <w:t>Implementado</w:t>
@@ -5441,14 +5772,16 @@
         </w:tc>
         <w:tc>
           <w:tcPr>
-            <w:tcW w:type="dxa" w:w="4535"/>
-          </w:tcPr>
-          <w:p>
-            <w:r>
-              <w:rPr>
+            <w:tcW w:type="dxa" w:w="3345"/>
+          </w:tcPr>
+          <w:p>
+            <w:r/>
+            <w:r>
+              <w:rPr>
+                <w:b w:val="0"/>
                 <w:sz w:val="16"/>
               </w:rPr>
-              <w:t>routes/config.js (GET/PUT /admin/config), ConfigPage.jsx y tabla config_gimnasio: planes, precios y recordatorios.</w:t>
+              <w:t>routes/config.js, ConfigPage.jsx y tabla config_gimnasio.</w:t>
             </w:r>
           </w:p>
         </w:tc>
@@ -5456,41 +5789,62 @@
       <w:tr>
         <w:tc>
           <w:tcPr>
-            <w:tcW w:type="dxa" w:w="1080"/>
-          </w:tcPr>
-          <w:p>
-            <w:r>
+            <w:tcW w:type="dxa" w:w="964"/>
+          </w:tcPr>
+          <w:p>
+            <w:r/>
+            <w:r>
+              <w:rPr>
+                <w:b w:val="0"/>
+                <w:sz w:val="18"/>
+              </w:rPr>
               <w:t>RQF-21</w:t>
             </w:r>
           </w:p>
         </w:tc>
         <w:tc>
           <w:tcPr>
-            <w:tcW w:type="dxa" w:w="2310"/>
-          </w:tcPr>
-          <w:p>
-            <w:r>
+            <w:tcW w:type="dxa" w:w="1474"/>
+          </w:tcPr>
+          <w:p>
+            <w:r/>
+            <w:r>
+              <w:rPr>
+                <w:b w:val="0"/>
+                <w:sz w:val="18"/>
+              </w:rPr>
               <w:t>Gestión de Miembros</w:t>
             </w:r>
           </w:p>
         </w:tc>
         <w:tc>
           <w:tcPr>
-            <w:tcW w:type="dxa" w:w="7230"/>
-          </w:tcPr>
-          <w:p>
-            <w:r>
+            <w:tcW w:type="dxa" w:w="3628"/>
+          </w:tcPr>
+          <w:p>
+            <w:r/>
+            <w:r>
+              <w:rPr>
+                <w:b w:val="0"/>
+                <w:sz w:val="18"/>
+              </w:rPr>
               <w:t>El sistema debe registrar por miembro el plan contratado, su vigencia, el valor total y pagado, el método y el estado del pago.</w:t>
             </w:r>
           </w:p>
         </w:tc>
         <w:tc>
           <w:tcPr>
-            <w:tcW w:type="dxa" w:w="1701"/>
-          </w:tcPr>
-          <w:p>
-            <w:r>
-              <w:rPr>
+            <w:tcW w:type="dxa" w:w="1247"/>
+            <w:shd w:val="clear" w:color="auto" w:fill="C6EFCE"/>
+          </w:tcPr>
+          <w:p>
+            <w:pPr>
+              <w:jc w:val="center"/>
+            </w:pPr>
+            <w:r/>
+            <w:r>
+              <w:rPr>
+                <w:b/>
                 <w:sz w:val="16"/>
               </w:rPr>
               <w:t>Implementado</w:t>
@@ -5499,14 +5853,16 @@
         </w:tc>
         <w:tc>
           <w:tcPr>
-            <w:tcW w:type="dxa" w:w="4535"/>
-          </w:tcPr>
-          <w:p>
-            <w:r>
-              <w:rPr>
+            <w:tcW w:type="dxa" w:w="3345"/>
+          </w:tcPr>
+          <w:p>
+            <w:r/>
+            <w:r>
+              <w:rPr>
+                <w:b w:val="0"/>
                 <w:sz w:val="16"/>
               </w:rPr>
-              <w:t>Tabla plan_cobro (migración 004): tipo de plan, vigencia, valor total y pagado, método y estado de pago por miembro.</w:t>
+              <w:t>Tabla plan_cobro (migración 004): plan, vigencia, valores, método y estado de pago.</w:t>
             </w:r>
           </w:p>
         </w:tc>
@@ -5514,41 +5870,62 @@
       <w:tr>
         <w:tc>
           <w:tcPr>
-            <w:tcW w:type="dxa" w:w="1080"/>
-          </w:tcPr>
-          <w:p>
-            <w:r>
+            <w:tcW w:type="dxa" w:w="964"/>
+          </w:tcPr>
+          <w:p>
+            <w:r/>
+            <w:r>
+              <w:rPr>
+                <w:b w:val="0"/>
+                <w:sz w:val="18"/>
+              </w:rPr>
               <w:t>RQF-22</w:t>
             </w:r>
           </w:p>
         </w:tc>
         <w:tc>
           <w:tcPr>
-            <w:tcW w:type="dxa" w:w="2310"/>
-          </w:tcPr>
-          <w:p>
-            <w:r>
+            <w:tcW w:type="dxa" w:w="1474"/>
+          </w:tcPr>
+          <w:p>
+            <w:r/>
+            <w:r>
+              <w:rPr>
+                <w:b w:val="0"/>
+                <w:sz w:val="18"/>
+              </w:rPr>
               <w:t>Cumplimiento</w:t>
             </w:r>
           </w:p>
         </w:tc>
         <w:tc>
           <w:tcPr>
-            <w:tcW w:type="dxa" w:w="7230"/>
-          </w:tcPr>
-          <w:p>
-            <w:r>
+            <w:tcW w:type="dxa" w:w="3628"/>
+          </w:tcPr>
+          <w:p>
+            <w:r/>
+            <w:r>
+              <w:rPr>
+                <w:b w:val="0"/>
+                <w:sz w:val="18"/>
+              </w:rPr>
               <w:t>El sistema debe permitir al propietario eliminar su cuenta y los datos asociados del gimnasio.</w:t>
             </w:r>
           </w:p>
         </w:tc>
         <w:tc>
           <w:tcPr>
-            <w:tcW w:type="dxa" w:w="1701"/>
-          </w:tcPr>
-          <w:p>
-            <w:r>
-              <w:rPr>
+            <w:tcW w:type="dxa" w:w="1247"/>
+            <w:shd w:val="clear" w:color="auto" w:fill="C6EFCE"/>
+          </w:tcPr>
+          <w:p>
+            <w:pPr>
+              <w:jc w:val="center"/>
+            </w:pPr>
+            <w:r/>
+            <w:r>
+              <w:rPr>
+                <w:b/>
                 <w:sz w:val="16"/>
               </w:rPr>
               <w:t>Implementado</w:t>
@@ -5557,14 +5934,16 @@
         </w:tc>
         <w:tc>
           <w:tcPr>
-            <w:tcW w:type="dxa" w:w="4535"/>
-          </w:tcPr>
-          <w:p>
-            <w:r>
-              <w:rPr>
+            <w:tcW w:type="dxa" w:w="3345"/>
+          </w:tcPr>
+          <w:p>
+            <w:r/>
+            <w:r>
+              <w:rPr>
+                <w:b w:val="0"/>
                 <w:sz w:val="16"/>
               </w:rPr>
-              <w:t>routes/auth.js DELETE /auth/account y EliminarCuentaPage.jsx: elimina cuenta y datos del gimnasio.</w:t>
+              <w:t>routes/auth.js DELETE /auth/account y EliminarCuentaPage.jsx.</w:t>
             </w:r>
           </w:p>
         </w:tc>
@@ -5572,41 +5951,62 @@
       <w:tr>
         <w:tc>
           <w:tcPr>
-            <w:tcW w:type="dxa" w:w="1080"/>
-          </w:tcPr>
-          <w:p>
-            <w:r>
+            <w:tcW w:type="dxa" w:w="964"/>
+          </w:tcPr>
+          <w:p>
+            <w:r/>
+            <w:r>
+              <w:rPr>
+                <w:b w:val="0"/>
+                <w:sz w:val="18"/>
+              </w:rPr>
               <w:t>RQF-23</w:t>
             </w:r>
           </w:p>
         </w:tc>
         <w:tc>
           <w:tcPr>
-            <w:tcW w:type="dxa" w:w="2310"/>
-          </w:tcPr>
-          <w:p>
-            <w:r>
+            <w:tcW w:type="dxa" w:w="1474"/>
+          </w:tcPr>
+          <w:p>
+            <w:r/>
+            <w:r>
+              <w:rPr>
+                <w:b w:val="0"/>
+                <w:sz w:val="18"/>
+              </w:rPr>
               <w:t>Dashboard</w:t>
             </w:r>
           </w:p>
         </w:tc>
         <w:tc>
           <w:tcPr>
-            <w:tcW w:type="dxa" w:w="7230"/>
-          </w:tcPr>
-          <w:p>
-            <w:r>
-              <w:t>El sistema debe mostrar al administrador avisos accionables (vencimientos, riesgo de abandono) en un centro de notificaciones.</w:t>
-            </w:r>
-          </w:p>
-        </w:tc>
-        <w:tc>
-          <w:tcPr>
-            <w:tcW w:type="dxa" w:w="1701"/>
-          </w:tcPr>
-          <w:p>
-            <w:r>
-              <w:rPr>
+            <w:tcW w:type="dxa" w:w="3628"/>
+          </w:tcPr>
+          <w:p>
+            <w:r/>
+            <w:r>
+              <w:rPr>
+                <w:b w:val="0"/>
+                <w:sz w:val="18"/>
+              </w:rPr>
+              <w:t>El sistema debe mostrar al administrador avisos accionables (vencimientos y riesgo de abandono) en un centro de notificaciones.</w:t>
+            </w:r>
+          </w:p>
+        </w:tc>
+        <w:tc>
+          <w:tcPr>
+            <w:tcW w:type="dxa" w:w="1247"/>
+            <w:shd w:val="clear" w:color="auto" w:fill="C6EFCE"/>
+          </w:tcPr>
+          <w:p>
+            <w:pPr>
+              <w:jc w:val="center"/>
+            </w:pPr>
+            <w:r/>
+            <w:r>
+              <w:rPr>
+                <w:b/>
                 <w:sz w:val="16"/>
               </w:rPr>
               <w:t>Implementado</w:t>
@@ -5615,14 +6015,16 @@
         </w:tc>
         <w:tc>
           <w:tcPr>
-            <w:tcW w:type="dxa" w:w="4535"/>
-          </w:tcPr>
-          <w:p>
-            <w:r>
-              <w:rPr>
+            <w:tcW w:type="dxa" w:w="3345"/>
+          </w:tcPr>
+          <w:p>
+            <w:r/>
+            <w:r>
+              <w:rPr>
+                <w:b w:val="0"/>
                 <w:sz w:val="16"/>
               </w:rPr>
-              <w:t>routes/notificaciones.js GET /admin/notificaciones: avisos accionables en la campana del encabezado.</w:t>
+              <w:t>routes/notificaciones.js GET /admin/notificaciones.</w:t>
             </w:r>
           </w:p>
         </w:tc>
@@ -5630,41 +6032,62 @@
       <w:tr>
         <w:tc>
           <w:tcPr>
-            <w:tcW w:type="dxa" w:w="1080"/>
-          </w:tcPr>
-          <w:p>
-            <w:r>
+            <w:tcW w:type="dxa" w:w="964"/>
+          </w:tcPr>
+          <w:p>
+            <w:r/>
+            <w:r>
+              <w:rPr>
+                <w:b w:val="0"/>
+                <w:sz w:val="18"/>
+              </w:rPr>
               <w:t>RQF-24</w:t>
             </w:r>
           </w:p>
         </w:tc>
         <w:tc>
           <w:tcPr>
-            <w:tcW w:type="dxa" w:w="2310"/>
-          </w:tcPr>
-          <w:p>
-            <w:r>
+            <w:tcW w:type="dxa" w:w="1474"/>
+          </w:tcPr>
+          <w:p>
+            <w:r/>
+            <w:r>
+              <w:rPr>
+                <w:b w:val="0"/>
+                <w:sz w:val="18"/>
+              </w:rPr>
               <w:t>Check-in y Asistencia</w:t>
             </w:r>
           </w:p>
         </w:tc>
         <w:tc>
           <w:tcPr>
-            <w:tcW w:type="dxa" w:w="7230"/>
-          </w:tcPr>
-          <w:p>
-            <w:r>
+            <w:tcW w:type="dxa" w:w="3628"/>
+          </w:tcPr>
+          <w:p>
+            <w:r/>
+            <w:r>
+              <w:rPr>
+                <w:b w:val="0"/>
+                <w:sz w:val="18"/>
+              </w:rPr>
               <w:t>El sistema debe listar los check-ins del gimnasio con un resumen de asistencia.</w:t>
             </w:r>
           </w:p>
         </w:tc>
         <w:tc>
           <w:tcPr>
-            <w:tcW w:type="dxa" w:w="1701"/>
-          </w:tcPr>
-          <w:p>
-            <w:r>
-              <w:rPr>
+            <w:tcW w:type="dxa" w:w="1247"/>
+            <w:shd w:val="clear" w:color="auto" w:fill="C6EFCE"/>
+          </w:tcPr>
+          <w:p>
+            <w:pPr>
+              <w:jc w:val="center"/>
+            </w:pPr>
+            <w:r/>
+            <w:r>
+              <w:rPr>
+                <w:b/>
                 <w:sz w:val="16"/>
               </w:rPr>
               <w:t>Implementado</w:t>
@@ -5673,14 +6096,16 @@
         </w:tc>
         <w:tc>
           <w:tcPr>
-            <w:tcW w:type="dxa" w:w="4535"/>
-          </w:tcPr>
-          <w:p>
-            <w:r>
-              <w:rPr>
+            <w:tcW w:type="dxa" w:w="3345"/>
+          </w:tcPr>
+          <w:p>
+            <w:r/>
+            <w:r>
+              <w:rPr>
+                <w:b w:val="0"/>
                 <w:sz w:val="16"/>
               </w:rPr>
-              <w:t>routes/asistencia.js GET /api/asistencia: listado de check-ins con resumen.</w:t>
+              <w:t>routes/asistencia.js GET /api/asistencia.</w:t>
             </w:r>
           </w:p>
         </w:tc>
@@ -5688,41 +6113,62 @@
       <w:tr>
         <w:tc>
           <w:tcPr>
-            <w:tcW w:type="dxa" w:w="1080"/>
-          </w:tcPr>
-          <w:p>
-            <w:r>
+            <w:tcW w:type="dxa" w:w="964"/>
+          </w:tcPr>
+          <w:p>
+            <w:r/>
+            <w:r>
+              <w:rPr>
+                <w:b w:val="0"/>
+                <w:sz w:val="18"/>
+              </w:rPr>
               <w:t>RQF-25</w:t>
             </w:r>
           </w:p>
         </w:tc>
         <w:tc>
           <w:tcPr>
-            <w:tcW w:type="dxa" w:w="2310"/>
-          </w:tcPr>
-          <w:p>
-            <w:r>
+            <w:tcW w:type="dxa" w:w="1474"/>
+          </w:tcPr>
+          <w:p>
+            <w:r/>
+            <w:r>
+              <w:rPr>
+                <w:b w:val="0"/>
+                <w:sz w:val="18"/>
+              </w:rPr>
               <w:t>Gestión de Miembros</w:t>
             </w:r>
           </w:p>
         </w:tc>
         <w:tc>
           <w:tcPr>
-            <w:tcW w:type="dxa" w:w="7230"/>
-          </w:tcPr>
-          <w:p>
-            <w:r>
+            <w:tcW w:type="dxa" w:w="3628"/>
+          </w:tcPr>
+          <w:p>
+            <w:r/>
+            <w:r>
+              <w:rPr>
+                <w:b w:val="0"/>
+                <w:sz w:val="18"/>
+              </w:rPr>
               <w:t>El sistema debe ofrecer una vista de los miembros activos del gimnasio.</w:t>
             </w:r>
           </w:p>
         </w:tc>
         <w:tc>
           <w:tcPr>
-            <w:tcW w:type="dxa" w:w="1701"/>
-          </w:tcPr>
-          <w:p>
-            <w:r>
-              <w:rPr>
+            <w:tcW w:type="dxa" w:w="1247"/>
+            <w:shd w:val="clear" w:color="auto" w:fill="C6EFCE"/>
+          </w:tcPr>
+          <w:p>
+            <w:pPr>
+              <w:jc w:val="center"/>
+            </w:pPr>
+            <w:r/>
+            <w:r>
+              <w:rPr>
+                <w:b/>
                 <w:sz w:val="16"/>
               </w:rPr>
               <w:t>Implementado</w:t>
@@ -5731,14 +6177,16 @@
         </w:tc>
         <w:tc>
           <w:tcPr>
-            <w:tcW w:type="dxa" w:w="4535"/>
-          </w:tcPr>
-          <w:p>
-            <w:r>
-              <w:rPr>
+            <w:tcW w:type="dxa" w:w="3345"/>
+          </w:tcPr>
+          <w:p>
+            <w:r/>
+            <w:r>
+              <w:rPr>
+                <w:b w:val="0"/>
                 <w:sz w:val="16"/>
               </w:rPr>
-              <w:t>routes/vista.js GET /api/vista/miembros-activos: vista de miembros activos.</w:t>
+              <w:t>routes/vista.js GET /api/vista/miembros-activos.</w:t>
             </w:r>
           </w:p>
         </w:tc>
@@ -5746,41 +6194,62 @@
       <w:tr>
         <w:tc>
           <w:tcPr>
-            <w:tcW w:type="dxa" w:w="1080"/>
-          </w:tcPr>
-          <w:p>
-            <w:r>
+            <w:tcW w:type="dxa" w:w="964"/>
+          </w:tcPr>
+          <w:p>
+            <w:r/>
+            <w:r>
+              <w:rPr>
+                <w:b w:val="0"/>
+                <w:sz w:val="18"/>
+              </w:rPr>
               <w:t>RQF-26</w:t>
             </w:r>
           </w:p>
         </w:tc>
         <w:tc>
           <w:tcPr>
-            <w:tcW w:type="dxa" w:w="2310"/>
-          </w:tcPr>
-          <w:p>
-            <w:r>
+            <w:tcW w:type="dxa" w:w="1474"/>
+          </w:tcPr>
+          <w:p>
+            <w:r/>
+            <w:r>
+              <w:rPr>
+                <w:b w:val="0"/>
+                <w:sz w:val="18"/>
+              </w:rPr>
               <w:t>App del miembro</w:t>
             </w:r>
           </w:p>
         </w:tc>
         <w:tc>
           <w:tcPr>
-            <w:tcW w:type="dxa" w:w="7230"/>
-          </w:tcPr>
-          <w:p>
-            <w:r>
-              <w:t>El sistema debe permitir al miembro editar sus datos de perfil desde la app móvil.</w:t>
-            </w:r>
-          </w:p>
-        </w:tc>
-        <w:tc>
-          <w:tcPr>
-            <w:tcW w:type="dxa" w:w="1701"/>
-          </w:tcPr>
-          <w:p>
-            <w:r>
-              <w:rPr>
+            <w:tcW w:type="dxa" w:w="3628"/>
+          </w:tcPr>
+          <w:p>
+            <w:r/>
+            <w:r>
+              <w:rPr>
+                <w:b w:val="0"/>
+                <w:sz w:val="18"/>
+              </w:rPr>
+              <w:t>El sistema debe permitir al miembro editar sus datos de perfil desde la aplicación móvil.</w:t>
+            </w:r>
+          </w:p>
+        </w:tc>
+        <w:tc>
+          <w:tcPr>
+            <w:tcW w:type="dxa" w:w="1247"/>
+            <w:shd w:val="clear" w:color="auto" w:fill="C6EFCE"/>
+          </w:tcPr>
+          <w:p>
+            <w:pPr>
+              <w:jc w:val="center"/>
+            </w:pPr>
+            <w:r/>
+            <w:r>
+              <w:rPr>
+                <w:b/>
                 <w:sz w:val="16"/>
               </w:rPr>
               <w:t>Implementado</w:t>
@@ -5789,19 +6258,30 @@
         </w:tc>
         <w:tc>
           <w:tcPr>
-            <w:tcW w:type="dxa" w:w="4535"/>
-          </w:tcPr>
-          <w:p>
-            <w:r>
-              <w:rPr>
+            <w:tcW w:type="dxa" w:w="3345"/>
+          </w:tcPr>
+          <w:p>
+            <w:r/>
+            <w:r>
+              <w:rPr>
+                <w:b w:val="0"/>
                 <w:sz w:val="16"/>
               </w:rPr>
-              <w:t>routes/cliente.js PUT /api/cliente/me: el miembro edita su perfil desde la app.</w:t>
+              <w:t>routes/cliente.js PUT /api/cliente/me.</w:t>
             </w:r>
           </w:p>
         </w:tc>
       </w:tr>
     </w:tbl>
+    <w:p>
+      <w:r>
+        <w:rPr>
+          <w:i/>
+          <w:sz w:val="18"/>
+        </w:rPr>
+        <w:t>Estado de implementación de los requisitos funcionales: 19 de 26 implementados, 6 parciales y 1 pendientes (avance 84.6 %).</w:t>
+      </w:r>
+    </w:p>
     <w:p>
       <w:pPr>
         <w:spacing w:line="480" w:lineRule="auto"/>
@@ -5857,7 +6337,6 @@
     <w:tbl>
       <w:tblPr>
         <w:tblStyle w:val="Table2"/>
-        <w:tblW w:w="10631.511811023622" w:type="dxa"/>
         <w:jc w:val="left"/>
         <w:tblBorders>
           <w:top w:color="000000" w:space="0" w:sz="0" w:val="nil"/>
@@ -5869,13 +6348,14 @@
         </w:tblBorders>
         <w:tblLayout w:type="fixed"/>
         <w:tblLook w:val="0600"/>
+        <w:tblW w:w="10659" w:type="dxa"/>
       </w:tblPr>
       <w:tblGrid>
-        <w:gridCol w:w="1274"/>
-        <w:gridCol w:w="2144"/>
-        <w:gridCol w:w="7212"/>
-        <w:gridCol w:w="1701"/>
-        <w:gridCol w:w="4535"/>
+        <w:gridCol w:w="1020"/>
+        <w:gridCol w:w="1474"/>
+        <w:gridCol w:w="3572"/>
+        <w:gridCol w:w="1247"/>
+        <w:gridCol w:w="3345"/>
         <w:tblGridChange w:id="0">
           <w:tblGrid>
             <w:gridCol w:w="1274.5818109125642"/>
@@ -5892,6 +6372,7 @@
         </w:trPr>
         <w:tc>
           <w:tcPr>
+            <w:tcW w:type="dxa" w:w="1020"/>
             <w:tcBorders>
               <w:top w:color="aaaaaa" w:space="0" w:sz="5" w:val="single"/>
               <w:left w:color="aaaaaa" w:space="0" w:sz="5" w:val="single"/>
@@ -5936,6 +6417,7 @@
         </w:tc>
         <w:tc>
           <w:tcPr>
+            <w:tcW w:type="dxa" w:w="1474"/>
             <w:tcBorders>
               <w:top w:color="aaaaaa" w:space="0" w:sz="5" w:val="single"/>
               <w:left w:color="000000" w:space="0" w:sz="0" w:val="nil"/>
@@ -5980,6 +6462,7 @@
         </w:tc>
         <w:tc>
           <w:tcPr>
+            <w:tcW w:type="dxa" w:w="3572"/>
             <w:tcBorders>
               <w:top w:color="aaaaaa" w:space="0" w:sz="5" w:val="single"/>
               <w:left w:color="000000" w:space="0" w:sz="0" w:val="nil"/>
@@ -6024,12 +6507,19 @@
         </w:tc>
         <w:tc>
           <w:tcPr>
-            <w:tcW w:type="dxa" w:w="1701"/>
-          </w:tcPr>
-          <w:p>
-            <w:r>
-              <w:rPr>
-                <w:sz w:val="16"/>
+            <w:tcW w:type="dxa" w:w="1247"/>
+            <w:shd w:val="clear" w:color="auto" w:fill="39a900"/>
+          </w:tcPr>
+          <w:p>
+            <w:pPr>
+              <w:jc w:val="center"/>
+            </w:pPr>
+            <w:r/>
+            <w:r>
+              <w:rPr>
+                <w:b/>
+                <w:color w:val="FFFFFF"/>
+                <w:sz w:val="18"/>
               </w:rPr>
               <w:t>Estado</w:t>
             </w:r>
@@ -6037,12 +6527,19 @@
         </w:tc>
         <w:tc>
           <w:tcPr>
-            <w:tcW w:type="dxa" w:w="4535"/>
-          </w:tcPr>
-          <w:p>
-            <w:r>
-              <w:rPr>
-                <w:sz w:val="16"/>
+            <w:tcW w:type="dxa" w:w="3345"/>
+            <w:shd w:val="clear" w:color="auto" w:fill="39a900"/>
+          </w:tcPr>
+          <w:p>
+            <w:pPr>
+              <w:jc w:val="center"/>
+            </w:pPr>
+            <w:r/>
+            <w:r>
+              <w:rPr>
+                <w:b/>
+                <w:color w:val="FFFFFF"/>
+                <w:sz w:val="18"/>
               </w:rPr>
               <w:t>Evidencia</w:t>
             </w:r>
@@ -6057,6 +6554,7 @@
         </w:trPr>
         <w:tc>
           <w:tcPr>
+            <w:tcW w:type="dxa" w:w="1020"/>
             <w:tcBorders>
               <w:top w:color="000000" w:space="0" w:sz="0" w:val="nil"/>
               <w:left w:color="aaaaaa" w:space="0" w:sz="5" w:val="single"/>
@@ -6094,6 +6592,7 @@
         </w:tc>
         <w:tc>
           <w:tcPr>
+            <w:tcW w:type="dxa" w:w="1474"/>
             <w:tcBorders>
               <w:top w:color="000000" w:space="0" w:sz="0" w:val="nil"/>
               <w:left w:color="000000" w:space="0" w:sz="0" w:val="nil"/>
@@ -6131,6 +6630,7 @@
         </w:tc>
         <w:tc>
           <w:tcPr>
+            <w:tcW w:type="dxa" w:w="3572"/>
             <w:tcBorders>
               <w:top w:color="000000" w:space="0" w:sz="0" w:val="nil"/>
               <w:left w:color="000000" w:space="0" w:sz="0" w:val="nil"/>
@@ -6168,27 +6668,35 @@
         </w:tc>
         <w:tc>
           <w:tcPr>
-            <w:tcW w:type="dxa" w:w="1701"/>
-          </w:tcPr>
-          <w:p>
-            <w:r>
-              <w:rPr>
+            <w:tcW w:type="dxa" w:w="1247"/>
+            <w:shd w:val="clear" w:color="auto" w:fill="F8CBAD"/>
+          </w:tcPr>
+          <w:p>
+            <w:pPr>
+              <w:jc w:val="center"/>
+            </w:pPr>
+            <w:r/>
+            <w:r>
+              <w:rPr>
+                <w:b/>
                 <w:sz w:val="16"/>
               </w:rPr>
-              <w:t>No implementado</w:t>
-            </w:r>
-          </w:p>
-        </w:tc>
-        <w:tc>
-          <w:tcPr>
-            <w:tcW w:type="dxa" w:w="4535"/>
-          </w:tcPr>
-          <w:p>
-            <w:r>
-              <w:rPr>
+              <w:t>Pendiente</w:t>
+            </w:r>
+          </w:p>
+        </w:tc>
+        <w:tc>
+          <w:tcPr>
+            <w:tcW w:type="dxa" w:w="3345"/>
+          </w:tcPr>
+          <w:p>
+            <w:r/>
+            <w:r>
+              <w:rPr>
+                <w:b w:val="0"/>
                 <w:sz w:val="16"/>
               </w:rPr>
-              <w:t>Sin medición documentada del tiempo de check-in.</w:t>
+              <w:t>Pendiente: Medir y documentar el tiempo de respuesta del check-in.</w:t>
             </w:r>
           </w:p>
         </w:tc>
@@ -6201,6 +6709,7 @@
         </w:trPr>
         <w:tc>
           <w:tcPr>
+            <w:tcW w:type="dxa" w:w="1020"/>
             <w:tcBorders>
               <w:top w:color="000000" w:space="0" w:sz="0" w:val="nil"/>
               <w:left w:color="aaaaaa" w:space="0" w:sz="5" w:val="single"/>
@@ -6239,6 +6748,7 @@
         </w:tc>
         <w:tc>
           <w:tcPr>
+            <w:tcW w:type="dxa" w:w="1474"/>
             <w:tcBorders>
               <w:top w:color="000000" w:space="0" w:sz="0" w:val="nil"/>
               <w:left w:color="000000" w:space="0" w:sz="0" w:val="nil"/>
@@ -6277,6 +6787,7 @@
         </w:tc>
         <w:tc>
           <w:tcPr>
+            <w:tcW w:type="dxa" w:w="3572"/>
             <w:tcBorders>
               <w:top w:color="000000" w:space="0" w:sz="0" w:val="nil"/>
               <w:left w:color="000000" w:space="0" w:sz="0" w:val="nil"/>
@@ -6315,27 +6826,35 @@
         </w:tc>
         <w:tc>
           <w:tcPr>
-            <w:tcW w:type="dxa" w:w="1701"/>
-          </w:tcPr>
-          <w:p>
-            <w:r>
-              <w:rPr>
+            <w:tcW w:type="dxa" w:w="1247"/>
+            <w:shd w:val="clear" w:color="auto" w:fill="F8CBAD"/>
+          </w:tcPr>
+          <w:p>
+            <w:pPr>
+              <w:jc w:val="center"/>
+            </w:pPr>
+            <w:r/>
+            <w:r>
+              <w:rPr>
+                <w:b/>
                 <w:sz w:val="16"/>
               </w:rPr>
-              <w:t>No implementado</w:t>
-            </w:r>
-          </w:p>
-        </w:tc>
-        <w:tc>
-          <w:tcPr>
-            <w:tcW w:type="dxa" w:w="4535"/>
-          </w:tcPr>
-          <w:p>
-            <w:r>
-              <w:rPr>
+              <w:t>Pendiente</w:t>
+            </w:r>
+          </w:p>
+        </w:tc>
+        <w:tc>
+          <w:tcPr>
+            <w:tcW w:type="dxa" w:w="3345"/>
+          </w:tcPr>
+          <w:p>
+            <w:r/>
+            <w:r>
+              <w:rPr>
+                <w:b w:val="0"/>
                 <w:sz w:val="16"/>
               </w:rPr>
-              <w:t>Existe /api/healthz pero no hay monitoreo ni reporte de disponibilidad.</w:t>
+              <w:t>Endpoint de salud /api/healthz. Pendiente: Implementar monitoreo y reporte de disponibilidad.</w:t>
             </w:r>
           </w:p>
         </w:tc>
@@ -6348,6 +6867,7 @@
         </w:trPr>
         <w:tc>
           <w:tcPr>
+            <w:tcW w:type="dxa" w:w="1020"/>
             <w:tcBorders>
               <w:top w:color="000000" w:space="0" w:sz="0" w:val="nil"/>
               <w:left w:color="aaaaaa" w:space="0" w:sz="5" w:val="single"/>
@@ -6385,6 +6905,7 @@
         </w:tc>
         <w:tc>
           <w:tcPr>
+            <w:tcW w:type="dxa" w:w="1474"/>
             <w:tcBorders>
               <w:top w:color="000000" w:space="0" w:sz="0" w:val="nil"/>
               <w:left w:color="000000" w:space="0" w:sz="0" w:val="nil"/>
@@ -6422,6 +6943,7 @@
         </w:tc>
         <w:tc>
           <w:tcPr>
+            <w:tcW w:type="dxa" w:w="3572"/>
             <w:tcBorders>
               <w:top w:color="000000" w:space="0" w:sz="0" w:val="nil"/>
               <w:left w:color="000000" w:space="0" w:sz="0" w:val="nil"/>
@@ -6459,11 +6981,17 @@
         </w:tc>
         <w:tc>
           <w:tcPr>
-            <w:tcW w:type="dxa" w:w="1701"/>
-          </w:tcPr>
-          <w:p>
-            <w:r>
-              <w:rPr>
+            <w:tcW w:type="dxa" w:w="1247"/>
+            <w:shd w:val="clear" w:color="auto" w:fill="C6EFCE"/>
+          </w:tcPr>
+          <w:p>
+            <w:pPr>
+              <w:jc w:val="center"/>
+            </w:pPr>
+            <w:r/>
+            <w:r>
+              <w:rPr>
+                <w:b/>
                 <w:sz w:val="16"/>
               </w:rPr>
               <w:t>Implementado</w:t>
@@ -6472,14 +7000,16 @@
         </w:tc>
         <w:tc>
           <w:tcPr>
-            <w:tcW w:type="dxa" w:w="4535"/>
-          </w:tcPr>
-          <w:p>
-            <w:r>
-              <w:rPr>
+            <w:tcW w:type="dxa" w:w="3345"/>
+          </w:tcPr>
+          <w:p>
+            <w:r/>
+            <w:r>
+              <w:rPr>
+                <w:b w:val="0"/>
                 <w:sz w:val="16"/>
               </w:rPr>
-              <w:t>bcrypt para contraseñas; HTTPS por Render y Vercel.</w:t>
+              <w:t>Contraseñas con bcrypt; HTTPS en Render y Vercel.</w:t>
             </w:r>
           </w:p>
         </w:tc>
@@ -6492,6 +7022,7 @@
         </w:trPr>
         <w:tc>
           <w:tcPr>
+            <w:tcW w:type="dxa" w:w="1020"/>
             <w:tcBorders>
               <w:top w:color="000000" w:space="0" w:sz="0" w:val="nil"/>
               <w:left w:color="aaaaaa" w:space="0" w:sz="5" w:val="single"/>
@@ -6530,6 +7061,7 @@
         </w:tc>
         <w:tc>
           <w:tcPr>
+            <w:tcW w:type="dxa" w:w="1474"/>
             <w:tcBorders>
               <w:top w:color="000000" w:space="0" w:sz="0" w:val="nil"/>
               <w:left w:color="000000" w:space="0" w:sz="0" w:val="nil"/>
@@ -6568,6 +7100,7 @@
         </w:tc>
         <w:tc>
           <w:tcPr>
+            <w:tcW w:type="dxa" w:w="3572"/>
             <w:tcBorders>
               <w:top w:color="000000" w:space="0" w:sz="0" w:val="nil"/>
               <w:left w:color="000000" w:space="0" w:sz="0" w:val="nil"/>
@@ -6606,27 +7139,35 @@
         </w:tc>
         <w:tc>
           <w:tcPr>
-            <w:tcW w:type="dxa" w:w="1701"/>
-          </w:tcPr>
-          <w:p>
-            <w:r>
-              <w:rPr>
+            <w:tcW w:type="dxa" w:w="1247"/>
+            <w:shd w:val="clear" w:color="auto" w:fill="F8CBAD"/>
+          </w:tcPr>
+          <w:p>
+            <w:pPr>
+              <w:jc w:val="center"/>
+            </w:pPr>
+            <w:r/>
+            <w:r>
+              <w:rPr>
+                <w:b/>
                 <w:sz w:val="16"/>
               </w:rPr>
-              <w:t>No implementado</w:t>
-            </w:r>
-          </w:p>
-        </w:tc>
-        <w:tc>
-          <w:tcPr>
-            <w:tcW w:type="dxa" w:w="4535"/>
-          </w:tcPr>
-          <w:p>
-            <w:r>
-              <w:rPr>
+              <w:t>Pendiente</w:t>
+            </w:r>
+          </w:p>
+        </w:tc>
+        <w:tc>
+          <w:tcPr>
+            <w:tcW w:type="dxa" w:w="3345"/>
+          </w:tcPr>
+          <w:p>
+            <w:r/>
+            <w:r>
+              <w:rPr>
+                <w:b w:val="0"/>
                 <w:sz w:val="16"/>
               </w:rPr>
-              <w:t>Sin prueba de usabilidad del flujo manual de check-in.</w:t>
+              <w:t>Pendiente: Realizar y documentar una prueba de usabilidad del check-in manual.</w:t>
             </w:r>
           </w:p>
         </w:tc>
@@ -6639,6 +7180,7 @@
         </w:trPr>
         <w:tc>
           <w:tcPr>
+            <w:tcW w:type="dxa" w:w="1020"/>
             <w:tcBorders>
               <w:top w:color="000000" w:space="0" w:sz="0" w:val="nil"/>
               <w:left w:color="aaaaaa" w:space="0" w:sz="5" w:val="single"/>
@@ -6676,6 +7218,7 @@
         </w:tc>
         <w:tc>
           <w:tcPr>
+            <w:tcW w:type="dxa" w:w="1474"/>
             <w:tcBorders>
               <w:top w:color="000000" w:space="0" w:sz="0" w:val="nil"/>
               <w:left w:color="000000" w:space="0" w:sz="0" w:val="nil"/>
@@ -6713,6 +7256,7 @@
         </w:tc>
         <w:tc>
           <w:tcPr>
+            <w:tcW w:type="dxa" w:w="3572"/>
             <w:tcBorders>
               <w:top w:color="000000" w:space="0" w:sz="0" w:val="nil"/>
               <w:left w:color="000000" w:space="0" w:sz="0" w:val="nil"/>
@@ -6750,11 +7294,17 @@
         </w:tc>
         <w:tc>
           <w:tcPr>
-            <w:tcW w:type="dxa" w:w="1701"/>
-          </w:tcPr>
-          <w:p>
-            <w:r>
-              <w:rPr>
+            <w:tcW w:type="dxa" w:w="1247"/>
+            <w:shd w:val="clear" w:color="auto" w:fill="C6EFCE"/>
+          </w:tcPr>
+          <w:p>
+            <w:pPr>
+              <w:jc w:val="center"/>
+            </w:pPr>
+            <w:r/>
+            <w:r>
+              <w:rPr>
+                <w:b/>
                 <w:sz w:val="16"/>
               </w:rPr>
               <w:t>Implementado</w:t>
@@ -6763,14 +7313,16 @@
         </w:tc>
         <w:tc>
           <w:tcPr>
-            <w:tcW w:type="dxa" w:w="4535"/>
-          </w:tcPr>
-          <w:p>
-            <w:r>
-              <w:rPr>
+            <w:tcW w:type="dxa" w:w="3345"/>
+          </w:tcPr>
+          <w:p>
+            <w:r/>
+            <w:r>
+              <w:rPr>
+                <w:b w:val="0"/>
                 <w:sz w:val="16"/>
               </w:rPr>
-              <w:t>Multitenancy: consultas filtradas por gimnasio; alta de gimnasios por registro.</w:t>
+              <w:t>Multitenencia: consultas filtradas por gimnasio y alta de gimnasios por registro.</w:t>
             </w:r>
           </w:p>
         </w:tc>
@@ -6783,6 +7335,7 @@
         </w:trPr>
         <w:tc>
           <w:tcPr>
+            <w:tcW w:type="dxa" w:w="1020"/>
             <w:tcBorders>
               <w:top w:color="000000" w:space="0" w:sz="0" w:val="nil"/>
               <w:left w:color="aaaaaa" w:space="0" w:sz="5" w:val="single"/>
@@ -6821,6 +7374,7 @@
         </w:tc>
         <w:tc>
           <w:tcPr>
+            <w:tcW w:type="dxa" w:w="1474"/>
             <w:tcBorders>
               <w:top w:color="000000" w:space="0" w:sz="0" w:val="nil"/>
               <w:left w:color="000000" w:space="0" w:sz="0" w:val="nil"/>
@@ -6859,6 +7413,7 @@
         </w:tc>
         <w:tc>
           <w:tcPr>
+            <w:tcW w:type="dxa" w:w="3572"/>
             <w:tcBorders>
               <w:top w:color="000000" w:space="0" w:sz="0" w:val="nil"/>
               <w:left w:color="000000" w:space="0" w:sz="0" w:val="nil"/>
@@ -6897,11 +7452,17 @@
         </w:tc>
         <w:tc>
           <w:tcPr>
-            <w:tcW w:type="dxa" w:w="1701"/>
-          </w:tcPr>
-          <w:p>
-            <w:r>
-              <w:rPr>
+            <w:tcW w:type="dxa" w:w="1247"/>
+            <w:shd w:val="clear" w:color="auto" w:fill="FFEB9C"/>
+          </w:tcPr>
+          <w:p>
+            <w:pPr>
+              <w:jc w:val="center"/>
+            </w:pPr>
+            <w:r/>
+            <w:r>
+              <w:rPr>
+                <w:b/>
                 <w:sz w:val="16"/>
               </w:rPr>
               <w:t>Parcial</w:t>
@@ -6910,14 +7471,16 @@
         </w:tc>
         <w:tc>
           <w:tcPr>
-            <w:tcW w:type="dxa" w:w="4535"/>
-          </w:tcPr>
-          <w:p>
-            <w:r>
-              <w:rPr>
+            <w:tcW w:type="dxa" w:w="3345"/>
+          </w:tcPr>
+          <w:p>
+            <w:r/>
+            <w:r>
+              <w:rPr>
+                <w:b w:val="0"/>
                 <w:sz w:val="16"/>
               </w:rPr>
-              <w:t>App web React/Vite; sin pruebas multi-navegador registradas.</w:t>
+              <w:t>Aplicación web React + Vite. Pendiente: Registrar pruebas en Chrome, Firefox y Edge.</w:t>
             </w:r>
           </w:p>
         </w:tc>
@@ -6930,6 +7493,7 @@
         </w:trPr>
         <w:tc>
           <w:tcPr>
+            <w:tcW w:type="dxa" w:w="1020"/>
             <w:tcBorders>
               <w:top w:color="000000" w:space="0" w:sz="0" w:val="nil"/>
               <w:left w:color="aaaaaa" w:space="0" w:sz="5" w:val="single"/>
@@ -6967,6 +7531,7 @@
         </w:tc>
         <w:tc>
           <w:tcPr>
+            <w:tcW w:type="dxa" w:w="1474"/>
             <w:tcBorders>
               <w:top w:color="000000" w:space="0" w:sz="0" w:val="nil"/>
               <w:left w:color="000000" w:space="0" w:sz="0" w:val="nil"/>
@@ -7004,6 +7569,7 @@
         </w:tc>
         <w:tc>
           <w:tcPr>
+            <w:tcW w:type="dxa" w:w="3572"/>
             <w:tcBorders>
               <w:top w:color="000000" w:space="0" w:sz="0" w:val="nil"/>
               <w:left w:color="000000" w:space="0" w:sz="0" w:val="nil"/>
@@ -7041,11 +7607,17 @@
         </w:tc>
         <w:tc>
           <w:tcPr>
-            <w:tcW w:type="dxa" w:w="1701"/>
-          </w:tcPr>
-          <w:p>
-            <w:r>
-              <w:rPr>
+            <w:tcW w:type="dxa" w:w="1247"/>
+            <w:shd w:val="clear" w:color="auto" w:fill="FFEB9C"/>
+          </w:tcPr>
+          <w:p>
+            <w:pPr>
+              <w:jc w:val="center"/>
+            </w:pPr>
+            <w:r/>
+            <w:r>
+              <w:rPr>
+                <w:b/>
                 <w:sz w:val="16"/>
               </w:rPr>
               <w:t>Parcial</w:t>
@@ -7054,14 +7626,16 @@
         </w:tc>
         <w:tc>
           <w:tcPr>
-            <w:tcW w:type="dxa" w:w="4535"/>
-          </w:tcPr>
-          <w:p>
-            <w:r>
-              <w:rPr>
+            <w:tcW w:type="dxa" w:w="3345"/>
+          </w:tcPr>
+          <w:p>
+            <w:r/>
+            <w:r>
+              <w:rPr>
+                <w:b w:val="0"/>
                 <w:sz w:val="16"/>
               </w:rPr>
-              <w:t>Arquitectura en capas (routes/lib/jobs). Solo tests/auth-helpers.test.js (23 pruebas) y sin script test.</w:t>
+              <w:t>Arquitectura en capas (routes, lib, jobs); 23 pruebas en tests/auth-helpers.test.js. Pendiente: Agregar script de pruebas y cubrir check-in y alertas.</w:t>
             </w:r>
           </w:p>
         </w:tc>
@@ -7074,6 +7648,7 @@
         </w:trPr>
         <w:tc>
           <w:tcPr>
+            <w:tcW w:type="dxa" w:w="1020"/>
             <w:tcBorders>
               <w:top w:color="000000" w:space="0" w:sz="0" w:val="nil"/>
               <w:left w:color="aaaaaa" w:space="0" w:sz="5" w:val="single"/>
@@ -7112,6 +7687,7 @@
         </w:tc>
         <w:tc>
           <w:tcPr>
+            <w:tcW w:type="dxa" w:w="1474"/>
             <w:tcBorders>
               <w:top w:color="000000" w:space="0" w:sz="0" w:val="nil"/>
               <w:left w:color="000000" w:space="0" w:sz="0" w:val="nil"/>
@@ -7150,6 +7726,7 @@
         </w:tc>
         <w:tc>
           <w:tcPr>
+            <w:tcW w:type="dxa" w:w="3572"/>
             <w:tcBorders>
               <w:top w:color="000000" w:space="0" w:sz="0" w:val="nil"/>
               <w:left w:color="000000" w:space="0" w:sz="0" w:val="nil"/>
@@ -7188,11 +7765,17 @@
         </w:tc>
         <w:tc>
           <w:tcPr>
-            <w:tcW w:type="dxa" w:w="1701"/>
-          </w:tcPr>
-          <w:p>
-            <w:r>
-              <w:rPr>
+            <w:tcW w:type="dxa" w:w="1247"/>
+            <w:shd w:val="clear" w:color="auto" w:fill="C6EFCE"/>
+          </w:tcPr>
+          <w:p>
+            <w:pPr>
+              <w:jc w:val="center"/>
+            </w:pPr>
+            <w:r/>
+            <w:r>
+              <w:rPr>
+                <w:b/>
                 <w:sz w:val="16"/>
               </w:rPr>
               <w:t>Implementado</w:t>
@@ -7201,14 +7784,16 @@
         </w:tc>
         <w:tc>
           <w:tcPr>
-            <w:tcW w:type="dxa" w:w="4535"/>
-          </w:tcPr>
-          <w:p>
-            <w:r>
-              <w:rPr>
+            <w:tcW w:type="dxa" w:w="3345"/>
+          </w:tcPr>
+          <w:p>
+            <w:r/>
+            <w:r>
+              <w:rPr>
+                <w:b w:val="0"/>
                 <w:sz w:val="16"/>
               </w:rPr>
-              <w:t>backend/Dockerfile, frontend/Dockerfile, docker-compose.yml, render.yaml.</w:t>
+              <w:t>backend/Dockerfile, frontend/Dockerfile, docker-compose.yml y render.yaml.</w:t>
             </w:r>
           </w:p>
         </w:tc>
@@ -7216,41 +7801,62 @@
       <w:tr>
         <w:tc>
           <w:tcPr>
-            <w:tcW w:type="dxa" w:w="1274"/>
-          </w:tcPr>
-          <w:p>
-            <w:r>
+            <w:tcW w:type="dxa" w:w="1020"/>
+          </w:tcPr>
+          <w:p>
+            <w:r/>
+            <w:r>
+              <w:rPr>
+                <w:b w:val="0"/>
+                <w:sz w:val="18"/>
+              </w:rPr>
               <w:t>RQNF-09</w:t>
             </w:r>
           </w:p>
         </w:tc>
         <w:tc>
           <w:tcPr>
-            <w:tcW w:type="dxa" w:w="2144"/>
-          </w:tcPr>
-          <w:p>
-            <w:r>
+            <w:tcW w:type="dxa" w:w="1474"/>
+          </w:tcPr>
+          <w:p>
+            <w:r/>
+            <w:r>
+              <w:rPr>
+                <w:b w:val="0"/>
+                <w:sz w:val="18"/>
+              </w:rPr>
               <w:t>Seguridad</w:t>
             </w:r>
           </w:p>
         </w:tc>
         <w:tc>
           <w:tcPr>
-            <w:tcW w:type="dxa" w:w="7212"/>
-          </w:tcPr>
-          <w:p>
-            <w:r>
+            <w:tcW w:type="dxa" w:w="3572"/>
+          </w:tcPr>
+          <w:p>
+            <w:r/>
+            <w:r>
+              <w:rPr>
+                <w:b w:val="0"/>
+                <w:sz w:val="18"/>
+              </w:rPr>
               <w:t>El sistema debe limitar la tasa de intentos en los endpoints de inicio de sesión y recuperación de contraseña.</w:t>
             </w:r>
           </w:p>
         </w:tc>
         <w:tc>
           <w:tcPr>
-            <w:tcW w:type="dxa" w:w="1701"/>
-          </w:tcPr>
-          <w:p>
-            <w:r>
-              <w:rPr>
+            <w:tcW w:type="dxa" w:w="1247"/>
+            <w:shd w:val="clear" w:color="auto" w:fill="C6EFCE"/>
+          </w:tcPr>
+          <w:p>
+            <w:pPr>
+              <w:jc w:val="center"/>
+            </w:pPr>
+            <w:r/>
+            <w:r>
+              <w:rPr>
+                <w:b/>
                 <w:sz w:val="16"/>
               </w:rPr>
               <w:t>Implementado</w:t>
@@ -7259,14 +7865,16 @@
         </w:tc>
         <w:tc>
           <w:tcPr>
-            <w:tcW w:type="dxa" w:w="4535"/>
-          </w:tcPr>
-          <w:p>
-            <w:r>
-              <w:rPr>
+            <w:tcW w:type="dxa" w:w="3345"/>
+          </w:tcPr>
+          <w:p>
+            <w:r/>
+            <w:r>
+              <w:rPr>
+                <w:b w:val="0"/>
                 <w:sz w:val="16"/>
               </w:rPr>
-              <w:t>index.js: express-rate-limit en login, forgot-password y login de cliente.</w:t>
+              <w:t>index.js: express-rate-limit en inicio de sesión y recuperación de contraseña.</w:t>
             </w:r>
           </w:p>
         </w:tc>
@@ -7274,41 +7882,62 @@
       <w:tr>
         <w:tc>
           <w:tcPr>
-            <w:tcW w:type="dxa" w:w="1274"/>
-          </w:tcPr>
-          <w:p>
-            <w:r>
+            <w:tcW w:type="dxa" w:w="1020"/>
+          </w:tcPr>
+          <w:p>
+            <w:r/>
+            <w:r>
+              <w:rPr>
+                <w:b w:val="0"/>
+                <w:sz w:val="18"/>
+              </w:rPr>
               <w:t>RQNF-10</w:t>
             </w:r>
           </w:p>
         </w:tc>
         <w:tc>
           <w:tcPr>
-            <w:tcW w:type="dxa" w:w="2144"/>
-          </w:tcPr>
-          <w:p>
-            <w:r>
+            <w:tcW w:type="dxa" w:w="1474"/>
+          </w:tcPr>
+          <w:p>
+            <w:r/>
+            <w:r>
+              <w:rPr>
+                <w:b w:val="0"/>
+                <w:sz w:val="18"/>
+              </w:rPr>
               <w:t>Mantenibilidad</w:t>
             </w:r>
           </w:p>
         </w:tc>
         <w:tc>
           <w:tcPr>
-            <w:tcW w:type="dxa" w:w="7212"/>
-          </w:tcPr>
-          <w:p>
-            <w:r>
-              <w:t>El esquema de base de datos debe evolucionar mediante migraciones versionadas aplicadas automáticamente al iniciar el servicio.</w:t>
-            </w:r>
-          </w:p>
-        </w:tc>
-        <w:tc>
-          <w:tcPr>
-            <w:tcW w:type="dxa" w:w="1701"/>
-          </w:tcPr>
-          <w:p>
-            <w:r>
-              <w:rPr>
+            <w:tcW w:type="dxa" w:w="3572"/>
+          </w:tcPr>
+          <w:p>
+            <w:r/>
+            <w:r>
+              <w:rPr>
+                <w:b w:val="0"/>
+                <w:sz w:val="18"/>
+              </w:rPr>
+              <w:t>El esquema de la base de datos debe evolucionar mediante migraciones versionadas aplicadas automáticamente al iniciar el servicio.</w:t>
+            </w:r>
+          </w:p>
+        </w:tc>
+        <w:tc>
+          <w:tcPr>
+            <w:tcW w:type="dxa" w:w="1247"/>
+            <w:shd w:val="clear" w:color="auto" w:fill="C6EFCE"/>
+          </w:tcPr>
+          <w:p>
+            <w:pPr>
+              <w:jc w:val="center"/>
+            </w:pPr>
+            <w:r/>
+            <w:r>
+              <w:rPr>
+                <w:b/>
                 <w:sz w:val="16"/>
               </w:rPr>
               <w:t>Implementado</w:t>
@@ -7317,14 +7946,16 @@
         </w:tc>
         <w:tc>
           <w:tcPr>
-            <w:tcW w:type="dxa" w:w="4535"/>
-          </w:tcPr>
-          <w:p>
-            <w:r>
-              <w:rPr>
+            <w:tcW w:type="dxa" w:w="3345"/>
+          </w:tcPr>
+          <w:p>
+            <w:r/>
+            <w:r>
+              <w:rPr>
+                <w:b w:val="0"/>
                 <w:sz w:val="16"/>
               </w:rPr>
-              <w:t>db/migrate.js aplica migraciones versionadas (migrations/002..008) al iniciar.</w:t>
+              <w:t>db/migrate.js: migraciones versionadas (migrations/002 a 008) aplicadas al iniciar.</w:t>
             </w:r>
           </w:p>
         </w:tc>
@@ -7332,41 +7963,62 @@
       <w:tr>
         <w:tc>
           <w:tcPr>
-            <w:tcW w:type="dxa" w:w="1274"/>
-          </w:tcPr>
-          <w:p>
-            <w:r>
+            <w:tcW w:type="dxa" w:w="1020"/>
+          </w:tcPr>
+          <w:p>
+            <w:r/>
+            <w:r>
+              <w:rPr>
+                <w:b w:val="0"/>
+                <w:sz w:val="18"/>
+              </w:rPr>
               <w:t>RQNF-11</w:t>
             </w:r>
           </w:p>
         </w:tc>
         <w:tc>
           <w:tcPr>
-            <w:tcW w:type="dxa" w:w="2144"/>
-          </w:tcPr>
-          <w:p>
-            <w:r>
+            <w:tcW w:type="dxa" w:w="1474"/>
+          </w:tcPr>
+          <w:p>
+            <w:r/>
+            <w:r>
+              <w:rPr>
+                <w:b w:val="0"/>
+                <w:sz w:val="18"/>
+              </w:rPr>
               <w:t>Mantenibilidad</w:t>
             </w:r>
           </w:p>
         </w:tc>
         <w:tc>
           <w:tcPr>
-            <w:tcW w:type="dxa" w:w="7212"/>
-          </w:tcPr>
-          <w:p>
-            <w:r>
-              <w:t>El repositorio debe ejecutar integración continua (build y verificación) en cada Pull Request.</w:t>
-            </w:r>
-          </w:p>
-        </w:tc>
-        <w:tc>
-          <w:tcPr>
-            <w:tcW w:type="dxa" w:w="1701"/>
-          </w:tcPr>
-          <w:p>
-            <w:r>
-              <w:rPr>
+            <w:tcW w:type="dxa" w:w="3572"/>
+          </w:tcPr>
+          <w:p>
+            <w:r/>
+            <w:r>
+              <w:rPr>
+                <w:b w:val="0"/>
+                <w:sz w:val="18"/>
+              </w:rPr>
+              <w:t>El repositorio debe ejecutar integración continua (compilación y verificación) en cada Pull Request.</w:t>
+            </w:r>
+          </w:p>
+        </w:tc>
+        <w:tc>
+          <w:tcPr>
+            <w:tcW w:type="dxa" w:w="1247"/>
+            <w:shd w:val="clear" w:color="auto" w:fill="C6EFCE"/>
+          </w:tcPr>
+          <w:p>
+            <w:pPr>
+              <w:jc w:val="center"/>
+            </w:pPr>
+            <w:r/>
+            <w:r>
+              <w:rPr>
+                <w:b/>
                 <w:sz w:val="16"/>
               </w:rPr>
               <w:t>Implementado</w:t>
@@ -7375,14 +8027,16 @@
         </w:tc>
         <w:tc>
           <w:tcPr>
-            <w:tcW w:type="dxa" w:w="4535"/>
-          </w:tcPr>
-          <w:p>
-            <w:r>
-              <w:rPr>
+            <w:tcW w:type="dxa" w:w="3345"/>
+          </w:tcPr>
+          <w:p>
+            <w:r/>
+            <w:r>
+              <w:rPr>
+                <w:b w:val="0"/>
                 <w:sz w:val="16"/>
               </w:rPr>
-              <w:t>.github/workflows/ci.yml: CI con build y chequeo de sintaxis en cada PR.</w:t>
+              <w:t>.github/workflows/ci.yml: integración continua en cada Pull Request.</w:t>
             </w:r>
           </w:p>
         </w:tc>
@@ -7390,41 +8044,62 @@
       <w:tr>
         <w:tc>
           <w:tcPr>
-            <w:tcW w:type="dxa" w:w="1274"/>
-          </w:tcPr>
-          <w:p>
-            <w:r>
+            <w:tcW w:type="dxa" w:w="1020"/>
+          </w:tcPr>
+          <w:p>
+            <w:r/>
+            <w:r>
+              <w:rPr>
+                <w:b w:val="0"/>
+                <w:sz w:val="18"/>
+              </w:rPr>
               <w:t>RQNF-12</w:t>
             </w:r>
           </w:p>
         </w:tc>
         <w:tc>
           <w:tcPr>
-            <w:tcW w:type="dxa" w:w="2144"/>
-          </w:tcPr>
-          <w:p>
-            <w:r>
+            <w:tcW w:type="dxa" w:w="1474"/>
+          </w:tcPr>
+          <w:p>
+            <w:r/>
+            <w:r>
+              <w:rPr>
+                <w:b w:val="0"/>
+                <w:sz w:val="18"/>
+              </w:rPr>
               <w:t>Cumplimiento</w:t>
             </w:r>
           </w:p>
         </w:tc>
         <w:tc>
           <w:tcPr>
-            <w:tcW w:type="dxa" w:w="7212"/>
-          </w:tcPr>
-          <w:p>
-            <w:r>
+            <w:tcW w:type="dxa" w:w="3572"/>
+          </w:tcPr>
+          <w:p>
+            <w:r/>
+            <w:r>
+              <w:rPr>
+                <w:b w:val="0"/>
+                <w:sz w:val="18"/>
+              </w:rPr>
               <w:t>El sistema debe publicar los términos de uso, la política de privacidad y la política de tratamiento de datos personales.</w:t>
             </w:r>
           </w:p>
         </w:tc>
         <w:tc>
           <w:tcPr>
-            <w:tcW w:type="dxa" w:w="1701"/>
-          </w:tcPr>
-          <w:p>
-            <w:r>
-              <w:rPr>
+            <w:tcW w:type="dxa" w:w="1247"/>
+            <w:shd w:val="clear" w:color="auto" w:fill="C6EFCE"/>
+          </w:tcPr>
+          <w:p>
+            <w:pPr>
+              <w:jc w:val="center"/>
+            </w:pPr>
+            <w:r/>
+            <w:r>
+              <w:rPr>
+                <w:b/>
                 <w:sz w:val="16"/>
               </w:rPr>
               <w:t>Implementado</w:t>
@@ -7433,14 +8108,16 @@
         </w:tc>
         <w:tc>
           <w:tcPr>
-            <w:tcW w:type="dxa" w:w="4535"/>
-          </w:tcPr>
-          <w:p>
-            <w:r>
-              <w:rPr>
+            <w:tcW w:type="dxa" w:w="3345"/>
+          </w:tcPr>
+          <w:p>
+            <w:r/>
+            <w:r>
+              <w:rPr>
+                <w:b w:val="0"/>
                 <w:sz w:val="16"/>
               </w:rPr>
-              <w:t>Rutas /legal/terminos, /legal/privacidad y /legal/datos (TerminosPage, PrivacidadPage, PoliticaDatosPage).</w:t>
+              <w:t>Rutas /legal/terminos, /legal/privacidad y /legal/datos.</w:t>
             </w:r>
           </w:p>
         </w:tc>
@@ -7448,41 +8125,62 @@
       <w:tr>
         <w:tc>
           <w:tcPr>
-            <w:tcW w:type="dxa" w:w="1274"/>
-          </w:tcPr>
-          <w:p>
-            <w:r>
+            <w:tcW w:type="dxa" w:w="1020"/>
+          </w:tcPr>
+          <w:p>
+            <w:r/>
+            <w:r>
+              <w:rPr>
+                <w:b w:val="0"/>
+                <w:sz w:val="18"/>
+              </w:rPr>
               <w:t>RQNF-13</w:t>
             </w:r>
           </w:p>
         </w:tc>
         <w:tc>
           <w:tcPr>
-            <w:tcW w:type="dxa" w:w="2144"/>
-          </w:tcPr>
-          <w:p>
-            <w:r>
+            <w:tcW w:type="dxa" w:w="1474"/>
+          </w:tcPr>
+          <w:p>
+            <w:r/>
+            <w:r>
+              <w:rPr>
+                <w:b w:val="0"/>
+                <w:sz w:val="18"/>
+              </w:rPr>
               <w:t>Observabilidad</w:t>
             </w:r>
           </w:p>
         </w:tc>
         <w:tc>
           <w:tcPr>
-            <w:tcW w:type="dxa" w:w="7212"/>
-          </w:tcPr>
-          <w:p>
-            <w:r>
+            <w:tcW w:type="dxa" w:w="3572"/>
+          </w:tcPr>
+          <w:p>
+            <w:r/>
+            <w:r>
+              <w:rPr>
+                <w:b w:val="0"/>
+                <w:sz w:val="18"/>
+              </w:rPr>
               <w:t>El sistema debe exponer un endpoint de verificación de salud para el monitoreo del servicio.</w:t>
             </w:r>
           </w:p>
         </w:tc>
         <w:tc>
           <w:tcPr>
-            <w:tcW w:type="dxa" w:w="1701"/>
-          </w:tcPr>
-          <w:p>
-            <w:r>
-              <w:rPr>
+            <w:tcW w:type="dxa" w:w="1247"/>
+            <w:shd w:val="clear" w:color="auto" w:fill="C6EFCE"/>
+          </w:tcPr>
+          <w:p>
+            <w:pPr>
+              <w:jc w:val="center"/>
+            </w:pPr>
+            <w:r/>
+            <w:r>
+              <w:rPr>
+                <w:b/>
                 <w:sz w:val="16"/>
               </w:rPr>
               <w:t>Implementado</w:t>
@@ -7491,11 +8189,13 @@
         </w:tc>
         <w:tc>
           <w:tcPr>
-            <w:tcW w:type="dxa" w:w="4535"/>
-          </w:tcPr>
-          <w:p>
-            <w:r>
-              <w:rPr>
+            <w:tcW w:type="dxa" w:w="3345"/>
+          </w:tcPr>
+          <w:p>
+            <w:r/>
+            <w:r>
+              <w:rPr>
+                <w:b w:val="0"/>
                 <w:sz w:val="16"/>
               </w:rPr>
               <w:t>index.js: endpoints /api/healthz y /api/health.</w:t>
@@ -7506,41 +8206,62 @@
       <w:tr>
         <w:tc>
           <w:tcPr>
-            <w:tcW w:type="dxa" w:w="1274"/>
-          </w:tcPr>
-          <w:p>
-            <w:r>
+            <w:tcW w:type="dxa" w:w="1020"/>
+          </w:tcPr>
+          <w:p>
+            <w:r/>
+            <w:r>
+              <w:rPr>
+                <w:b w:val="0"/>
+                <w:sz w:val="18"/>
+              </w:rPr>
               <w:t>RQNF-14</w:t>
             </w:r>
           </w:p>
         </w:tc>
         <w:tc>
           <w:tcPr>
-            <w:tcW w:type="dxa" w:w="2144"/>
-          </w:tcPr>
-          <w:p>
-            <w:r>
+            <w:tcW w:type="dxa" w:w="1474"/>
+          </w:tcPr>
+          <w:p>
+            <w:r/>
+            <w:r>
+              <w:rPr>
+                <w:b w:val="0"/>
+                <w:sz w:val="18"/>
+              </w:rPr>
               <w:t>Mantenibilidad</w:t>
             </w:r>
           </w:p>
         </w:tc>
         <w:tc>
           <w:tcPr>
-            <w:tcW w:type="dxa" w:w="7212"/>
-          </w:tcPr>
-          <w:p>
-            <w:r>
+            <w:tcW w:type="dxa" w:w="3572"/>
+          </w:tcPr>
+          <w:p>
+            <w:r/>
+            <w:r>
+              <w:rPr>
+                <w:b w:val="0"/>
+                <w:sz w:val="18"/>
+              </w:rPr>
               <w:t>El sistema debe manejar los errores de forma centralizada, devolviendo respuestas consistentes.</w:t>
             </w:r>
           </w:p>
         </w:tc>
         <w:tc>
           <w:tcPr>
-            <w:tcW w:type="dxa" w:w="1701"/>
-          </w:tcPr>
-          <w:p>
-            <w:r>
-              <w:rPr>
+            <w:tcW w:type="dxa" w:w="1247"/>
+            <w:shd w:val="clear" w:color="auto" w:fill="C6EFCE"/>
+          </w:tcPr>
+          <w:p>
+            <w:pPr>
+              <w:jc w:val="center"/>
+            </w:pPr>
+            <w:r/>
+            <w:r>
+              <w:rPr>
+                <w:b/>
                 <w:sz w:val="16"/>
               </w:rPr>
               <w:t>Implementado</w:t>
@@ -7549,14 +8270,16 @@
         </w:tc>
         <w:tc>
           <w:tcPr>
-            <w:tcW w:type="dxa" w:w="4535"/>
-          </w:tcPr>
-          <w:p>
-            <w:r>
-              <w:rPr>
+            <w:tcW w:type="dxa" w:w="3345"/>
+          </w:tcPr>
+          <w:p>
+            <w:r/>
+            <w:r>
+              <w:rPr>
+                <w:b w:val="0"/>
                 <w:sz w:val="16"/>
               </w:rPr>
-              <w:t>lib/errors.js, lib/asyncHandler.js y errorHandler central: respuestas de error consistentes.</w:t>
+              <w:t>lib/errors.js, lib/asyncHandler.js y manejador central de errores.</w:t>
             </w:r>
           </w:p>
         </w:tc>
@@ -7564,41 +8287,62 @@
       <w:tr>
         <w:tc>
           <w:tcPr>
-            <w:tcW w:type="dxa" w:w="1274"/>
-          </w:tcPr>
-          <w:p>
-            <w:r>
+            <w:tcW w:type="dxa" w:w="1020"/>
+          </w:tcPr>
+          <w:p>
+            <w:r/>
+            <w:r>
+              <w:rPr>
+                <w:b w:val="0"/>
+                <w:sz w:val="18"/>
+              </w:rPr>
               <w:t>RQNF-15</w:t>
             </w:r>
           </w:p>
         </w:tc>
         <w:tc>
           <w:tcPr>
-            <w:tcW w:type="dxa" w:w="2144"/>
-          </w:tcPr>
-          <w:p>
-            <w:r>
+            <w:tcW w:type="dxa" w:w="1474"/>
+          </w:tcPr>
+          <w:p>
+            <w:r/>
+            <w:r>
+              <w:rPr>
+                <w:b w:val="0"/>
+                <w:sz w:val="18"/>
+              </w:rPr>
               <w:t>Seguridad</w:t>
             </w:r>
           </w:p>
         </w:tc>
         <w:tc>
           <w:tcPr>
-            <w:tcW w:type="dxa" w:w="7212"/>
-          </w:tcPr>
-          <w:p>
-            <w:r>
+            <w:tcW w:type="dxa" w:w="3572"/>
+          </w:tcPr>
+          <w:p>
+            <w:r/>
+            <w:r>
+              <w:rPr>
+                <w:b w:val="0"/>
+                <w:sz w:val="18"/>
+              </w:rPr>
               <w:t>El sistema debe restringir las solicitudes entre orígenes (CORS) a los dominios configurados.</w:t>
             </w:r>
           </w:p>
         </w:tc>
         <w:tc>
           <w:tcPr>
-            <w:tcW w:type="dxa" w:w="1701"/>
-          </w:tcPr>
-          <w:p>
-            <w:r>
-              <w:rPr>
+            <w:tcW w:type="dxa" w:w="1247"/>
+            <w:shd w:val="clear" w:color="auto" w:fill="C6EFCE"/>
+          </w:tcPr>
+          <w:p>
+            <w:pPr>
+              <w:jc w:val="center"/>
+            </w:pPr>
+            <w:r/>
+            <w:r>
+              <w:rPr>
+                <w:b/>
                 <w:sz w:val="16"/>
               </w:rPr>
               <w:t>Implementado</w:t>
@@ -7607,19 +8351,30 @@
         </w:tc>
         <w:tc>
           <w:tcPr>
-            <w:tcW w:type="dxa" w:w="4535"/>
-          </w:tcPr>
-          <w:p>
-            <w:r>
-              <w:rPr>
+            <w:tcW w:type="dxa" w:w="3345"/>
+          </w:tcPr>
+          <w:p>
+            <w:r/>
+            <w:r>
+              <w:rPr>
+                <w:b w:val="0"/>
                 <w:sz w:val="16"/>
               </w:rPr>
-              <w:t>index.js: CORS restringido por origen configurado.</w:t>
+              <w:t>index.js: CORS restringido a los orígenes configurados.</w:t>
             </w:r>
           </w:p>
         </w:tc>
       </w:tr>
     </w:tbl>
+    <w:p>
+      <w:r>
+        <w:rPr>
+          <w:i/>
+          <w:sz w:val="18"/>
+        </w:rPr>
+        <w:t>Estado de implementación de los requisitos no funcionales: 10 de 15 implementados, 2 parciales y 3 pendientes (avance 73.3 %).</w:t>
+      </w:r>
+    </w:p>
     <w:p>
       <w:pPr>
         <w:spacing w:line="480" w:lineRule="auto"/>

</xml_diff>

<commit_message>
docs(requisitos): aplica al docx los hallazgos del verificador
- RQF-22 pasa a Pendiente: la eliminacion de cuenta aborta la
  transaccion y el gimnasio queda intacto (probado por el verificador
  en PostgreSQL 18; safe() no usa SAVEPOINT).
- RQF-13 a Parcial: con WhatsApp listo, un envio fallido queda como
  exitoso (whatsapp.js se traga el error).
- RQF-14 a Parcial: si WhatsApp no esta listo, el aviso se marca como
  enviado y no se reintenta.
- RQNF-09 a Parcial (verify-reset-code y reset-password sin limite) y
  RQNF-10 a Parcial (las migraciones no dan el esquema que usa el codigo).
- RQF-21 acotado al pago (plan y vigencia ya estan en RQF-04).
RQF-23 a RQF-26 quedan igual hasta que Luis decida.
</commit_message>
<xml_diff>
--- a/docs/Proyecto FitLoyalty - requisitos actualizados.docx
+++ b/docs/Proyecto FitLoyalty - requisitos actualizados.docx
@@ -5851,7 +5851,7 @@
                 <w:szCs w:val="24"/>
                 <w:rtl w:val="0"/>
               </w:rPr>
-              <w:t xml:space="preserve">Implementado</w:t>
+              <w:t xml:space="preserve">Parcial</w:t>
             </w:r>
           </w:p>
         </w:tc>
@@ -5889,7 +5889,7 @@
                 <w:szCs w:val="24"/>
                 <w:rtl w:val="0"/>
               </w:rPr>
-              <w:t xml:space="preserve">admin-contrato.js:76-160 (envío, control de gimnasio en :92, aviso si WhatsApp no está listo) y registro en contrato_enviado (migración 008); botón en MiembrosPage.jsx:1735.</w:t>
+              <w:t xml:space="preserve">admin-contrato.js:76-160 envía y registra cada intento (migración 008). Falta: con WhatsApp listo, un envío fallido queda como exitoso (whatsapp.js:244-246 se traga el error).</w:t>
             </w:r>
           </w:p>
         </w:tc>
@@ -6052,7 +6052,7 @@
                 <w:szCs w:val="24"/>
                 <w:rtl w:val="0"/>
               </w:rPr>
-              <w:t xml:space="preserve">Implementado</w:t>
+              <w:t xml:space="preserve">Parcial</w:t>
             </w:r>
           </w:p>
         </w:tc>
@@ -6091,7 +6091,7 @@
                 <w:szCs w:val="24"/>
                 <w:rtl w:val="0"/>
               </w:rPr>
-              <w:t xml:space="preserve">scheduler.js:46 (cron diario 9:00 a.m.), expiracion.js:43-151 (selección, anti-duplicado y días por gimnasio); ejecución manual en jobs.js:27; migraciones 006 y 007.</w:t>
+              <w:t xml:space="preserve">scheduler.js:46 (cron diario) y expiracion.js:43-151 (selección y anti-duplicado). Falta: si WhatsApp no está listo, el aviso queda marcado como enviado y no se reintenta (expiracion.js:206-207).</w:t>
             </w:r>
           </w:p>
         </w:tc>
@@ -7409,7 +7409,7 @@
                 <w:szCs w:val="24"/>
                 <w:rtl w:val="0"/>
               </w:rPr>
-              <w:t xml:space="preserve">El sistema debe registrar por miembro el plan contratado, su vigencia, el valor total y pagado, el método y el estado del pago.</w:t>
+              <w:t xml:space="preserve">El sistema debe registrar por miembro el valor total y pagado, el método y el estado del pago de su plan.</w:t>
             </w:r>
           </w:p>
         </w:tc>
@@ -7648,7 +7648,7 @@
                 <w:szCs w:val="24"/>
                 <w:rtl w:val="0"/>
               </w:rPr>
-              <w:t xml:space="preserve">Implementado</w:t>
+              <w:t xml:space="preserve">Pendiente</w:t>
             </w:r>
           </w:p>
         </w:tc>
@@ -7687,7 +7687,7 @@
                 <w:szCs w:val="24"/>
                 <w:rtl w:val="0"/>
               </w:rPr>
-              <w:t xml:space="preserve">auth.js:480-548 (DELETE /api/auth/account borra los datos del gimnasio en una transacción); EliminarCuentaPage.jsx:22.</w:t>
+              <w:t xml:space="preserve">No funciona: safe() (auth.js:496-502) no usa SAVEPOINT y cualquier error aborta la transacción de PostgreSQL; con las migraciones falla en DELETE FROM auditoria (tabla inexistente) y el gimnasio queda intacto (HTTP 500).</w:t>
             </w:r>
           </w:p>
         </w:tc>
@@ -8515,7 +8515,7 @@
           <w:szCs w:val="24"/>
           <w:rtl w:val="0"/>
         </w:rPr>
-        <w:t xml:space="preserve">Estado de implementación de los requisitos funcionales, verificado contra el código el 16/10/2026 (rama main, commit 54b19fa): 16 implementados, 6 parciales y 4 pendientes de 26; avance de 73,1 % (Implementado = 1, Parcial = 0,5, Pendiente = 0). El detalle de cada evidencia está en docs/avance-requisitos.xlsx.</w:t>
+        <w:t xml:space="preserve">Estado de implementación de los requisitos funcionales, verificado contra el código el 16/10/2026 (rama main, commit 54b19fa): 13 implementados, 8 parciales y 5 pendientes de 26; avance de 65,4 % (Implementado = 1, Parcial = 0,5, Pendiente = 0). El detalle de cada evidencia está en docs/avance-requisitos.xlsx.</w:t>
       </w:r>
     </w:p>
     <w:p>
@@ -10575,7 +10575,7 @@
                 <w:szCs w:val="24"/>
                 <w:rtl w:val="0"/>
               </w:rPr>
-              <w:t xml:space="preserve">Implementado</w:t>
+              <w:t xml:space="preserve">Parcial</w:t>
             </w:r>
           </w:p>
         </w:tc>
@@ -10613,7 +10613,7 @@
                 <w:szCs w:val="24"/>
                 <w:rtl w:val="0"/>
               </w:rPr>
-              <w:t xml:space="preserve">index.js:63-95 (express-rate-limit: login 5/min, recuperación 3/min, app del miembro 10/min).</w:t>
+              <w:t xml:space="preserve">index.js:63-95 limita el login (5/min), forgot-password (3/min) y el login de la app (10/min). Falta: verify-reset-code y reset-password no tienen límite.</w:t>
             </w:r>
           </w:p>
         </w:tc>
@@ -10776,7 +10776,7 @@
                 <w:szCs w:val="24"/>
                 <w:rtl w:val="0"/>
               </w:rPr>
-              <w:t xml:space="preserve">Implementado</w:t>
+              <w:t xml:space="preserve">Parcial</w:t>
             </w:r>
           </w:p>
         </w:tc>
@@ -10815,7 +10815,7 @@
                 <w:szCs w:val="24"/>
                 <w:rtl w:val="0"/>
               </w:rPr>
-              <w:t xml:space="preserve">migrate.js:41-56 (aplica backend/migrations en orden y registra en schema_migrations); se llama al iniciar (index.js:129).</w:t>
+              <w:t xml:space="preserve">migrate.js:41-56 aplica backend/migrations al iniciar (index.js:129). Falta: el esquema que dejan no es el que usa el código (sin vista_miembros_activos, auditoria ni columnas de reto e hito_gamificacion).</w:t>
             </w:r>
           </w:p>
         </w:tc>
@@ -11840,7 +11840,7 @@
           <w:szCs w:val="24"/>
           <w:rtl w:val="0"/>
         </w:rPr>
-        <w:t xml:space="preserve">Estado de implementación de los requisitos no funcionales, verificado contra el código el 16/10/2026 (rama main, commit 54b19fa): 8 implementados, 4 parciales y 3 pendientes de 15; avance de 66,7 % (Implementado = 1, Parcial = 0,5, Pendiente = 0). El detalle de cada evidencia está en docs/avance-requisitos.xlsx.</w:t>
+        <w:t xml:space="preserve">Estado de implementación de los requisitos no funcionales, verificado contra el código el 16/10/2026 (rama main, commit 54b19fa): 6 implementados, 6 parciales y 3 pendientes de 15; avance de 60,0 % (Implementado = 1, Parcial = 0,5, Pendiente = 0). El detalle de cada evidencia está en docs/avance-requisitos.xlsx.</w:t>
       </w:r>
     </w:p>
     <w:p>

</xml_diff>

<commit_message>
docs(requisitos): retira RQF-23..25 y fusiona RQF-26 en RQF-15 en el docx
Decision de Luis sobre la seccion 12.3 del verificador: RQF-23 repetia
RQF-08, RQF-24 repetia RQF-05 y RQF-25 repetia RQF-03 (y es un defecto);
RQF-26 (editar el perfil) pasa a RQF-15, que ahora dice "y edicion del
perfil". La tabla 5 queda RQF-01..22, consecutiva; resumen: 10
implementados, 8 parciales y 4 pendientes de 22 (63,6 %).
</commit_message>
<xml_diff>
--- a/docs/Proyecto FitLoyalty - requisitos actualizados.docx
+++ b/docs/Proyecto FitLoyalty - requisitos actualizados.docx
@@ -6212,7 +6212,7 @@
                 <w:szCs w:val="24"/>
                 <w:rtl w:val="0"/>
               </w:rPr>
-              <w:t xml:space="preserve">El sistema debe ofrecer una aplicación móvil para el miembro con inicio de sesión, código QR personal, estado de membresía, historial de asistencia, hitos y retos activos.</w:t>
+              <w:t xml:space="preserve">El sistema debe ofrecer una aplicación móvil para el miembro con inicio de sesión, código QR personal, estado de membresía, historial de asistencia, hitos y retos activos, y edición del perfil.</w:t>
             </w:r>
           </w:p>
         </w:tc>
@@ -6288,7 +6288,7 @@
                 <w:szCs w:val="24"/>
                 <w:rtl w:val="0"/>
               </w:rPr>
-              <w:t xml:space="preserve">cliente.js:51-418 (login con bcrypt, /qr, /membresia, /asistencia, /gamificacion, /retos) protegido con requireClient (:112); pantallas Flutter en fitloyalty_cliente/lib/cliente/screens.</w:t>
+              <w:t xml:space="preserve">cliente.js:51-418 (login con bcrypt, /qr, /membresia, /asistencia, /gamificacion, /retos y PUT /me para editar el perfil) protegido con requireClient (:112); pantallas Flutter en fitloyalty_cliente/lib/cliente/screens.</w:t>
             </w:r>
           </w:p>
         </w:tc>
@@ -7688,804 +7688,6 @@
                 <w:rtl w:val="0"/>
               </w:rPr>
               <w:t xml:space="preserve">No funciona: safe() (auth.js:496-502) no usa SAVEPOINT y cualquier error aborta la transacción de PostgreSQL; con las migraciones falla en DELETE FROM auditoria (tabla inexistente) y el gimnasio queda intacto (HTTP 500).</w:t>
-            </w:r>
-          </w:p>
-        </w:tc>
-      </w:tr>
-      <w:tr>
-        <w:trPr>
-          <w:cantSplit w:val="0"/>
-          <w:trHeight w:val="975" w:hRule="atLeast"/>
-          <w:tblHeader w:val="0"/>
-        </w:trPr>
-        <w:tc>
-          <w:tcPr>
-            <w:tcW w:w="1250" w:type="dxa"/>
-            <w:tcBorders>
-              <w:top w:color="000000" w:space="0" w:sz="0" w:val="nil"/>
-              <w:left w:color="aaaaaa" w:space="0" w:sz="5" w:val="single"/>
-              <w:bottom w:color="aaaaaa" w:space="0" w:sz="5" w:val="single"/>
-              <w:right w:color="aaaaaa" w:space="0" w:sz="5" w:val="single"/>
-            </w:tcBorders>
-            <w:tcMar>
-              <w:top w:w="80.0" w:type="dxa"/>
-              <w:left w:w="100.0" w:type="dxa"/>
-              <w:bottom w:w="80.0" w:type="dxa"/>
-              <w:right w:w="100.0" w:type="dxa"/>
-            </w:tcMar>
-            <w:vAlign w:val="top"/>
-          </w:tcPr>
-          <w:p>
-            <w:pPr>
-              <w:spacing w:line="319.2000000000001" w:lineRule="auto"/>
-              <w:jc w:val="both"/>
-              <w:rPr>
-                <w:rFonts w:ascii="Times New Roman" w:cs="Times New Roman" w:eastAsia="Times New Roman" w:hAnsi="Times New Roman"/>
-                <w:sz w:val="24"/>
-                <w:szCs w:val="24"/>
-              </w:rPr>
-            </w:pPr>
-            <w:r>
-              <w:rPr>
-                <w:rFonts w:ascii="Times New Roman" w:cs="Times New Roman" w:eastAsia="Times New Roman" w:hAnsi="Times New Roman"/>
-                <w:sz w:val="24"/>
-                <w:szCs w:val="24"/>
-                <w:rtl w:val="0"/>
-              </w:rPr>
-              <w:t xml:space="preserve">RQF-23</w:t>
-            </w:r>
-          </w:p>
-        </w:tc>
-        <w:tc>
-          <w:tcPr>
-            <w:tcW w:w="2000" w:type="dxa"/>
-            <w:tcBorders>
-              <w:top w:color="000000" w:space="0" w:sz="0" w:val="nil"/>
-              <w:left w:color="000000" w:space="0" w:sz="0" w:val="nil"/>
-              <w:bottom w:color="aaaaaa" w:space="0" w:sz="5" w:val="single"/>
-              <w:right w:color="aaaaaa" w:space="0" w:sz="5" w:val="single"/>
-            </w:tcBorders>
-            <w:tcMar>
-              <w:top w:w="80.0" w:type="dxa"/>
-              <w:left w:w="100.0" w:type="dxa"/>
-              <w:bottom w:w="80.0" w:type="dxa"/>
-              <w:right w:w="100.0" w:type="dxa"/>
-            </w:tcMar>
-            <w:vAlign w:val="top"/>
-          </w:tcPr>
-          <w:p>
-            <w:pPr>
-              <w:spacing w:line="319.2000000000001" w:lineRule="auto"/>
-              <w:jc w:val="both"/>
-              <w:rPr>
-                <w:rFonts w:ascii="Times New Roman" w:cs="Times New Roman" w:eastAsia="Times New Roman" w:hAnsi="Times New Roman"/>
-                <w:sz w:val="24"/>
-                <w:szCs w:val="24"/>
-              </w:rPr>
-            </w:pPr>
-            <w:r>
-              <w:rPr>
-                <w:rFonts w:ascii="Times New Roman" w:cs="Times New Roman" w:eastAsia="Times New Roman" w:hAnsi="Times New Roman"/>
-                <w:sz w:val="24"/>
-                <w:szCs w:val="24"/>
-                <w:rtl w:val="0"/>
-              </w:rPr>
-              <w:t xml:space="preserve">Dashboard</w:t>
-            </w:r>
-          </w:p>
-        </w:tc>
-        <w:tc>
-          <w:tcPr>
-            <w:tcW w:w="3000" w:type="dxa"/>
-            <w:tcBorders>
-              <w:top w:color="000000" w:space="0" w:sz="0" w:val="nil"/>
-              <w:left w:color="000000" w:space="0" w:sz="0" w:val="nil"/>
-              <w:bottom w:color="aaaaaa" w:space="0" w:sz="5" w:val="single"/>
-              <w:right w:color="aaaaaa" w:space="0" w:sz="5" w:val="single"/>
-            </w:tcBorders>
-            <w:tcMar>
-              <w:top w:w="80.0" w:type="dxa"/>
-              <w:left w:w="100.0" w:type="dxa"/>
-              <w:bottom w:w="80.0" w:type="dxa"/>
-              <w:right w:w="100.0" w:type="dxa"/>
-            </w:tcMar>
-            <w:vAlign w:val="top"/>
-          </w:tcPr>
-          <w:p>
-            <w:pPr>
-              <w:spacing w:line="319.2000000000001" w:lineRule="auto"/>
-              <w:jc w:val="both"/>
-              <w:rPr>
-                <w:rFonts w:ascii="Times New Roman" w:cs="Times New Roman" w:eastAsia="Times New Roman" w:hAnsi="Times New Roman"/>
-                <w:sz w:val="24"/>
-                <w:szCs w:val="24"/>
-              </w:rPr>
-            </w:pPr>
-            <w:r>
-              <w:rPr>
-                <w:rFonts w:ascii="Times New Roman" w:cs="Times New Roman" w:eastAsia="Times New Roman" w:hAnsi="Times New Roman"/>
-                <w:sz w:val="24"/>
-                <w:szCs w:val="24"/>
-                <w:rtl w:val="0"/>
-              </w:rPr>
-              <w:t xml:space="preserve">El sistema debe mostrar al administrador avisos accionables (vencimientos y riesgo de abandono) en un centro de notificaciones.</w:t>
-            </w:r>
-          </w:p>
-        </w:tc>
-        <w:tc>
-          <w:tcPr>
-            <w:tcW w:w="1650" w:type="dxa"/>
-            <w:tcBorders>
-              <w:top w:color="000000" w:space="0" w:sz="0" w:val="nil"/>
-              <w:left w:color="000000" w:space="0" w:sz="0" w:val="nil"/>
-              <w:bottom w:color="aaaaaa" w:space="0" w:sz="5" w:val="single"/>
-              <w:right w:color="aaaaaa" w:space="0" w:sz="5" w:val="single"/>
-            </w:tcBorders>
-            <w:tcMar>
-              <w:top w:w="80.0" w:type="dxa"/>
-              <w:left w:w="100.0" w:type="dxa"/>
-              <w:bottom w:w="80.0" w:type="dxa"/>
-              <w:right w:w="100.0" w:type="dxa"/>
-            </w:tcMar>
-            <w:vAlign w:val="top"/>
-          </w:tcPr>
-          <w:p>
-            <w:pPr>
-              <w:spacing w:line="319.2000000000001" w:lineRule="auto"/>
-              <w:jc w:val="left"/>
-              <w:rPr>
-                <w:rFonts w:ascii="Times New Roman" w:cs="Times New Roman" w:eastAsia="Times New Roman" w:hAnsi="Times New Roman"/>
-                <w:sz w:val="24"/>
-                <w:szCs w:val="24"/>
-              </w:rPr>
-            </w:pPr>
-            <w:r>
-              <w:rPr>
-                <w:rFonts w:ascii="Times New Roman" w:cs="Times New Roman" w:eastAsia="Times New Roman" w:hAnsi="Times New Roman"/>
-                <w:sz w:val="24"/>
-                <w:szCs w:val="24"/>
-                <w:rtl w:val="0"/>
-              </w:rPr>
-              <w:t xml:space="preserve">Implementado</w:t>
-            </w:r>
-          </w:p>
-        </w:tc>
-        <w:tc>
-          <w:tcPr>
-            <w:tcW w:w="2759" w:type="dxa"/>
-            <w:tcBorders>
-              <w:top w:color="000000" w:space="0" w:sz="0" w:val="nil"/>
-              <w:left w:color="000000" w:space="0" w:sz="0" w:val="nil"/>
-              <w:bottom w:color="aaaaaa" w:space="0" w:sz="5" w:val="single"/>
-              <w:right w:color="aaaaaa" w:space="0" w:sz="5" w:val="single"/>
-            </w:tcBorders>
-            <w:tcMar>
-              <w:top w:w="80.0" w:type="dxa"/>
-              <w:left w:w="100.0" w:type="dxa"/>
-              <w:bottom w:w="80.0" w:type="dxa"/>
-              <w:right w:w="100.0" w:type="dxa"/>
-            </w:tcMar>
-            <w:vAlign w:val="top"/>
-          </w:tcPr>
-          <w:p>
-            <w:pPr>
-              <w:spacing w:line="319.2000000000001" w:lineRule="auto"/>
-              <w:jc w:val="left"/>
-              <w:rPr>
-                <w:rFonts w:ascii="Times New Roman" w:cs="Times New Roman" w:eastAsia="Times New Roman" w:hAnsi="Times New Roman"/>
-                <w:sz w:val="24"/>
-                <w:szCs w:val="24"/>
-              </w:rPr>
-            </w:pPr>
-            <w:r>
-              <w:rPr>
-                <w:rFonts w:ascii="Times New Roman" w:cs="Times New Roman" w:eastAsia="Times New Roman" w:hAnsi="Times New Roman"/>
-                <w:sz w:val="24"/>
-                <w:szCs w:val="24"/>
-                <w:rtl w:val="0"/>
-              </w:rPr>
-              <w:t xml:space="preserve">notificaciones.js:73-180 (avisos de vencidas, por vencer y en riesgo); campana en MenuNotificaciones.jsx:38-90.</w:t>
-            </w:r>
-          </w:p>
-        </w:tc>
-      </w:tr>
-      <w:tr>
-        <w:trPr>
-          <w:cantSplit w:val="0"/>
-          <w:trHeight w:val="975" w:hRule="atLeast"/>
-          <w:tblHeader w:val="0"/>
-        </w:trPr>
-        <w:tc>
-          <w:tcPr>
-            <w:tcW w:w="1250" w:type="dxa"/>
-            <w:tcBorders>
-              <w:top w:color="000000" w:space="0" w:sz="0" w:val="nil"/>
-              <w:left w:color="aaaaaa" w:space="0" w:sz="5" w:val="single"/>
-              <w:bottom w:color="aaaaaa" w:space="0" w:sz="5" w:val="single"/>
-              <w:right w:color="aaaaaa" w:space="0" w:sz="5" w:val="single"/>
-            </w:tcBorders>
-            <w:shd w:fill="eaf5e0" w:val="clear"/>
-            <w:tcMar>
-              <w:top w:w="80.0" w:type="dxa"/>
-              <w:left w:w="100.0" w:type="dxa"/>
-              <w:bottom w:w="80.0" w:type="dxa"/>
-              <w:right w:w="100.0" w:type="dxa"/>
-            </w:tcMar>
-            <w:vAlign w:val="top"/>
-          </w:tcPr>
-          <w:p>
-            <w:pPr>
-              <w:spacing w:line="319.2000000000001" w:lineRule="auto"/>
-              <w:jc w:val="both"/>
-              <w:rPr>
-                <w:rFonts w:ascii="Times New Roman" w:cs="Times New Roman" w:eastAsia="Times New Roman" w:hAnsi="Times New Roman"/>
-                <w:sz w:val="24"/>
-                <w:szCs w:val="24"/>
-              </w:rPr>
-            </w:pPr>
-            <w:r>
-              <w:rPr>
-                <w:rFonts w:ascii="Times New Roman" w:cs="Times New Roman" w:eastAsia="Times New Roman" w:hAnsi="Times New Roman"/>
-                <w:sz w:val="24"/>
-                <w:szCs w:val="24"/>
-                <w:rtl w:val="0"/>
-              </w:rPr>
-              <w:t xml:space="preserve">RQF-24</w:t>
-            </w:r>
-          </w:p>
-        </w:tc>
-        <w:tc>
-          <w:tcPr>
-            <w:tcW w:w="2000" w:type="dxa"/>
-            <w:tcBorders>
-              <w:top w:color="000000" w:space="0" w:sz="0" w:val="nil"/>
-              <w:left w:color="000000" w:space="0" w:sz="0" w:val="nil"/>
-              <w:bottom w:color="aaaaaa" w:space="0" w:sz="5" w:val="single"/>
-              <w:right w:color="aaaaaa" w:space="0" w:sz="5" w:val="single"/>
-            </w:tcBorders>
-            <w:shd w:fill="eaf5e0" w:val="clear"/>
-            <w:tcMar>
-              <w:top w:w="80.0" w:type="dxa"/>
-              <w:left w:w="100.0" w:type="dxa"/>
-              <w:bottom w:w="80.0" w:type="dxa"/>
-              <w:right w:w="100.0" w:type="dxa"/>
-            </w:tcMar>
-            <w:vAlign w:val="top"/>
-          </w:tcPr>
-          <w:p>
-            <w:pPr>
-              <w:spacing w:line="319.2000000000001" w:lineRule="auto"/>
-              <w:jc w:val="both"/>
-              <w:rPr>
-                <w:rFonts w:ascii="Times New Roman" w:cs="Times New Roman" w:eastAsia="Times New Roman" w:hAnsi="Times New Roman"/>
-                <w:sz w:val="24"/>
-                <w:szCs w:val="24"/>
-              </w:rPr>
-            </w:pPr>
-            <w:r>
-              <w:rPr>
-                <w:rFonts w:ascii="Times New Roman" w:cs="Times New Roman" w:eastAsia="Times New Roman" w:hAnsi="Times New Roman"/>
-                <w:sz w:val="24"/>
-                <w:szCs w:val="24"/>
-                <w:rtl w:val="0"/>
-              </w:rPr>
-              <w:t xml:space="preserve">Check-in y Asistencia</w:t>
-            </w:r>
-          </w:p>
-        </w:tc>
-        <w:tc>
-          <w:tcPr>
-            <w:tcW w:w="3000" w:type="dxa"/>
-            <w:tcBorders>
-              <w:top w:color="000000" w:space="0" w:sz="0" w:val="nil"/>
-              <w:left w:color="000000" w:space="0" w:sz="0" w:val="nil"/>
-              <w:bottom w:color="aaaaaa" w:space="0" w:sz="5" w:val="single"/>
-              <w:right w:color="aaaaaa" w:space="0" w:sz="5" w:val="single"/>
-            </w:tcBorders>
-            <w:shd w:fill="eaf5e0" w:val="clear"/>
-            <w:tcMar>
-              <w:top w:w="80.0" w:type="dxa"/>
-              <w:left w:w="100.0" w:type="dxa"/>
-              <w:bottom w:w="80.0" w:type="dxa"/>
-              <w:right w:w="100.0" w:type="dxa"/>
-            </w:tcMar>
-            <w:vAlign w:val="top"/>
-          </w:tcPr>
-          <w:p>
-            <w:pPr>
-              <w:spacing w:line="319.2000000000001" w:lineRule="auto"/>
-              <w:jc w:val="both"/>
-              <w:rPr>
-                <w:rFonts w:ascii="Times New Roman" w:cs="Times New Roman" w:eastAsia="Times New Roman" w:hAnsi="Times New Roman"/>
-                <w:sz w:val="24"/>
-                <w:szCs w:val="24"/>
-              </w:rPr>
-            </w:pPr>
-            <w:r>
-              <w:rPr>
-                <w:rFonts w:ascii="Times New Roman" w:cs="Times New Roman" w:eastAsia="Times New Roman" w:hAnsi="Times New Roman"/>
-                <w:sz w:val="24"/>
-                <w:szCs w:val="24"/>
-                <w:rtl w:val="0"/>
-              </w:rPr>
-              <w:t xml:space="preserve">El sistema debe listar los check-ins del gimnasio con un resumen de asistencia.</w:t>
-            </w:r>
-          </w:p>
-        </w:tc>
-        <w:tc>
-          <w:tcPr>
-            <w:tcW w:w="1650" w:type="dxa"/>
-            <w:tcBorders>
-              <w:top w:color="000000" w:space="0" w:sz="0" w:val="nil"/>
-              <w:left w:color="000000" w:space="0" w:sz="0" w:val="nil"/>
-              <w:bottom w:color="aaaaaa" w:space="0" w:sz="5" w:val="single"/>
-              <w:right w:color="aaaaaa" w:space="0" w:sz="5" w:val="single"/>
-            </w:tcBorders>
-            <w:shd w:fill="eaf5e0" w:val="clear"/>
-            <w:tcMar>
-              <w:top w:w="80.0" w:type="dxa"/>
-              <w:left w:w="100.0" w:type="dxa"/>
-              <w:bottom w:w="80.0" w:type="dxa"/>
-              <w:right w:w="100.0" w:type="dxa"/>
-            </w:tcMar>
-            <w:vAlign w:val="top"/>
-          </w:tcPr>
-          <w:p>
-            <w:pPr>
-              <w:spacing w:line="319.2000000000001" w:lineRule="auto"/>
-              <w:jc w:val="left"/>
-              <w:rPr>
-                <w:rFonts w:ascii="Times New Roman" w:cs="Times New Roman" w:eastAsia="Times New Roman" w:hAnsi="Times New Roman"/>
-                <w:sz w:val="24"/>
-                <w:szCs w:val="24"/>
-              </w:rPr>
-            </w:pPr>
-            <w:r>
-              <w:rPr>
-                <w:rFonts w:ascii="Times New Roman" w:cs="Times New Roman" w:eastAsia="Times New Roman" w:hAnsi="Times New Roman"/>
-                <w:sz w:val="24"/>
-                <w:szCs w:val="24"/>
-                <w:rtl w:val="0"/>
-              </w:rPr>
-              <w:t xml:space="preserve">Implementado</w:t>
-            </w:r>
-          </w:p>
-        </w:tc>
-        <w:tc>
-          <w:tcPr>
-            <w:tcW w:w="2759" w:type="dxa"/>
-            <w:tcBorders>
-              <w:top w:color="000000" w:space="0" w:sz="0" w:val="nil"/>
-              <w:left w:color="000000" w:space="0" w:sz="0" w:val="nil"/>
-              <w:bottom w:color="aaaaaa" w:space="0" w:sz="5" w:val="single"/>
-              <w:right w:color="aaaaaa" w:space="0" w:sz="5" w:val="single"/>
-            </w:tcBorders>
-            <w:shd w:fill="eaf5e0" w:val="clear"/>
-            <w:tcMar>
-              <w:top w:w="80.0" w:type="dxa"/>
-              <w:left w:w="100.0" w:type="dxa"/>
-              <w:bottom w:w="80.0" w:type="dxa"/>
-              <w:right w:w="100.0" w:type="dxa"/>
-            </w:tcMar>
-            <w:vAlign w:val="top"/>
-          </w:tcPr>
-          <w:p>
-            <w:pPr>
-              <w:spacing w:line="319.2000000000001" w:lineRule="auto"/>
-              <w:jc w:val="left"/>
-              <w:rPr>
-                <w:rFonts w:ascii="Times New Roman" w:cs="Times New Roman" w:eastAsia="Times New Roman" w:hAnsi="Times New Roman"/>
-                <w:sz w:val="24"/>
-                <w:szCs w:val="24"/>
-              </w:rPr>
-            </w:pPr>
-            <w:r>
-              <w:rPr>
-                <w:rFonts w:ascii="Times New Roman" w:cs="Times New Roman" w:eastAsia="Times New Roman" w:hAnsi="Times New Roman"/>
-                <w:sz w:val="24"/>
-                <w:szCs w:val="24"/>
-                <w:rtl w:val="0"/>
-              </w:rPr>
-              <w:t xml:space="preserve">asistencia.js:26-60 (últimos 50 ingresos, total y entradas de hoy) y checkin.js:199-224; lista «Ingresos de hoy» en CheckinPage.jsx:46.</w:t>
-            </w:r>
-          </w:p>
-        </w:tc>
-      </w:tr>
-      <w:tr>
-        <w:trPr>
-          <w:cantSplit w:val="0"/>
-          <w:trHeight w:val="975" w:hRule="atLeast"/>
-          <w:tblHeader w:val="0"/>
-        </w:trPr>
-        <w:tc>
-          <w:tcPr>
-            <w:tcW w:w="1250" w:type="dxa"/>
-            <w:tcBorders>
-              <w:top w:color="000000" w:space="0" w:sz="0" w:val="nil"/>
-              <w:left w:color="aaaaaa" w:space="0" w:sz="5" w:val="single"/>
-              <w:bottom w:color="aaaaaa" w:space="0" w:sz="5" w:val="single"/>
-              <w:right w:color="aaaaaa" w:space="0" w:sz="5" w:val="single"/>
-            </w:tcBorders>
-            <w:tcMar>
-              <w:top w:w="80.0" w:type="dxa"/>
-              <w:left w:w="100.0" w:type="dxa"/>
-              <w:bottom w:w="80.0" w:type="dxa"/>
-              <w:right w:w="100.0" w:type="dxa"/>
-            </w:tcMar>
-            <w:vAlign w:val="top"/>
-          </w:tcPr>
-          <w:p>
-            <w:pPr>
-              <w:spacing w:line="319.2000000000001" w:lineRule="auto"/>
-              <w:jc w:val="both"/>
-              <w:rPr>
-                <w:rFonts w:ascii="Times New Roman" w:cs="Times New Roman" w:eastAsia="Times New Roman" w:hAnsi="Times New Roman"/>
-                <w:sz w:val="24"/>
-                <w:szCs w:val="24"/>
-              </w:rPr>
-            </w:pPr>
-            <w:r>
-              <w:rPr>
-                <w:rFonts w:ascii="Times New Roman" w:cs="Times New Roman" w:eastAsia="Times New Roman" w:hAnsi="Times New Roman"/>
-                <w:sz w:val="24"/>
-                <w:szCs w:val="24"/>
-                <w:rtl w:val="0"/>
-              </w:rPr>
-              <w:t xml:space="preserve">RQF-25</w:t>
-            </w:r>
-          </w:p>
-        </w:tc>
-        <w:tc>
-          <w:tcPr>
-            <w:tcW w:w="2000" w:type="dxa"/>
-            <w:tcBorders>
-              <w:top w:color="000000" w:space="0" w:sz="0" w:val="nil"/>
-              <w:left w:color="000000" w:space="0" w:sz="0" w:val="nil"/>
-              <w:bottom w:color="aaaaaa" w:space="0" w:sz="5" w:val="single"/>
-              <w:right w:color="aaaaaa" w:space="0" w:sz="5" w:val="single"/>
-            </w:tcBorders>
-            <w:tcMar>
-              <w:top w:w="80.0" w:type="dxa"/>
-              <w:left w:w="100.0" w:type="dxa"/>
-              <w:bottom w:w="80.0" w:type="dxa"/>
-              <w:right w:w="100.0" w:type="dxa"/>
-            </w:tcMar>
-            <w:vAlign w:val="top"/>
-          </w:tcPr>
-          <w:p>
-            <w:pPr>
-              <w:spacing w:line="319.2000000000001" w:lineRule="auto"/>
-              <w:jc w:val="both"/>
-              <w:rPr>
-                <w:rFonts w:ascii="Times New Roman" w:cs="Times New Roman" w:eastAsia="Times New Roman" w:hAnsi="Times New Roman"/>
-                <w:sz w:val="24"/>
-                <w:szCs w:val="24"/>
-              </w:rPr>
-            </w:pPr>
-            <w:r>
-              <w:rPr>
-                <w:rFonts w:ascii="Times New Roman" w:cs="Times New Roman" w:eastAsia="Times New Roman" w:hAnsi="Times New Roman"/>
-                <w:sz w:val="24"/>
-                <w:szCs w:val="24"/>
-                <w:rtl w:val="0"/>
-              </w:rPr>
-              <w:t xml:space="preserve">Gestión de Miembros</w:t>
-            </w:r>
-          </w:p>
-        </w:tc>
-        <w:tc>
-          <w:tcPr>
-            <w:tcW w:w="3000" w:type="dxa"/>
-            <w:tcBorders>
-              <w:top w:color="000000" w:space="0" w:sz="0" w:val="nil"/>
-              <w:left w:color="000000" w:space="0" w:sz="0" w:val="nil"/>
-              <w:bottom w:color="aaaaaa" w:space="0" w:sz="5" w:val="single"/>
-              <w:right w:color="aaaaaa" w:space="0" w:sz="5" w:val="single"/>
-            </w:tcBorders>
-            <w:tcMar>
-              <w:top w:w="80.0" w:type="dxa"/>
-              <w:left w:w="100.0" w:type="dxa"/>
-              <w:bottom w:w="80.0" w:type="dxa"/>
-              <w:right w:w="100.0" w:type="dxa"/>
-            </w:tcMar>
-            <w:vAlign w:val="top"/>
-          </w:tcPr>
-          <w:p>
-            <w:pPr>
-              <w:spacing w:line="319.2000000000001" w:lineRule="auto"/>
-              <w:jc w:val="both"/>
-              <w:rPr>
-                <w:rFonts w:ascii="Times New Roman" w:cs="Times New Roman" w:eastAsia="Times New Roman" w:hAnsi="Times New Roman"/>
-                <w:sz w:val="24"/>
-                <w:szCs w:val="24"/>
-              </w:rPr>
-            </w:pPr>
-            <w:r>
-              <w:rPr>
-                <w:rFonts w:ascii="Times New Roman" w:cs="Times New Roman" w:eastAsia="Times New Roman" w:hAnsi="Times New Roman"/>
-                <w:sz w:val="24"/>
-                <w:szCs w:val="24"/>
-                <w:rtl w:val="0"/>
-              </w:rPr>
-              <w:t xml:space="preserve">El sistema debe ofrecer una vista de los miembros activos del gimnasio.</w:t>
-            </w:r>
-          </w:p>
-        </w:tc>
-        <w:tc>
-          <w:tcPr>
-            <w:tcW w:w="1650" w:type="dxa"/>
-            <w:tcBorders>
-              <w:top w:color="000000" w:space="0" w:sz="0" w:val="nil"/>
-              <w:left w:color="000000" w:space="0" w:sz="0" w:val="nil"/>
-              <w:bottom w:color="aaaaaa" w:space="0" w:sz="5" w:val="single"/>
-              <w:right w:color="aaaaaa" w:space="0" w:sz="5" w:val="single"/>
-            </w:tcBorders>
-            <w:tcMar>
-              <w:top w:w="80.0" w:type="dxa"/>
-              <w:left w:w="100.0" w:type="dxa"/>
-              <w:bottom w:w="80.0" w:type="dxa"/>
-              <w:right w:w="100.0" w:type="dxa"/>
-            </w:tcMar>
-            <w:vAlign w:val="top"/>
-          </w:tcPr>
-          <w:p>
-            <w:pPr>
-              <w:spacing w:line="319.2000000000001" w:lineRule="auto"/>
-              <w:jc w:val="left"/>
-              <w:rPr>
-                <w:rFonts w:ascii="Times New Roman" w:cs="Times New Roman" w:eastAsia="Times New Roman" w:hAnsi="Times New Roman"/>
-                <w:sz w:val="24"/>
-                <w:szCs w:val="24"/>
-              </w:rPr>
-            </w:pPr>
-            <w:r>
-              <w:rPr>
-                <w:rFonts w:ascii="Times New Roman" w:cs="Times New Roman" w:eastAsia="Times New Roman" w:hAnsi="Times New Roman"/>
-                <w:sz w:val="24"/>
-                <w:szCs w:val="24"/>
-                <w:rtl w:val="0"/>
-              </w:rPr>
-              <w:t xml:space="preserve">Pendiente</w:t>
-            </w:r>
-          </w:p>
-        </w:tc>
-        <w:tc>
-          <w:tcPr>
-            <w:tcW w:w="2759" w:type="dxa"/>
-            <w:tcBorders>
-              <w:top w:color="000000" w:space="0" w:sz="0" w:val="nil"/>
-              <w:left w:color="000000" w:space="0" w:sz="0" w:val="nil"/>
-              <w:bottom w:color="aaaaaa" w:space="0" w:sz="5" w:val="single"/>
-              <w:right w:color="aaaaaa" w:space="0" w:sz="5" w:val="single"/>
-            </w:tcBorders>
-            <w:tcMar>
-              <w:top w:w="80.0" w:type="dxa"/>
-              <w:left w:w="100.0" w:type="dxa"/>
-              <w:bottom w:w="80.0" w:type="dxa"/>
-              <w:right w:w="100.0" w:type="dxa"/>
-            </w:tcMar>
-            <w:vAlign w:val="top"/>
-          </w:tcPr>
-          <w:p>
-            <w:pPr>
-              <w:spacing w:line="319.2000000000001" w:lineRule="auto"/>
-              <w:jc w:val="left"/>
-              <w:rPr>
-                <w:rFonts w:ascii="Times New Roman" w:cs="Times New Roman" w:eastAsia="Times New Roman" w:hAnsi="Times New Roman"/>
-                <w:sz w:val="24"/>
-                <w:szCs w:val="24"/>
-              </w:rPr>
-            </w:pPr>
-            <w:r>
-              <w:rPr>
-                <w:rFonts w:ascii="Times New Roman" w:cs="Times New Roman" w:eastAsia="Times New Roman" w:hAnsi="Times New Roman"/>
-                <w:sz w:val="24"/>
-                <w:szCs w:val="24"/>
-                <w:rtl w:val="0"/>
-              </w:rPr>
-              <w:t xml:space="preserve">vista.js:20-42 no filtra por gimnasio (expone miembros de todos los gimnasios a cualquier token), la vista SQL no está en las migraciones y ninguna pantalla la usa.</w:t>
-            </w:r>
-          </w:p>
-        </w:tc>
-      </w:tr>
-      <w:tr>
-        <w:trPr>
-          <w:cantSplit w:val="0"/>
-          <w:trHeight w:val="975" w:hRule="atLeast"/>
-          <w:tblHeader w:val="0"/>
-        </w:trPr>
-        <w:tc>
-          <w:tcPr>
-            <w:tcW w:w="1250" w:type="dxa"/>
-            <w:tcBorders>
-              <w:top w:color="000000" w:space="0" w:sz="0" w:val="nil"/>
-              <w:left w:color="aaaaaa" w:space="0" w:sz="5" w:val="single"/>
-              <w:bottom w:color="aaaaaa" w:space="0" w:sz="5" w:val="single"/>
-              <w:right w:color="aaaaaa" w:space="0" w:sz="5" w:val="single"/>
-            </w:tcBorders>
-            <w:shd w:fill="eaf5e0" w:val="clear"/>
-            <w:tcMar>
-              <w:top w:w="80.0" w:type="dxa"/>
-              <w:left w:w="100.0" w:type="dxa"/>
-              <w:bottom w:w="80.0" w:type="dxa"/>
-              <w:right w:w="100.0" w:type="dxa"/>
-            </w:tcMar>
-            <w:vAlign w:val="top"/>
-          </w:tcPr>
-          <w:p>
-            <w:pPr>
-              <w:spacing w:line="319.2000000000001" w:lineRule="auto"/>
-              <w:jc w:val="both"/>
-              <w:rPr>
-                <w:rFonts w:ascii="Times New Roman" w:cs="Times New Roman" w:eastAsia="Times New Roman" w:hAnsi="Times New Roman"/>
-                <w:sz w:val="24"/>
-                <w:szCs w:val="24"/>
-              </w:rPr>
-            </w:pPr>
-            <w:r>
-              <w:rPr>
-                <w:rFonts w:ascii="Times New Roman" w:cs="Times New Roman" w:eastAsia="Times New Roman" w:hAnsi="Times New Roman"/>
-                <w:sz w:val="24"/>
-                <w:szCs w:val="24"/>
-                <w:rtl w:val="0"/>
-              </w:rPr>
-              <w:t xml:space="preserve">RQF-26</w:t>
-            </w:r>
-          </w:p>
-        </w:tc>
-        <w:tc>
-          <w:tcPr>
-            <w:tcW w:w="2000" w:type="dxa"/>
-            <w:tcBorders>
-              <w:top w:color="000000" w:space="0" w:sz="0" w:val="nil"/>
-              <w:left w:color="000000" w:space="0" w:sz="0" w:val="nil"/>
-              <w:bottom w:color="aaaaaa" w:space="0" w:sz="5" w:val="single"/>
-              <w:right w:color="aaaaaa" w:space="0" w:sz="5" w:val="single"/>
-            </w:tcBorders>
-            <w:shd w:fill="eaf5e0" w:val="clear"/>
-            <w:tcMar>
-              <w:top w:w="80.0" w:type="dxa"/>
-              <w:left w:w="100.0" w:type="dxa"/>
-              <w:bottom w:w="80.0" w:type="dxa"/>
-              <w:right w:w="100.0" w:type="dxa"/>
-            </w:tcMar>
-            <w:vAlign w:val="top"/>
-          </w:tcPr>
-          <w:p>
-            <w:pPr>
-              <w:spacing w:line="319.2000000000001" w:lineRule="auto"/>
-              <w:jc w:val="both"/>
-              <w:rPr>
-                <w:rFonts w:ascii="Times New Roman" w:cs="Times New Roman" w:eastAsia="Times New Roman" w:hAnsi="Times New Roman"/>
-                <w:sz w:val="24"/>
-                <w:szCs w:val="24"/>
-              </w:rPr>
-            </w:pPr>
-            <w:r>
-              <w:rPr>
-                <w:rFonts w:ascii="Times New Roman" w:cs="Times New Roman" w:eastAsia="Times New Roman" w:hAnsi="Times New Roman"/>
-                <w:sz w:val="24"/>
-                <w:szCs w:val="24"/>
-                <w:rtl w:val="0"/>
-              </w:rPr>
-              <w:t xml:space="preserve">App del miembro</w:t>
-            </w:r>
-          </w:p>
-        </w:tc>
-        <w:tc>
-          <w:tcPr>
-            <w:tcW w:w="3000" w:type="dxa"/>
-            <w:tcBorders>
-              <w:top w:color="000000" w:space="0" w:sz="0" w:val="nil"/>
-              <w:left w:color="000000" w:space="0" w:sz="0" w:val="nil"/>
-              <w:bottom w:color="aaaaaa" w:space="0" w:sz="5" w:val="single"/>
-              <w:right w:color="aaaaaa" w:space="0" w:sz="5" w:val="single"/>
-            </w:tcBorders>
-            <w:shd w:fill="eaf5e0" w:val="clear"/>
-            <w:tcMar>
-              <w:top w:w="80.0" w:type="dxa"/>
-              <w:left w:w="100.0" w:type="dxa"/>
-              <w:bottom w:w="80.0" w:type="dxa"/>
-              <w:right w:w="100.0" w:type="dxa"/>
-            </w:tcMar>
-            <w:vAlign w:val="top"/>
-          </w:tcPr>
-          <w:p>
-            <w:pPr>
-              <w:spacing w:line="319.2000000000001" w:lineRule="auto"/>
-              <w:jc w:val="both"/>
-              <w:rPr>
-                <w:rFonts w:ascii="Times New Roman" w:cs="Times New Roman" w:eastAsia="Times New Roman" w:hAnsi="Times New Roman"/>
-                <w:sz w:val="24"/>
-                <w:szCs w:val="24"/>
-              </w:rPr>
-            </w:pPr>
-            <w:r>
-              <w:rPr>
-                <w:rFonts w:ascii="Times New Roman" w:cs="Times New Roman" w:eastAsia="Times New Roman" w:hAnsi="Times New Roman"/>
-                <w:sz w:val="24"/>
-                <w:szCs w:val="24"/>
-                <w:rtl w:val="0"/>
-              </w:rPr>
-              <w:t xml:space="preserve">El sistema debe permitir al miembro editar sus datos de perfil desde la aplicación móvil.</w:t>
-            </w:r>
-          </w:p>
-        </w:tc>
-        <w:tc>
-          <w:tcPr>
-            <w:tcW w:w="1650" w:type="dxa"/>
-            <w:tcBorders>
-              <w:top w:color="000000" w:space="0" w:sz="0" w:val="nil"/>
-              <w:left w:color="000000" w:space="0" w:sz="0" w:val="nil"/>
-              <w:bottom w:color="aaaaaa" w:space="0" w:sz="5" w:val="single"/>
-              <w:right w:color="aaaaaa" w:space="0" w:sz="5" w:val="single"/>
-            </w:tcBorders>
-            <w:shd w:fill="eaf5e0" w:val="clear"/>
-            <w:tcMar>
-              <w:top w:w="80.0" w:type="dxa"/>
-              <w:left w:w="100.0" w:type="dxa"/>
-              <w:bottom w:w="80.0" w:type="dxa"/>
-              <w:right w:w="100.0" w:type="dxa"/>
-            </w:tcMar>
-            <w:vAlign w:val="top"/>
-          </w:tcPr>
-          <w:p>
-            <w:pPr>
-              <w:spacing w:line="319.2000000000001" w:lineRule="auto"/>
-              <w:jc w:val="left"/>
-              <w:rPr>
-                <w:rFonts w:ascii="Times New Roman" w:cs="Times New Roman" w:eastAsia="Times New Roman" w:hAnsi="Times New Roman"/>
-                <w:sz w:val="24"/>
-                <w:szCs w:val="24"/>
-              </w:rPr>
-            </w:pPr>
-            <w:r>
-              <w:rPr>
-                <w:rFonts w:ascii="Times New Roman" w:cs="Times New Roman" w:eastAsia="Times New Roman" w:hAnsi="Times New Roman"/>
-                <w:sz w:val="24"/>
-                <w:szCs w:val="24"/>
-                <w:rtl w:val="0"/>
-              </w:rPr>
-              <w:t xml:space="preserve">Implementado</w:t>
-            </w:r>
-          </w:p>
-        </w:tc>
-        <w:tc>
-          <w:tcPr>
-            <w:tcW w:w="2759" w:type="dxa"/>
-            <w:tcBorders>
-              <w:top w:color="000000" w:space="0" w:sz="0" w:val="nil"/>
-              <w:left w:color="000000" w:space="0" w:sz="0" w:val="nil"/>
-              <w:bottom w:color="aaaaaa" w:space="0" w:sz="5" w:val="single"/>
-              <w:right w:color="aaaaaa" w:space="0" w:sz="5" w:val="single"/>
-            </w:tcBorders>
-            <w:shd w:fill="eaf5e0" w:val="clear"/>
-            <w:tcMar>
-              <w:top w:w="80.0" w:type="dxa"/>
-              <w:left w:w="100.0" w:type="dxa"/>
-              <w:bottom w:w="80.0" w:type="dxa"/>
-              <w:right w:w="100.0" w:type="dxa"/>
-            </w:tcMar>
-            <w:vAlign w:val="top"/>
-          </w:tcPr>
-          <w:p>
-            <w:pPr>
-              <w:spacing w:line="319.2000000000001" w:lineRule="auto"/>
-              <w:jc w:val="left"/>
-              <w:rPr>
-                <w:rFonts w:ascii="Times New Roman" w:cs="Times New Roman" w:eastAsia="Times New Roman" w:hAnsi="Times New Roman"/>
-                <w:sz w:val="24"/>
-                <w:szCs w:val="24"/>
-              </w:rPr>
-            </w:pPr>
-            <w:r>
-              <w:rPr>
-                <w:rFonts w:ascii="Times New Roman" w:cs="Times New Roman" w:eastAsia="Times New Roman" w:hAnsi="Times New Roman"/>
-                <w:sz w:val="24"/>
-                <w:szCs w:val="24"/>
-                <w:rtl w:val="0"/>
-              </w:rPr>
-              <w:t xml:space="preserve">cliente.js:171 (PUT /api/cliente/me: teléfono, correo y contacto de emergencia); editar_perfil_screen.dart.</w:t>
             </w:r>
           </w:p>
         </w:tc>
@@ -8515,7 +7717,7 @@
           <w:szCs w:val="24"/>
           <w:rtl w:val="0"/>
         </w:rPr>
-        <w:t xml:space="preserve">Estado de implementación de los requisitos funcionales, verificado contra el código el 16/10/2026 (rama main, commit 54b19fa): 13 implementados, 8 parciales y 5 pendientes de 26; avance de 65,4 % (Implementado = 1, Parcial = 0,5, Pendiente = 0). El detalle de cada evidencia está en docs/avance-requisitos.xlsx.</w:t>
+        <w:t xml:space="preserve">Estado de implementación de los requisitos funcionales, verificado contra el código el 16/10/2026 (rama main, commit 54b19fa): 10 implementados, 8 parciales y 4 pendientes de 22; avance de 63,6 % (Implementado = 1, Parcial = 0,5, Pendiente = 0). El detalle de cada evidencia está en docs/avance-requisitos.xlsx.</w:t>
       </w:r>
     </w:p>
     <w:p>

</xml_diff>

<commit_message>
docs(avance): estados de RQF-22, RQNF-05 y evidencia de RQF-13 y RQNF-10 en el docx
Solo cambia word/document.xml: los dos parrafos de resumen (RF 68,2 %,
RNF 63,3 %) y las celdas de Estado y Evidencia de RQF-13, RQF-22,
RQNF-01, RQNF-05 y RQNF-10. Se abre bien en Word.
</commit_message>
<xml_diff>
--- a/docs/Proyecto FitLoyalty - requisitos actualizados.docx
+++ b/docs/Proyecto FitLoyalty - requisitos actualizados.docx
@@ -5889,7 +5889,7 @@
                 <w:szCs w:val="24"/>
                 <w:rtl w:val="0"/>
               </w:rPr>
-              <w:t xml:space="preserve">admin-contrato.js:76-160 envía y registra cada intento (migración 008). Falta: con WhatsApp listo, un envío fallido queda como exitoso (whatsapp.js:244-246 se traga el error).</w:t>
+              <w:t>admin-contrato.js:76-160 envía y registra cada intento (migración 008); desde el PR #9 un envío fallido queda registrado como no exitoso (whatsapp.js:223-246). Falta: tras un reinicio el contrato no sale, porque admin-contrato.js:107 no inicia el cliente de WhatsApp.</w:t>
             </w:r>
           </w:p>
         </w:tc>
@@ -7648,7 +7648,7 @@
                 <w:szCs w:val="24"/>
                 <w:rtl w:val="0"/>
               </w:rPr>
-              <w:t xml:space="preserve">Pendiente</w:t>
+              <w:t>Implementado</w:t>
             </w:r>
           </w:p>
         </w:tc>
@@ -7687,7 +7687,7 @@
                 <w:szCs w:val="24"/>
                 <w:rtl w:val="0"/>
               </w:rPr>
-              <w:t xml:space="preserve">No funciona: safe() (auth.js:496-502) no usa SAVEPOINT y cualquier error aborta la transacción de PostgreSQL; con las migraciones falla en DELETE FROM auditoria (tabla inexistente) y el gimnasio queda intacto (HTTP 500).</w:t>
+              <w:t>auth.js:548-585 borra todos los datos del gimnasio en una transacción, con un SAVEPOINT por paso (:534) y solo para el administrador (:554); probado en PostgreSQL 18 por el verificador (PR #15).</w:t>
             </w:r>
           </w:p>
         </w:tc>
@@ -7717,7 +7717,7 @@
           <w:szCs w:val="24"/>
           <w:rtl w:val="0"/>
         </w:rPr>
-        <w:t xml:space="preserve">Estado de implementación de los requisitos funcionales, verificado contra el código el 16/10/2026 (rama main, commit 54b19fa): 10 implementados, 8 parciales y 4 pendientes de 22; avance de 63,6 % (Implementado = 1, Parcial = 0,5, Pendiente = 0). El detalle de cada evidencia está en docs/avance-requisitos.xlsx.</w:t>
+        <w:t>Estado de implementación de los requisitos funcionales, actualizado el 18/10/2026 con los PR fusionados en develop (commit 1ddcb24): 11 implementados, 8 parciales y 3 pendientes de 22; avance de 68,2 % (Implementado = 1, Parcial = 0,5, Pendiente = 0). La verificación inicial fue el 16/10/2026 (rama main, commit 54b19fa). El detalle de cada evidencia está en docs/avance-requisitos.xlsx.</w:t>
       </w:r>
     </w:p>
     <w:p>
@@ -8219,7 +8219,7 @@
                 <w:szCs w:val="24"/>
                 <w:rtl w:val="0"/>
               </w:rPr>
-              <w:t xml:space="preserve">Sin evidencia: no hay medición del tiempo del check-in.</w:t>
+              <w:t>Sin evidencia: no hay medición del tiempo del check-in. La búsqueda del QR ya no deriva la clave por cada miembro (checkin.js:26, PR #11).</w:t>
             </w:r>
           </w:p>
         </w:tc>
@@ -8979,7 +8979,7 @@
                 <w:szCs w:val="24"/>
                 <w:rtl w:val="0"/>
               </w:rPr>
-              <w:t xml:space="preserve">Parcial</w:t>
+              <w:t>Implementado</w:t>
             </w:r>
           </w:p>
         </w:tc>
@@ -9017,7 +9017,7 @@
                 <w:szCs w:val="24"/>
                 <w:rtl w:val="0"/>
               </w:rPr>
-              <w:t xml:space="preserve">Alta de gimnasios por registro (auth.js:100) y consultas filtradas por gimnasio. Falta: vista.js:27-42 no filtra por gimnasio (fuga entre gimnasios).</w:t>
+              <w:t>Alta de gimnasios por registro (auth.js:100) y todas las consultas filtradas por gimnasio, también la vista (vista.js:20-46) y la asistencia (asistencia.js:22); 9 pruebas de aislamiento (PR #11).</w:t>
             </w:r>
           </w:p>
         </w:tc>
@@ -10017,7 +10017,7 @@
                 <w:szCs w:val="24"/>
                 <w:rtl w:val="0"/>
               </w:rPr>
-              <w:t xml:space="preserve">migrate.js:41-56 aplica backend/migrations al iniciar (index.js:129). Falta: el esquema que dejan no es el que usa el código (sin vista_miembros_activos, auditoria ni columnas de reto e hito_gamificacion).</w:t>
+              <w:t>migrate.js:41-56 aplica backend/migrations al iniciar (index.js:129); la 009 crea auditoria y las columnas de gamificación, y la 011 recrea la vista. Falta: envio_mensaje y notificacion difieren de producción (notificaciones.js:211, :217).</w:t>
             </w:r>
           </w:p>
         </w:tc>
@@ -11042,7 +11042,7 @@
           <w:szCs w:val="24"/>
           <w:rtl w:val="0"/>
         </w:rPr>
-        <w:t xml:space="preserve">Estado de implementación de los requisitos no funcionales, verificado contra el código el 16/10/2026 (rama main, commit 54b19fa): 6 implementados, 6 parciales y 3 pendientes de 15; avance de 60,0 % (Implementado = 1, Parcial = 0,5, Pendiente = 0). El detalle de cada evidencia está en docs/avance-requisitos.xlsx.</w:t>
+        <w:t>Estado de implementación de los requisitos no funcionales, actualizado el 18/10/2026 con los PR fusionados en develop (commit 1ddcb24): 7 implementados, 5 parciales y 3 pendientes de 15; avance de 63,3 % (Implementado = 1, Parcial = 0,5, Pendiente = 0). La verificación inicial fue el 16/10/2026 (rama main, commit 54b19fa). El detalle de cada evidencia está en docs/avance-requisitos.xlsx.</w:t>
       </w:r>
     </w:p>
     <w:p>

</xml_diff>

<commit_message>
docs(avance): RQF-07 Implementado y evidencia del #17 y el #21 en el docx
Solo cambia word/document.xml: resumen de RF (70,5 %) y RNF con develop
@ f3d323c, Estado y Evidencia de RQF-07, evidencia de RQF-04 y RQF-22.
</commit_message>
<xml_diff>
--- a/docs/Proyecto FitLoyalty - requisitos actualizados.docx
+++ b/docs/Proyecto FitLoyalty - requisitos actualizados.docx
@@ -4088,7 +4088,7 @@
                 <w:szCs w:val="24"/>
                 <w:rtl w:val="0"/>
               </w:rPr>
-              <w:t xml:space="preserve">miembros.js:185 y :382 (vencimiento automático), :276-284 (vencida / por vencer). Falta: estado Congelada (tabla congelacion_membresia sin uso).</w:t>
+              <w:t>miembros.js:193 y :395 (vencimiento automático), :286-290 (vencida / por vencer) y :810-892 (congelar y descongelar, PR #17). Falta: que el job de vencimientos y el check-in salten las membresías congeladas.</w:t>
             </w:r>
           </w:p>
         </w:tc>
@@ -4646,7 +4646,7 @@
                 <w:szCs w:val="24"/>
                 <w:rtl w:val="0"/>
               </w:rPr>
-              <w:t xml:space="preserve">Parcial</w:t>
+              <w:t>Implementado</w:t>
             </w:r>
           </w:p>
         </w:tc>
@@ -4684,7 +4684,7 @@
                 <w:szCs w:val="24"/>
                 <w:rtl w:val="0"/>
               </w:rPr>
-              <w:t xml:space="preserve">dashboard.js:123-204 (entradas del día, miembros activos, próximos vencimientos). Falta: gráfica de horas pico (hoy es por día de la semana) y actualización automática.</w:t>
+              <w:t>dashboard.js:150-232 (entradas del día cortadas en hora de Colombia, miembros activos, semana y próximos vencimientos) y :327-339 (horas pico); DashboardPage.jsx:172 (gráfica de horas pico) y :279-288 (refresco cada 60 s). PR #16.</w:t>
             </w:r>
           </w:p>
         </w:tc>
@@ -7687,7 +7687,7 @@
                 <w:szCs w:val="24"/>
                 <w:rtl w:val="0"/>
               </w:rPr>
-              <w:t>auth.js:548-585 borra todos los datos del gimnasio en una transacción, con un SAVEPOINT por paso (:534) y solo para el administrador (:554); probado en PostgreSQL 18 por el verificador (PR #15).</w:t>
+              <w:t>auth.js:558-623 borra todos los datos del gimnasio en una transacción, con un SAVEPOINT por paso (:544), solo el dueño y con su contraseña (:588, :593); probado en PostgreSQL 18 por el verificador (PR #15 y #21).</w:t>
             </w:r>
           </w:p>
         </w:tc>
@@ -7717,7 +7717,7 @@
           <w:szCs w:val="24"/>
           <w:rtl w:val="0"/>
         </w:rPr>
-        <w:t>Estado de implementación de los requisitos funcionales, actualizado el 18/10/2026 con los PR fusionados en develop (commit 1ddcb24): 11 implementados, 8 parciales y 3 pendientes de 22; avance de 68,2 % (Implementado = 1, Parcial = 0,5, Pendiente = 0). La verificación inicial fue el 16/10/2026 (rama main, commit 54b19fa). El detalle de cada evidencia está en docs/avance-requisitos.xlsx.</w:t>
+        <w:t>Estado de implementación de los requisitos funcionales, actualizado el 18/10/2026 con los PR fusionados en develop (commit f3d323c): 12 implementados, 7 parciales y 3 pendientes de 22; avance de 70,5 % (Implementado = 1, Parcial = 0,5, Pendiente = 0). La verificación inicial fue el 16/10/2026 (rama main, commit 54b19fa). El detalle de cada evidencia está en docs/avance-requisitos.xlsx.</w:t>
       </w:r>
     </w:p>
     <w:p>
@@ -11042,7 +11042,7 @@
           <w:szCs w:val="24"/>
           <w:rtl w:val="0"/>
         </w:rPr>
-        <w:t>Estado de implementación de los requisitos no funcionales, actualizado el 18/10/2026 con los PR fusionados en develop (commit 1ddcb24): 7 implementados, 5 parciales y 3 pendientes de 15; avance de 63,3 % (Implementado = 1, Parcial = 0,5, Pendiente = 0). La verificación inicial fue el 16/10/2026 (rama main, commit 54b19fa). El detalle de cada evidencia está en docs/avance-requisitos.xlsx.</w:t>
+        <w:t>Estado de implementación de los requisitos no funcionales, actualizado el 18/10/2026 con los PR fusionados en develop (commit f3d323c): 7 implementados, 5 parciales y 3 pendientes de 15; avance de 63,3 % (Implementado = 1, Parcial = 0,5, Pendiente = 0). La verificación inicial fue el 16/10/2026 (rama main, commit 54b19fa). El detalle de cada evidencia está en docs/avance-requisitos.xlsx.</w:t>
       </w:r>
     </w:p>
     <w:p>

</xml_diff>

<commit_message>
docs(avance): RQF-01 y RQF-02 Implementados en el docx
Solo cambia word/document.xml: resumen de RF (75,0 %) y RNF con develop
@ bdf987b, Estado y Evidencia de RQF-01 y RQF-02, evidencia de RQF-07
(#22) y RQF-22 (id_dueno).
</commit_message>
<xml_diff>
--- a/docs/Proyecto FitLoyalty - requisitos actualizados.docx
+++ b/docs/Proyecto FitLoyalty - requisitos actualizados.docx
@@ -3449,7 +3449,7 @@
                 <w:szCs w:val="24"/>
                 <w:rtl w:val="0"/>
               </w:rPr>
-              <w:t xml:space="preserve">Parcial</w:t>
+              <w:t>Implementado</w:t>
             </w:r>
           </w:p>
         </w:tc>
@@ -3487,7 +3487,7 @@
                 <w:szCs w:val="24"/>
                 <w:rtl w:val="0"/>
               </w:rPr>
-              <w:t xml:space="preserve">staff.js:109-384 (invitar, listar, revocar y aceptar invitación); permisos por rol en staff.js:112 y checkin.js:57. Falta: editar y eliminar cuentas del personal.</w:t>
+              <w:t>staff.js:133-499 (invitar, listar, revocar, aceptar la invitación y, con PATCH en :388, editar, desactivar y reactivar, con el dueño protegido); el acceso y el rol se leen de la base en cada petición (middleware/auth.js:10, :78). PR #19.</w:t>
             </w:r>
           </w:p>
         </w:tc>
@@ -3650,7 +3650,7 @@
                 <w:szCs w:val="24"/>
                 <w:rtl w:val="0"/>
               </w:rPr>
-              <w:t xml:space="preserve">Parcial</w:t>
+              <w:t>Implementado</w:t>
             </w:r>
           </w:p>
         </w:tc>
@@ -3689,7 +3689,7 @@
                 <w:szCs w:val="24"/>
                 <w:rtl w:val="0"/>
               </w:rPr>
-              <w:t xml:space="preserve">auth.js:200-295 (login con bcrypt y JWT, cierre manual); límite de intentos en index.js:63. Falta: cierre automático por inactividad; el token del personal no expira (auth-helpers.js:102-113).</w:t>
+              <w:t>auth.js:212-313 (login con bcrypt, cierre manual) y límite de intentos en index.js:63; el token del personal siempre vence (auth-helpers.js:113-143, middleware/auth.js:63) y la sesión se cierra tras 30 min sin actividad (AuthContext.jsx:23-178). PR #18.</w:t>
             </w:r>
           </w:p>
         </w:tc>
@@ -4684,7 +4684,7 @@
                 <w:szCs w:val="24"/>
                 <w:rtl w:val="0"/>
               </w:rPr>
-              <w:t>dashboard.js:150-232 (entradas del día cortadas en hora de Colombia, miembros activos, semana y próximos vencimientos) y :327-339 (horas pico); DashboardPage.jsx:172 (gráfica de horas pico) y :279-288 (refresco cada 60 s). PR #16.</w:t>
+              <w:t>dashboard.js:165-248 (entradas del día cortadas en hora de Colombia, miembros activos, semana y próximos vencimientos sin congeladas) y :344-356 (horas pico); DashboardPage.jsx:172 (gráfica de horas pico) y :279-288 (refresco cada 60 s). PR #16 y #22.</w:t>
             </w:r>
           </w:p>
         </w:tc>
@@ -7687,7 +7687,7 @@
                 <w:szCs w:val="24"/>
                 <w:rtl w:val="0"/>
               </w:rPr>
-              <w:t>auth.js:558-623 borra todos los datos del gimnasio en una transacción, con un SAVEPOINT por paso (:544), solo el dueño y con su contraseña (:588, :593); probado en PostgreSQL 18 por el verificador (PR #15 y #21).</w:t>
+              <w:t>auth.js:576-641 borra todos los datos del gimnasio en una transacción, con un SAVEPOINT por paso (:562), solo el dueño (gimnasio.id_dueno) y con su contraseña (:606, :611); probado en PostgreSQL 18 por el verificador (PR #15, #21 y #19).</w:t>
             </w:r>
           </w:p>
         </w:tc>
@@ -7717,7 +7717,7 @@
           <w:szCs w:val="24"/>
           <w:rtl w:val="0"/>
         </w:rPr>
-        <w:t>Estado de implementación de los requisitos funcionales, actualizado el 18/10/2026 con los PR fusionados en develop (commit f3d323c): 12 implementados, 7 parciales y 3 pendientes de 22; avance de 70,5 % (Implementado = 1, Parcial = 0,5, Pendiente = 0). La verificación inicial fue el 16/10/2026 (rama main, commit 54b19fa). El detalle de cada evidencia está en docs/avance-requisitos.xlsx.</w:t>
+        <w:t>Estado de implementación de los requisitos funcionales, actualizado el 18/10/2026 con los PR fusionados en develop (commit bdf987b): 14 implementados, 5 parciales y 3 pendientes de 22; avance de 75,0 % (Implementado = 1, Parcial = 0,5, Pendiente = 0). La verificación inicial fue el 16/10/2026 (rama main, commit 54b19fa). El detalle de cada evidencia está en docs/avance-requisitos.xlsx.</w:t>
       </w:r>
     </w:p>
     <w:p>
@@ -11042,7 +11042,7 @@
           <w:szCs w:val="24"/>
           <w:rtl w:val="0"/>
         </w:rPr>
-        <w:t>Estado de implementación de los requisitos no funcionales, actualizado el 18/10/2026 con los PR fusionados en develop (commit f3d323c): 7 implementados, 5 parciales y 3 pendientes de 15; avance de 63,3 % (Implementado = 1, Parcial = 0,5, Pendiente = 0). La verificación inicial fue el 16/10/2026 (rama main, commit 54b19fa). El detalle de cada evidencia está en docs/avance-requisitos.xlsx.</w:t>
+        <w:t>Estado de implementación de los requisitos no funcionales, actualizado el 18/10/2026 con los PR fusionados en develop (commit bdf987b): 7 implementados, 5 parciales y 3 pendientes de 15; avance de 63,3 % (Implementado = 1, Parcial = 0,5, Pendiente = 0). La verificación inicial fue el 16/10/2026 (rama main, commit 54b19fa). El detalle de cada evidencia está en docs/avance-requisitos.xlsx.</w:t>
       </w:r>
     </w:p>
     <w:p>

</xml_diff>

<commit_message>
docs(avance): RQF-09 pasa a Parcial en el docx (issue #24)
Solo cambia word/document.xml: resumen de RF (72,7 %) y RNF al 19/10 con
develop @ dcda269, Estado y Evidencia de RQF-09 y evidencia de RQNF-10.
</commit_message>
<xml_diff>
--- a/docs/Proyecto FitLoyalty - requisitos actualizados.docx
+++ b/docs/Proyecto FitLoyalty - requisitos actualizados.docx
@@ -5053,7 +5053,7 @@
                 <w:szCs w:val="24"/>
                 <w:rtl w:val="0"/>
               </w:rPr>
-              <w:t xml:space="preserve">Implementado</w:t>
+              <w:t>Parcial</w:t>
             </w:r>
           </w:p>
         </w:tc>
@@ -5091,7 +5091,7 @@
                 <w:szCs w:val="24"/>
                 <w:rtl w:val="0"/>
               </w:rPr>
-              <w:t xml:space="preserve">MenuNotificaciones.jsx:86-90 y MiembrosPage.jsx:796-802 (envío por WhatsApp); notificaciones.js:188-224 (registro con fecha y estado en envio_mensaje).</w:t>
+              <w:t>MenuNotificaciones.jsx:84-99 y MiembrosPage.jsx:836-849 (envío por WhatsApp). Falta: el registro de cada envío (notificaciones.js:211) no funciona con el esquema real, porque envio_mensaje usa id_canal y exige mensaje_copiado (issue #24).</w:t>
             </w:r>
           </w:p>
         </w:tc>
@@ -7717,7 +7717,7 @@
           <w:szCs w:val="24"/>
           <w:rtl w:val="0"/>
         </w:rPr>
-        <w:t>Estado de implementación de los requisitos funcionales, actualizado el 18/10/2026 con los PR fusionados en develop (commit bdf987b): 14 implementados, 5 parciales y 3 pendientes de 22; avance de 75,0 % (Implementado = 1, Parcial = 0,5, Pendiente = 0). La verificación inicial fue el 16/10/2026 (rama main, commit 54b19fa). El detalle de cada evidencia está en docs/avance-requisitos.xlsx.</w:t>
+        <w:t>Estado de implementación de los requisitos funcionales, actualizado el 19/10/2026 con los PR fusionados en develop (commit dcda269) y la confirmación del issue #24 sobre el esquema real: 13 implementados, 6 parciales y 3 pendientes de 22; avance de 72,7 % (Implementado = 1, Parcial = 0,5, Pendiente = 0). La verificación inicial fue el 16/10/2026 (rama main, commit 54b19fa). El detalle de cada evidencia está en docs/avance-requisitos.xlsx.</w:t>
       </w:r>
     </w:p>
     <w:p>
@@ -10017,7 +10017,7 @@
                 <w:szCs w:val="24"/>
                 <w:rtl w:val="0"/>
               </w:rPr>
-              <w:t>migrate.js:41-56 aplica backend/migrations al iniciar (index.js:129); la 009 crea auditoria y las columnas de gamificación, y la 011 recrea la vista. Falta: envio_mensaje y notificacion difieren de producción (notificaciones.js:211, :217).</w:t>
+              <w:t>migrate.js:41-56 aplica backend/migrations al iniciar (index.js:129); las 009, 010, 011 y 013 acercan el esquema al de producción. Falta: envio_mensaje y notificacion difieren de producción (notificaciones.js:211, :217; confirmado en el issue #24).</w:t>
             </w:r>
           </w:p>
         </w:tc>
@@ -11042,7 +11042,7 @@
           <w:szCs w:val="24"/>
           <w:rtl w:val="0"/>
         </w:rPr>
-        <w:t>Estado de implementación de los requisitos no funcionales, actualizado el 18/10/2026 con los PR fusionados en develop (commit bdf987b): 7 implementados, 5 parciales y 3 pendientes de 15; avance de 63,3 % (Implementado = 1, Parcial = 0,5, Pendiente = 0). La verificación inicial fue el 16/10/2026 (rama main, commit 54b19fa). El detalle de cada evidencia está en docs/avance-requisitos.xlsx.</w:t>
+        <w:t>Estado de implementación de los requisitos no funcionales, actualizado el 19/10/2026 con los PR fusionados en develop (commit dcda269): 7 implementados, 5 parciales y 3 pendientes de 15; avance de 63,3 % (Implementado = 1, Parcial = 0,5, Pendiente = 0). La verificación inicial fue el 16/10/2026 (rama main, commit 54b19fa). El detalle de cada evidencia está en docs/avance-requisitos.xlsx.</w:t>
       </w:r>
     </w:p>
     <w:p>

</xml_diff>

<commit_message>
docs(avance): RQNF-10 y RQF-06 Implementados en el docx
Solo cambia word/document.xml: resumen de RF (75,0 %) y RNF (66,7 %) con
develop @ 66186d7, y Estado y Evidencia de RQF-06 y RQNF-10.
</commit_message>
<xml_diff>
--- a/docs/Proyecto FitLoyalty - requisitos actualizados.docx
+++ b/docs/Proyecto FitLoyalty - requisitos actualizados.docx
@@ -4448,7 +4448,7 @@
                 <w:szCs w:val="24"/>
                 <w:rtl w:val="0"/>
               </w:rPr>
-              <w:t xml:space="preserve">Parcial</w:t>
+              <w:t>Implementado</w:t>
             </w:r>
           </w:p>
         </w:tc>
@@ -4487,7 +4487,7 @@
                 <w:szCs w:val="24"/>
                 <w:rtl w:val="0"/>
               </w:rPr>
-              <w:t xml:space="preserve">checkin.js:116-136 (bloquea membresía vencida); CheckinPage.jsx:133-143. Falta: notificar al administrador del intento bloqueado.</w:t>
+              <w:t>checkin.js:123-147 (bloquea membresía vencida o sin plan, sin contar asistencia); CheckinPage.jsx:134-135; el intento queda en la campana del administrador sin repetirse en 10 minutos (lib/accesos.js:33, notificaciones.js:74-109). PR #23.</w:t>
             </w:r>
           </w:p>
         </w:tc>
@@ -7717,7 +7717,7 @@
           <w:szCs w:val="24"/>
           <w:rtl w:val="0"/>
         </w:rPr>
-        <w:t>Estado de implementación de los requisitos funcionales, actualizado el 19/10/2026 con los PR fusionados en develop (commit dcda269) y la confirmación del issue #24 sobre el esquema real: 13 implementados, 6 parciales y 3 pendientes de 22; avance de 72,7 % (Implementado = 1, Parcial = 0,5, Pendiente = 0). La verificación inicial fue el 16/10/2026 (rama main, commit 54b19fa). El detalle de cada evidencia está en docs/avance-requisitos.xlsx.</w:t>
+        <w:t>Estado de implementación de los requisitos funcionales, actualizado el 19/10/2026 con los PR fusionados en develop (commit 66186d7) y la confirmación del issue #24 sobre el esquema real: 14 implementados, 5 parciales y 3 pendientes de 22; avance de 75,0 % (Implementado = 1, Parcial = 0,5, Pendiente = 0). La verificación inicial fue el 16/10/2026 (rama main, commit 54b19fa). El detalle de cada evidencia está en docs/avance-requisitos.xlsx.</w:t>
       </w:r>
     </w:p>
     <w:p>
@@ -9978,7 +9978,7 @@
                 <w:szCs w:val="24"/>
                 <w:rtl w:val="0"/>
               </w:rPr>
-              <w:t xml:space="preserve">Parcial</w:t>
+              <w:t>Implementado</w:t>
             </w:r>
           </w:p>
         </w:tc>
@@ -10017,7 +10017,7 @@
                 <w:szCs w:val="24"/>
                 <w:rtl w:val="0"/>
               </w:rPr>
-              <w:t>migrate.js:41-56 aplica backend/migrations al iniciar (index.js:129); las 009, 010, 011 y 013 acercan el esquema al de producción. Falta: envio_mensaje y notificacion difieren de producción (notificaciones.js:211, :217; confirmado en el issue #24).</w:t>
+              <w:t>migrate.js:41-56 aplica backend/migrations al iniciar (index.js:129); la 014 deja notificacion y envio_mensaje como en producción, con el pg_dump idéntico (PR #27). Quedan 13 tablas distintas que el código no usa.</w:t>
             </w:r>
           </w:p>
         </w:tc>
@@ -11042,7 +11042,7 @@
           <w:szCs w:val="24"/>
           <w:rtl w:val="0"/>
         </w:rPr>
-        <w:t>Estado de implementación de los requisitos no funcionales, actualizado el 19/10/2026 con los PR fusionados en develop (commit dcda269): 7 implementados, 5 parciales y 3 pendientes de 15; avance de 63,3 % (Implementado = 1, Parcial = 0,5, Pendiente = 0). La verificación inicial fue el 16/10/2026 (rama main, commit 54b19fa). El detalle de cada evidencia está en docs/avance-requisitos.xlsx.</w:t>
+        <w:t>Estado de implementación de los requisitos no funcionales, actualizado el 19/10/2026 con los PR fusionados en develop (commit 66186d7): 8 implementados, 4 parciales y 3 pendientes de 15; avance de 66,7 % (Implementado = 1, Parcial = 0,5, Pendiente = 0). La verificación inicial fue el 16/10/2026 (rama main, commit 54b19fa). El detalle de cada evidencia está en docs/avance-requisitos.xlsx.</w:t>
       </w:r>
     </w:p>
     <w:p>

</xml_diff>

<commit_message>
docs(avance): RQF-13, RQF-14, RQF-04, RQF-11 y RQNF-07 Implementados en el docx
Solo cambia word/document.xml: resumen de RF (86,4 %) y RNF (70,0 %) con
develop @ 3c35d53, Estado y Evidencia de los cinco, la limitacion de Chrome
en RQF-13 y RQF-14, y el marcarActividad del check-in en RQF-02.
</commit_message>
<xml_diff>
--- a/docs/Proyecto FitLoyalty - requisitos actualizados.docx
+++ b/docs/Proyecto FitLoyalty - requisitos actualizados.docx
@@ -3689,7 +3689,7 @@
                 <w:szCs w:val="24"/>
                 <w:rtl w:val="0"/>
               </w:rPr>
-              <w:t>auth.js:212-313 (login con bcrypt, cierre manual) y límite de intentos en index.js:63; el token del personal siempre vence (auth-helpers.js:113-143, middleware/auth.js:63) y la sesión se cierra tras 30 min sin actividad (AuthContext.jsx:23-178). PR #18.</w:t>
+              <w:t>auth.js:212-313 (login con bcrypt, cierre manual) y límite de intentos en index.js:63; el token del personal siempre vence (auth-helpers.js:113-143, middleware/auth.js:63) y la sesión se cierra tras 30 min sin actividad (AuthContext.jsx:23-178); el check-in cuenta como actividad (CheckinPage.jsx:170, :225). PR #18 y #30.</w:t>
             </w:r>
           </w:p>
         </w:tc>
@@ -4049,7 +4049,7 @@
                 <w:szCs w:val="24"/>
                 <w:rtl w:val="0"/>
               </w:rPr>
-              <w:t xml:space="preserve">Parcial</w:t>
+              <w:t>Implementado</w:t>
             </w:r>
           </w:p>
         </w:tc>
@@ -4088,7 +4088,7 @@
                 <w:szCs w:val="24"/>
                 <w:rtl w:val="0"/>
               </w:rPr>
-              <w:t>miembros.js:193 y :395 (vencimiento automático), :286-290 (vencida / por vencer) y :810-892 (congelar y descongelar, PR #17). Falta: que el job de vencimientos y el check-in salten las membresías congeladas.</w:t>
+              <w:t>miembros.js:193 y :395 (vencimiento automático), :286-290 (vencida / por vencer) y :810-892 (congelar y descongelar, PR #17); el check-in niega el ingreso a una membresía congelada (checkin.js:125-149) y el job de avisos la excluye (expiracion.js:62). PR #30.</w:t>
             </w:r>
           </w:p>
         </w:tc>
@@ -5452,7 +5452,7 @@
                 <w:szCs w:val="24"/>
                 <w:rtl w:val="0"/>
               </w:rPr>
-              <w:t xml:space="preserve">Pendiente</w:t>
+              <w:t>Implementado</w:t>
             </w:r>
           </w:p>
         </w:tc>
@@ -5490,7 +5490,7 @@
                 <w:szCs w:val="24"/>
                 <w:rtl w:val="0"/>
               </w:rPr>
-              <w:t xml:space="preserve">No se calculan rachas: cliente.js:340-381 solo lee hitos cargados por SQL (ConsultasDB/Poblar_Tablas.sql:384-419). Falta: cálculo de rachas, hitos y mensaje en el check-in.</w:t>
+              <w:t>lib/gamificacion.js:54 calcula la racha en cada check-in (checkin.js:211-217), otorga hitos sin repetirlos y arma el mensaje que muestra la pantalla (CheckinPage.jsx:393-402); el administrador configura los hitos (config.js:190-280, HitosConfig). PR #32.</w:t>
             </w:r>
           </w:p>
         </w:tc>
@@ -5851,7 +5851,7 @@
                 <w:szCs w:val="24"/>
                 <w:rtl w:val="0"/>
               </w:rPr>
-              <w:t xml:space="preserve">Parcial</w:t>
+              <w:t>Implementado</w:t>
             </w:r>
           </w:p>
         </w:tc>
@@ -5889,7 +5889,7 @@
                 <w:szCs w:val="24"/>
                 <w:rtl w:val="0"/>
               </w:rPr>
-              <w:t>admin-contrato.js:76-160 envía y registra cada intento (migración 008); desde el PR #9 un envío fallido queda registrado como no exitoso (whatsapp.js:223-246). Falta: tras un reinicio el contrato no sale, porque admin-contrato.js:107 no inicia el cliente de WhatsApp.</w:t>
+              <w:t>admin-contrato.js:76-145 envía y registra cada intento (migración 008); el cliente de WhatsApp se inicia al enviar (whatsapp.js:229-238). PR #10. Limitación: Render y la imagen Docker no tienen Chrome, así que solo envía en un equipo con Chrome y el QR escaneado.</w:t>
             </w:r>
           </w:p>
         </w:tc>
@@ -6052,7 +6052,7 @@
                 <w:szCs w:val="24"/>
                 <w:rtl w:val="0"/>
               </w:rPr>
-              <w:t xml:space="preserve">Parcial</w:t>
+              <w:t>Implementado</w:t>
             </w:r>
           </w:p>
         </w:tc>
@@ -6091,7 +6091,7 @@
                 <w:szCs w:val="24"/>
                 <w:rtl w:val="0"/>
               </w:rPr>
-              <w:t xml:space="preserve">scheduler.js:46 (cron diario) y expiracion.js:43-151 (selección y anti-duplicado). Falta: si WhatsApp no está listo, el aviso queda marcado como enviado y no se reintenta (expiracion.js:206-207).</w:t>
+              <w:t>scheduler.js:62-63 (9:00 y reintento a las 15:00) y expiracion.js:43-218 (sin congeladas, una vez por etapa y marcado solo si se envía); días de aviso en Configuración (config.js:33). PR #10 y #30. Limitación: Render y la imagen Docker no tienen Chrome.</w:t>
             </w:r>
           </w:p>
         </w:tc>
@@ -7717,7 +7717,7 @@
           <w:szCs w:val="24"/>
           <w:rtl w:val="0"/>
         </w:rPr>
-        <w:t>Estado de implementación de los requisitos funcionales, actualizado el 19/10/2026 con los PR fusionados en develop (commit 66186d7) y la confirmación del issue #24 sobre el esquema real: 14 implementados, 5 parciales y 3 pendientes de 22; avance de 75,0 % (Implementado = 1, Parcial = 0,5, Pendiente = 0). La verificación inicial fue el 16/10/2026 (rama main, commit 54b19fa). El detalle de cada evidencia está en docs/avance-requisitos.xlsx.</w:t>
+        <w:t>Estado de implementación de los requisitos funcionales, actualizado el 20/10/2026 con los PR fusionados en develop (commit 3c35d53) y la confirmación del issue #24 sobre el esquema real: 18 implementados, 2 parciales y 2 pendientes de 22; avance de 86,4 % (Implementado = 1, Parcial = 0,5, Pendiente = 0). La verificación inicial fue el 16/10/2026 (rama main, commit 54b19fa). El detalle de cada evidencia está en docs/avance-requisitos.xlsx.</w:t>
       </w:r>
     </w:p>
     <w:p>
@@ -9378,7 +9378,7 @@
                 <w:szCs w:val="24"/>
                 <w:rtl w:val="0"/>
               </w:rPr>
-              <w:t xml:space="preserve">Parcial</w:t>
+              <w:t>Implementado</w:t>
             </w:r>
           </w:p>
         </w:tc>
@@ -9416,7 +9416,7 @@
                 <w:szCs w:val="24"/>
                 <w:rtl w:val="0"/>
               </w:rPr>
-              <w:t xml:space="preserve">Capas en backend/src (routes, lib, middleware, jobs, db). Falta: cobertura medida 0 % en checkin.js y notificaciones.js (docs/evidencias/cobertura-backend-2026-10-16.txt) y script test.</w:t>
+              <w:t>Capas en backend/src (routes, lib, middleware, jobs, db); npm test con 122 pruebas que pasan y cobertura de líneas de 97,72 % en checkin.js y 90,32 % en notificaciones.js (docs/evidencias/cobertura-backend-2026-10-20.txt). PR #33.</w:t>
             </w:r>
           </w:p>
         </w:tc>
@@ -11042,7 +11042,7 @@
           <w:szCs w:val="24"/>
           <w:rtl w:val="0"/>
         </w:rPr>
-        <w:t>Estado de implementación de los requisitos no funcionales, actualizado el 19/10/2026 con los PR fusionados en develop (commit 66186d7): 8 implementados, 4 parciales y 3 pendientes de 15; avance de 66,7 % (Implementado = 1, Parcial = 0,5, Pendiente = 0). La verificación inicial fue el 16/10/2026 (rama main, commit 54b19fa). El detalle de cada evidencia está en docs/avance-requisitos.xlsx.</w:t>
+        <w:t>Estado de implementación de los requisitos no funcionales, actualizado el 20/10/2026 con los PR fusionados en develop (commit 3c35d53): 9 implementados, 3 parciales y 3 pendientes de 15; avance de 70,0 % (Implementado = 1, Parcial = 0,5, Pendiente = 0). La verificación inicial fue el 16/10/2026 (rama main, commit 54b19fa). El detalle de cada evidencia está en docs/avance-requisitos.xlsx.</w:t>
       </w:r>
     </w:p>
     <w:p>

</xml_diff>

<commit_message>
test(e2e): agregar test limpio de alta de miembro por Daniel
</commit_message>
<xml_diff>
--- a/docs/Proyecto FitLoyalty - requisitos actualizados.docx
+++ b/docs/Proyecto FitLoyalty - requisitos actualizados.docx
@@ -3449,7 +3449,7 @@
                 <w:szCs w:val="24"/>
                 <w:rtl w:val="0"/>
               </w:rPr>
-              <w:t xml:space="preserve">Parcial</w:t>
+              <w:t>Implementado</w:t>
             </w:r>
           </w:p>
         </w:tc>
@@ -3487,7 +3487,7 @@
                 <w:szCs w:val="24"/>
                 <w:rtl w:val="0"/>
               </w:rPr>
-              <w:t xml:space="preserve">staff.js:109-384 (invitar, listar, revocar y aceptar invitación); permisos por rol en staff.js:112 y checkin.js:57. Falta: editar y eliminar cuentas del personal.</w:t>
+              <w:t>staff.js:133-499 (invitar, listar, revocar, aceptar la invitación y, con PATCH en :388, editar, desactivar y reactivar, con el dueño protegido); el acceso y el rol se leen de la base en cada petición (middleware/auth.js:10, :78). PR #19.</w:t>
             </w:r>
           </w:p>
         </w:tc>
@@ -3650,7 +3650,7 @@
                 <w:szCs w:val="24"/>
                 <w:rtl w:val="0"/>
               </w:rPr>
-              <w:t xml:space="preserve">Parcial</w:t>
+              <w:t>Implementado</w:t>
             </w:r>
           </w:p>
         </w:tc>
@@ -3689,7 +3689,7 @@
                 <w:szCs w:val="24"/>
                 <w:rtl w:val="0"/>
               </w:rPr>
-              <w:t xml:space="preserve">auth.js:200-295 (login con bcrypt y JWT, cierre manual); límite de intentos en index.js:63. Falta: cierre automático por inactividad; el token del personal no expira (auth-helpers.js:102-113).</w:t>
+              <w:t>auth.js:212-313 (login con bcrypt, cierre manual) y límite de intentos en index.js:63; el token del personal siempre vence (auth-helpers.js:113-143, middleware/auth.js:63) y la sesión se cierra tras 30 min sin actividad (AuthContext.jsx:23-178). PR #18.</w:t>
             </w:r>
           </w:p>
         </w:tc>
@@ -4088,7 +4088,7 @@
                 <w:szCs w:val="24"/>
                 <w:rtl w:val="0"/>
               </w:rPr>
-              <w:t xml:space="preserve">miembros.js:185 y :382 (vencimiento automático), :276-284 (vencida / por vencer). Falta: estado Congelada (tabla congelacion_membresia sin uso).</w:t>
+              <w:t>miembros.js:193 y :395 (vencimiento automático), :286-290 (vencida / por vencer) y :810-892 (congelar y descongelar, PR #17). Falta: que el job de vencimientos y el check-in salten las membresías congeladas.</w:t>
             </w:r>
           </w:p>
         </w:tc>
@@ -4448,7 +4448,7 @@
                 <w:szCs w:val="24"/>
                 <w:rtl w:val="0"/>
               </w:rPr>
-              <w:t xml:space="preserve">Parcial</w:t>
+              <w:t>Implementado</w:t>
             </w:r>
           </w:p>
         </w:tc>
@@ -4487,7 +4487,7 @@
                 <w:szCs w:val="24"/>
                 <w:rtl w:val="0"/>
               </w:rPr>
-              <w:t xml:space="preserve">checkin.js:116-136 (bloquea membresía vencida); CheckinPage.jsx:133-143. Falta: notificar al administrador del intento bloqueado.</w:t>
+              <w:t>checkin.js:123-147 (bloquea membresía vencida o sin plan, sin contar asistencia); CheckinPage.jsx:134-135; el intento queda en la campana del administrador sin repetirse en 10 minutos (lib/accesos.js:33, notificaciones.js:74-109). PR #23.</w:t>
             </w:r>
           </w:p>
         </w:tc>
@@ -4646,7 +4646,7 @@
                 <w:szCs w:val="24"/>
                 <w:rtl w:val="0"/>
               </w:rPr>
-              <w:t xml:space="preserve">Parcial</w:t>
+              <w:t>Implementado</w:t>
             </w:r>
           </w:p>
         </w:tc>
@@ -4684,7 +4684,7 @@
                 <w:szCs w:val="24"/>
                 <w:rtl w:val="0"/>
               </w:rPr>
-              <w:t xml:space="preserve">dashboard.js:123-204 (entradas del día, miembros activos, próximos vencimientos). Falta: gráfica de horas pico (hoy es por día de la semana) y actualización automática.</w:t>
+              <w:t>dashboard.js:165-248 (entradas del día cortadas en hora de Colombia, miembros activos, semana y próximos vencimientos sin congeladas) y :344-356 (horas pico); DashboardPage.jsx:172 (gráfica de horas pico) y :279-288 (refresco cada 60 s). PR #16 y #22.</w:t>
             </w:r>
           </w:p>
         </w:tc>
@@ -5053,7 +5053,7 @@
                 <w:szCs w:val="24"/>
                 <w:rtl w:val="0"/>
               </w:rPr>
-              <w:t xml:space="preserve">Implementado</w:t>
+              <w:t>Parcial</w:t>
             </w:r>
           </w:p>
         </w:tc>
@@ -5091,7 +5091,7 @@
                 <w:szCs w:val="24"/>
                 <w:rtl w:val="0"/>
               </w:rPr>
-              <w:t xml:space="preserve">MenuNotificaciones.jsx:86-90 y MiembrosPage.jsx:796-802 (envío por WhatsApp); notificaciones.js:188-224 (registro con fecha y estado en envio_mensaje).</w:t>
+              <w:t>MenuNotificaciones.jsx:84-99 y MiembrosPage.jsx:836-849 (envío por WhatsApp). Falta: el registro de cada envío (notificaciones.js:211) no funciona con el esquema real, porque envio_mensaje usa id_canal y exige mensaje_copiado (issue #24).</w:t>
             </w:r>
           </w:p>
         </w:tc>
@@ -5889,7 +5889,7 @@
                 <w:szCs w:val="24"/>
                 <w:rtl w:val="0"/>
               </w:rPr>
-              <w:t xml:space="preserve">admin-contrato.js:76-160 envía y registra cada intento (migración 008). Falta: con WhatsApp listo, un envío fallido queda como exitoso (whatsapp.js:244-246 se traga el error).</w:t>
+              <w:t>admin-contrato.js:76-160 envía y registra cada intento (migración 008); desde el PR #9 un envío fallido queda registrado como no exitoso (whatsapp.js:223-246). Falta: tras un reinicio el contrato no sale, porque admin-contrato.js:107 no inicia el cliente de WhatsApp.</w:t>
             </w:r>
           </w:p>
         </w:tc>
@@ -7648,7 +7648,7 @@
                 <w:szCs w:val="24"/>
                 <w:rtl w:val="0"/>
               </w:rPr>
-              <w:t xml:space="preserve">Pendiente</w:t>
+              <w:t>Implementado</w:t>
             </w:r>
           </w:p>
         </w:tc>
@@ -7687,7 +7687,7 @@
                 <w:szCs w:val="24"/>
                 <w:rtl w:val="0"/>
               </w:rPr>
-              <w:t xml:space="preserve">No funciona: safe() (auth.js:496-502) no usa SAVEPOINT y cualquier error aborta la transacción de PostgreSQL; con las migraciones falla en DELETE FROM auditoria (tabla inexistente) y el gimnasio queda intacto (HTTP 500).</w:t>
+              <w:t>auth.js:576-641 borra todos los datos del gimnasio en una transacción, con un SAVEPOINT por paso (:562), solo el dueño (gimnasio.id_dueno) y con su contraseña (:606, :611); probado en PostgreSQL 18 por el verificador (PR #15, #21 y #19).</w:t>
             </w:r>
           </w:p>
         </w:tc>
@@ -7717,7 +7717,7 @@
           <w:szCs w:val="24"/>
           <w:rtl w:val="0"/>
         </w:rPr>
-        <w:t xml:space="preserve">Estado de implementación de los requisitos funcionales, verificado contra el código el 16/10/2026 (rama main, commit 54b19fa): 10 implementados, 8 parciales y 4 pendientes de 22; avance de 63,6 % (Implementado = 1, Parcial = 0,5, Pendiente = 0). El detalle de cada evidencia está en docs/avance-requisitos.xlsx.</w:t>
+        <w:t>Estado de implementación de los requisitos funcionales, actualizado el 19/10/2026 con los PR fusionados en develop (commit 66186d7) y la confirmación del issue #24 sobre el esquema real: 14 implementados, 5 parciales y 3 pendientes de 22; avance de 75,0 % (Implementado = 1, Parcial = 0,5, Pendiente = 0). La verificación inicial fue el 16/10/2026 (rama main, commit 54b19fa). El detalle de cada evidencia está en docs/avance-requisitos.xlsx.</w:t>
       </w:r>
     </w:p>
     <w:p>
@@ -8219,7 +8219,7 @@
                 <w:szCs w:val="24"/>
                 <w:rtl w:val="0"/>
               </w:rPr>
-              <w:t xml:space="preserve">Sin evidencia: no hay medición del tiempo del check-in.</w:t>
+              <w:t>Sin evidencia: no hay medición del tiempo del check-in. La búsqueda del QR ya no deriva la clave por cada miembro (checkin.js:26, PR #11).</w:t>
             </w:r>
           </w:p>
         </w:tc>
@@ -8979,7 +8979,7 @@
                 <w:szCs w:val="24"/>
                 <w:rtl w:val="0"/>
               </w:rPr>
-              <w:t xml:space="preserve">Parcial</w:t>
+              <w:t>Implementado</w:t>
             </w:r>
           </w:p>
         </w:tc>
@@ -9017,7 +9017,7 @@
                 <w:szCs w:val="24"/>
                 <w:rtl w:val="0"/>
               </w:rPr>
-              <w:t xml:space="preserve">Alta de gimnasios por registro (auth.js:100) y consultas filtradas por gimnasio. Falta: vista.js:27-42 no filtra por gimnasio (fuga entre gimnasios).</w:t>
+              <w:t>Alta de gimnasios por registro (auth.js:100) y todas las consultas filtradas por gimnasio, también la vista (vista.js:20-46) y la asistencia (asistencia.js:22); 9 pruebas de aislamiento (PR #11).</w:t>
             </w:r>
           </w:p>
         </w:tc>
@@ -9978,7 +9978,7 @@
                 <w:szCs w:val="24"/>
                 <w:rtl w:val="0"/>
               </w:rPr>
-              <w:t xml:space="preserve">Parcial</w:t>
+              <w:t>Implementado</w:t>
             </w:r>
           </w:p>
         </w:tc>
@@ -10017,7 +10017,7 @@
                 <w:szCs w:val="24"/>
                 <w:rtl w:val="0"/>
               </w:rPr>
-              <w:t xml:space="preserve">migrate.js:41-56 aplica backend/migrations al iniciar (index.js:129). Falta: el esquema que dejan no es el que usa el código (sin vista_miembros_activos, auditoria ni columnas de reto e hito_gamificacion).</w:t>
+              <w:t>migrate.js:41-56 aplica backend/migrations al iniciar (index.js:129); la 014 deja notificacion y envio_mensaje como en producción, con el pg_dump idéntico (PR #27). Quedan 13 tablas distintas que el código no usa.</w:t>
             </w:r>
           </w:p>
         </w:tc>
@@ -11042,7 +11042,7 @@
           <w:szCs w:val="24"/>
           <w:rtl w:val="0"/>
         </w:rPr>
-        <w:t xml:space="preserve">Estado de implementación de los requisitos no funcionales, verificado contra el código el 16/10/2026 (rama main, commit 54b19fa): 6 implementados, 6 parciales y 3 pendientes de 15; avance de 60,0 % (Implementado = 1, Parcial = 0,5, Pendiente = 0). El detalle de cada evidencia está en docs/avance-requisitos.xlsx.</w:t>
+        <w:t>Estado de implementación de los requisitos no funcionales, actualizado el 19/10/2026 con los PR fusionados en develop (commit 66186d7): 8 implementados, 4 parciales y 3 pendientes de 15; avance de 66,7 % (Implementado = 1, Parcial = 0,5, Pendiente = 0). La verificación inicial fue el 16/10/2026 (rama main, commit 54b19fa). El detalle de cada evidencia está en docs/avance-requisitos.xlsx.</w:t>
       </w:r>
     </w:p>
     <w:p>

</xml_diff>

<commit_message>
docs(avance): RQF-08, RQNF-01, RQNF-09 y RQNF-15 Implementados en el docx
Solo cambia word/document.xml: resumen de RF (88,6 %) y RNF (86,7 %) con
develop @ 21e7e9c, Estado y Evidencia de los cuatro, el monitor de RQNF-02,
la evidencia del #43 en RQNF-06 y el CI de RQNF-07.
</commit_message>
<xml_diff>
--- a/docs/Proyecto FitLoyalty - requisitos actualizados.docx
+++ b/docs/Proyecto FitLoyalty - requisitos actualizados.docx
@@ -4855,7 +4855,7 @@
                 <w:szCs w:val="24"/>
                 <w:rtl w:val="0"/>
               </w:rPr>
-              <w:t xml:space="preserve">Parcial</w:t>
+              <w:t>Implementado</w:t>
             </w:r>
           </w:p>
         </w:tc>
@@ -4894,7 +4894,7 @@
                 <w:szCs w:val="24"/>
                 <w:rtl w:val="0"/>
               </w:rPr>
-              <w:t xml:space="preserve">notificaciones.js:125-137, dashboard.js:161 y :182 (lista de miembros en riesgo con un umbral). Falta: motor diario, niveles Amarilla / Roja y umbral editable.</w:t>
+              <w:t>jobs/abandono.js corre cada día a las 8:00 (scheduler.js:71), clasifica en Amarilla (7 días) y Roja (15), con umbrales por gimnasio (config.js:36-60), registra las alertas en alerta_abandono y la campana las lista (notificaciones.js:149-207). PR #39.</w:t>
             </w:r>
           </w:p>
         </w:tc>
@@ -7717,7 +7717,7 @@
           <w:szCs w:val="24"/>
           <w:rtl w:val="0"/>
         </w:rPr>
-        <w:t>Estado de implementación de los requisitos funcionales, actualizado el 20/10/2026 con los PR fusionados en develop (commit 3c35d53) y la confirmación del issue #24 sobre el esquema real: 18 implementados, 2 parciales y 2 pendientes de 22; avance de 86,4 % (Implementado = 1, Parcial = 0,5, Pendiente = 0). La verificación inicial fue el 16/10/2026 (rama main, commit 54b19fa). El detalle de cada evidencia está en docs/avance-requisitos.xlsx.</w:t>
+        <w:t>Estado de implementación de los requisitos funcionales, actualizado el 25/10/2026 con los PR fusionados en develop (commit 21e7e9c) y la confirmación del issue #24 sobre el esquema real: 19 implementados, 1 parcial y 2 pendientes de 22; avance de 88,6 % (Implementado = 1, Parcial = 0,5, Pendiente = 0). La verificación inicial fue el 16/10/2026 (rama main, commit 54b19fa). El detalle de cada evidencia está en docs/avance-requisitos.xlsx.</w:t>
       </w:r>
     </w:p>
     <w:p>
@@ -8181,7 +8181,7 @@
                 <w:szCs w:val="24"/>
                 <w:rtl w:val="0"/>
               </w:rPr>
-              <w:t xml:space="preserve">Pendiente</w:t>
+              <w:t>Implementado</w:t>
             </w:r>
           </w:p>
         </w:tc>
@@ -8219,7 +8219,7 @@
                 <w:szCs w:val="24"/>
                 <w:rtl w:val="0"/>
               </w:rPr>
-              <w:t>Sin evidencia: no hay medición del tiempo del check-in. La búsqueda del QR ya no deriva la clave por cada miembro (checkin.js:26, PR #11).</w:t>
+              <w:t>Medición con 200 miembros (backend/scripts/medir-checkin.js): peor caso de 15 ms y p95 de 13 ms, frente al límite de 2 s (docs/evidencias/rqnf-01-checkin.md). Mide solo el backend, no el lector HID. PR #40.</w:t>
             </w:r>
           </w:p>
         </w:tc>
@@ -8421,7 +8421,7 @@
                 <w:szCs w:val="24"/>
                 <w:rtl w:val="0"/>
               </w:rPr>
-              <w:t xml:space="preserve">Sin evidencia: existe /api/healthz (index.js:101) pero no hay monitoreo ni reporte de disponibilidad.</w:t>
+              <w:t>Monitor de /api/healthz cada 5 minutos de 5:02 a 21:57, activo desde el 25/10/2026 (PR #42); todavía sin historial. Parcial con un día completo (26/10) e Implementado con 7 días al 99 % o más (1/11 como pronto).</w:t>
             </w:r>
           </w:p>
         </w:tc>
@@ -9219,7 +9219,7 @@
                 <w:szCs w:val="24"/>
                 <w:rtl w:val="0"/>
               </w:rPr>
-              <w:t xml:space="preserve">App web React / Vite en Vercel, sin instalación; QA a 375 px (QA_Responsive_375px.md). Falta: prueba documentada en Chrome, Firefox y Edge.</w:t>
+              <w:t>App web React / Vite en Vercel, sin instalación; QA a 375 px; portada y login probados en Chrome, Firefox y Edge con capturas (docs/evidencias/rqnf-06-navegadores.md, PR #43). Falta: las pantallas principales con backend.</w:t>
             </w:r>
           </w:p>
         </w:tc>
@@ -9416,7 +9416,7 @@
                 <w:szCs w:val="24"/>
                 <w:rtl w:val="0"/>
               </w:rPr>
-              <w:t>Capas en backend/src (routes, lib, middleware, jobs, db); npm test con 122 pruebas que pasan y cobertura de líneas de 97,72 % en checkin.js y 90,32 % en notificaciones.js (docs/evidencias/cobertura-backend-2026-10-20.txt). PR #33.</w:t>
+              <w:t>Capas en backend/src (routes, lib, middleware, jobs, db); npm test corre en el CI en cada PR (PR #41) y la cobertura de líneas es de 97,72 % en checkin.js y 90,32 % en notificaciones.js (docs/evidencias/cobertura-backend-2026-10-20.txt). PR #33 y #41.</w:t>
             </w:r>
           </w:p>
         </w:tc>
@@ -9777,7 +9777,7 @@
                 <w:szCs w:val="24"/>
                 <w:rtl w:val="0"/>
               </w:rPr>
-              <w:t xml:space="preserve">Parcial</w:t>
+              <w:t>Implementado</w:t>
             </w:r>
           </w:p>
         </w:tc>
@@ -9815,7 +9815,7 @@
                 <w:szCs w:val="24"/>
                 <w:rtl w:val="0"/>
               </w:rPr>
-              <w:t xml:space="preserve">index.js:63-95 limita el login (5/min), forgot-password (3/min) y el login de la app (10/min). Falta: verify-reset-code y reset-password no tienen límite.</w:t>
+              <w:t>index.js:66-116 limita el login (5/min), forgot-password (3/min), verify-reset-code, reset-password y la eliminación de cuenta (5 cada 15 min) y el login de la app (10/min). PR #28.</w:t>
             </w:r>
           </w:p>
         </w:tc>
@@ -10974,7 +10974,7 @@
                 <w:szCs w:val="24"/>
                 <w:rtl w:val="0"/>
               </w:rPr>
-              <w:t xml:space="preserve">Pendiente</w:t>
+              <w:t>Implementado</w:t>
             </w:r>
           </w:p>
         </w:tc>
@@ -11012,7 +11012,7 @@
                 <w:szCs w:val="24"/>
                 <w:rtl w:val="0"/>
               </w:rPr>
-              <w:t xml:space="preserve">No se cumple: index.js:50-57 acepta cualquier origen (la última línea del callback también permite), aunque exista FRONTEND_URL.</w:t>
+              <w:t>CORS rechaza con 403 CORS_BLOCKED los orígenes que no están en FRONTEND_URL (index.js:57), con 9 pruebas. PR #28. No se deben poner previews en FRONTEND_URL (staff.js:67).</w:t>
             </w:r>
           </w:p>
         </w:tc>
@@ -11042,7 +11042,7 @@
           <w:szCs w:val="24"/>
           <w:rtl w:val="0"/>
         </w:rPr>
-        <w:t>Estado de implementación de los requisitos no funcionales, actualizado el 20/10/2026 con los PR fusionados en develop (commit 3c35d53): 9 implementados, 3 parciales y 3 pendientes de 15; avance de 70,0 % (Implementado = 1, Parcial = 0,5, Pendiente = 0). La verificación inicial fue el 16/10/2026 (rama main, commit 54b19fa). El detalle de cada evidencia está en docs/avance-requisitos.xlsx.</w:t>
+        <w:t>Estado de implementación de los requisitos no funcionales, actualizado el 25/10/2026 con los PR fusionados en develop (commit 21e7e9c): 12 implementados, 2 parciales y 1 pendiente de 15; avance de 86,7 % (Implementado = 1, Parcial = 0,5, Pendiente = 0). La verificación inicial fue el 16/10/2026 (rama main, commit 54b19fa). El detalle de cada evidencia está en docs/avance-requisitos.xlsx.</w:t>
       </w:r>
     </w:p>
     <w:p>

</xml_diff>

<commit_message>
docs(avance): meta del Excel al 90 % y citas de la fase 1 verificadas en develop
Meta: por decision de Luis, Resumen!C40 pasa de 0,8 a 0,9 (por COM, como
numero) y D40 dice que la del 80 % pedida para la entrega ya esta superada.
Puntos que faltan: 0,3 (RF), 0,5 (RNF) y 0,8 (total); graficos y formato
condicional sin cambios. La matriz marca la meta del 90 % en la ruta y da los
puntos que faltan por tipo; estado.md actualiza la seccion del 25 y
«Resultado» (las del 18 al 20 quedan como registro).

Citas de la fase 1 (main @ 54b19fa) mapeadas con git diff y verificadas por
contenido en develop @ 21e7e9c, en el Excel, el docx y la matriz: RQF-03 y
RQF-21 (miembros.js, MiembrosPage.jsx), RQF-05 (checkin.js,
CheckinPage.jsx), RQF-15 (auth-helpers.js) y RQF-18 (dashboard.js,
DashboardPage.jsx); tambien RQF-06, citado el 19 y corrido por #30 y #32.
RQF-12 queda igual: cliente.js y Poblar_Tablas.sql no cambiaron. Sigue en
87,8 %.
</commit_message>
<xml_diff>
--- a/docs/Proyecto FitLoyalty - requisitos actualizados.docx
+++ b/docs/Proyecto FitLoyalty - requisitos actualizados.docx
@@ -3886,7 +3886,7 @@
                 <w:szCs w:val="24"/>
                 <w:rtl w:val="0"/>
               </w:rPr>
-              <w:t xml:space="preserve">miembros.js:357-369 (rechaza documento o correo duplicado), :371-379 (QR único), :607 (editar) y :664-675 (desactivar).</w:t>
+              <w:t xml:space="preserve">miembros.js:370-382 (rechaza documento o correo duplicado), :384-392 (QR único), :620 (editar) y :677-688 (desactivar).</w:t>
             </w:r>
           </w:p>
         </w:tc>
@@ -4285,7 +4285,7 @@
                 <w:szCs w:val="24"/>
                 <w:rtl w:val="0"/>
               </w:rPr>
-              <w:t xml:space="preserve">CheckinPage.jsx:221-223 y :329-331 (lector HID tipo teclado con Enter), :66 (cámara); checkin.js:167-172; fecha_hora con valor por defecto en migración 002:100.</w:t>
+              <w:t xml:space="preserve">CheckinPage.jsx:238-240 y :346-348 (lector HID tipo teclado con Enter), :79 (cámara); checkin.js:203-208; fecha_hora con valor por defecto en migración 002:100.</w:t>
             </w:r>
           </w:p>
         </w:tc>
@@ -4487,7 +4487,7 @@
                 <w:szCs w:val="24"/>
                 <w:rtl w:val="0"/>
               </w:rPr>
-              <w:t xml:space="preserve">checkin.js:123-147 (bloquea membresía vencida o sin plan, sin contar asistencia); CheckinPage.jsx:134-135; el intento queda en la campana del administrador sin repetirse en 10 minutos (lib/accesos.js:33, notificaciones.js:79-115). PR #23.</w:t>
+              <w:t xml:space="preserve">checkin.js:124-169 (bloquea membresía vencida o sin plan, sin contar asistencia); CheckinPage.jsx:25-29; el intento queda en la campana del administrador sin repetirse en 10 minutos (lib/accesos.js:34, notificaciones.js:79-115). PR #23.</w:t>
             </w:r>
           </w:p>
         </w:tc>
@@ -6889,7 +6889,7 @@
                 <w:szCs w:val="24"/>
                 <w:rtl w:val="0"/>
               </w:rPr>
-              <w:t xml:space="preserve">dashboard.js:288-337 (GET /api/admin/dashboard/export, CSV con BOM para Excel); botón en DashboardPage.jsx:193.</w:t>
+              <w:t xml:space="preserve">dashboard.js:383-432 (GET /api/admin/dashboard/export, CSV con BOM para Excel); botón en DashboardPage.jsx:304.</w:t>
             </w:r>
           </w:p>
         </w:tc>
@@ -7485,7 +7485,7 @@
                 <w:szCs w:val="24"/>
                 <w:rtl w:val="0"/>
               </w:rPr>
-              <w:t xml:space="preserve">miembros.js:88-95 (datos de pago), :439-450 (registro en plan_cobro) y :754 (actualizar plan); MiembrosPage.jsx:207-208 y :349-350.</w:t>
+              <w:t xml:space="preserve">miembros.js:96-103 (datos de pago), :452-463 (registro en plan_cobro) y :926 (actualizar plan); MiembrosPage.jsx:208-209 y :357-358.</w:t>
             </w:r>
           </w:p>
         </w:tc>

</xml_diff>